<commit_message>
Title page: drop redundant 'Group 10' (team identified by IDs)
Co-Authored-By: Claude Opus 4.8 <noreply@anthropic.com>
</commit_message>
<xml_diff>
--- a/Group_209361864_315005066_Report.docx
+++ b/Group_209361864_315005066_Report.docx
@@ -47,20 +47,6 @@
         <w:t>Course: Using AI for Intrusion and Malware Detection (3917)</w:t>
         <w:br/>
         <w:t>Reichman University — Efi Arazi School of Computer Science</w:t>
-      </w:r>
-    </w:p>
-    <w:p>
-      <w:pPr>
-        <w:spacing w:before="120" w:after="80" w:lineRule="auto" w:line="360"/>
-        <w:jc w:val="center"/>
-      </w:pPr>
-      <w:r>
-        <w:rPr>
-          <w:rFonts w:ascii="Calibri" w:hAnsi="Calibri"/>
-          <w:b/>
-          <w:sz w:val="24"/>
-        </w:rPr>
-        <w:t>Group 10</w:t>
       </w:r>
     </w:p>
     <w:p>

</xml_diff>

<commit_message>
Report: add descriptive numbered captions to all 12 tables (spec requirement)
Co-Authored-By: Claude Opus 4.8 <noreply@anthropic.com>
</commit_message>
<xml_diff>
--- a/Group_209361864_315005066_Report.docx
+++ b/Group_209361864_315005066_Report.docx
@@ -995,7 +995,19 @@
         </w:tc>
       </w:tr>
     </w:tbl>
-    <w:p/>
+    <w:p>
+      <w:pPr>
+        <w:spacing w:before="40" w:after="160" w:lineRule="auto" w:line="240"/>
+      </w:pPr>
+      <w:r>
+        <w:rPr>
+          <w:rFonts w:ascii="Calibri" w:hAnsi="Calibri"/>
+          <w:i/>
+          <w:sz w:val="18"/>
+        </w:rPr>
+        <w:t>Table 1. In-domain F1, false-positive rate, and D2-&gt;D1 transfer F1 for the five detectors and the character n-gram baseline on both datasets.</w:t>
+      </w:r>
+    </w:p>
     <w:p>
       <w:pPr>
         <w:spacing w:before="0" w:after="120" w:lineRule="auto" w:line="360"/>
@@ -2560,7 +2572,19 @@
         </w:tc>
       </w:tr>
     </w:tbl>
-    <w:p/>
+    <w:p>
+      <w:pPr>
+        <w:spacing w:before="40" w:after="160" w:lineRule="auto" w:line="240"/>
+      </w:pPr>
+      <w:r>
+        <w:rPr>
+          <w:rFonts w:ascii="Calibri" w:hAnsi="Calibri"/>
+          <w:i/>
+          <w:sz w:val="18"/>
+        </w:rPr>
+        <w:t>Table 2. Telemetry and feature mapping for three T1059.004-adjacent sub-techniques: shell-log signature, capturing source, engineered features, and whether provenance labelling detects them.</w:t>
+      </w:r>
+    </w:p>
     <w:p>
       <w:pPr>
         <w:spacing w:before="0" w:after="120" w:lineRule="auto" w:line="360"/>
@@ -3173,7 +3197,19 @@
         </w:tc>
       </w:tr>
     </w:tbl>
-    <w:p/>
+    <w:p>
+      <w:pPr>
+        <w:spacing w:before="40" w:after="160" w:lineRule="auto" w:line="240"/>
+      </w:pPr>
+      <w:r>
+        <w:rPr>
+          <w:rFonts w:ascii="Calibri" w:hAnsi="Calibri"/>
+          <w:i/>
+          <w:sz w:val="18"/>
+        </w:rPr>
+        <w:t>Table 3. Feature-and-model extraction matrix comparing Trizna's SLP work with this project across six dimensions.</w:t>
+      </w:r>
+    </w:p>
     <w:p>
       <w:pPr>
         <w:pStyle w:val="Heading1"/>
@@ -4411,7 +4447,19 @@
         </w:tc>
       </w:tr>
     </w:tbl>
-    <w:p/>
+    <w:p>
+      <w:pPr>
+        <w:spacing w:before="40" w:after="160" w:lineRule="auto" w:line="240"/>
+      </w:pPr>
+      <w:r>
+        <w:rPr>
+          <w:rFonts w:ascii="Calibri" w:hAnsi="Calibri"/>
+          <w:i/>
+          <w:sz w:val="18"/>
+        </w:rPr>
+        <w:t>Table 4. Per-feature benign vs. attack variance and variance gap on Dataset 1, ranked by gap.</w:t>
+      </w:r>
+    </w:p>
     <w:p>
       <w:pPr>
         <w:pStyle w:val="Heading1"/>
@@ -5308,7 +5356,19 @@
         </w:tc>
       </w:tr>
     </w:tbl>
-    <w:p/>
+    <w:p>
+      <w:pPr>
+        <w:spacing w:before="40" w:after="160" w:lineRule="auto" w:line="240"/>
+      </w:pPr>
+      <w:r>
+        <w:rPr>
+          <w:rFonts w:ascii="Calibri" w:hAnsi="Calibri"/>
+          <w:i/>
+          <w:sz w:val="18"/>
+        </w:rPr>
+        <w:t>Table 5. Top five Dataset 1 features by XGBoost gain, with what each measures and its MITRE ATT&amp;CK mapping.</w:t>
+      </w:r>
+    </w:p>
     <w:p>
       <w:pPr>
         <w:spacing w:before="0" w:after="120" w:lineRule="auto" w:line="360"/>
@@ -5948,7 +6008,19 @@
         </w:tc>
       </w:tr>
     </w:tbl>
-    <w:p/>
+    <w:p>
+      <w:pPr>
+        <w:spacing w:before="40" w:after="160" w:lineRule="auto" w:line="240"/>
+      </w:pPr>
+      <w:r>
+        <w:rPr>
+          <w:rFonts w:ascii="Calibri" w:hAnsi="Calibri"/>
+          <w:i/>
+          <w:sz w:val="18"/>
+        </w:rPr>
+        <w:t>Table 6. Covariate-shift probe: ROC-AUC of a classifier trained to separate Dataset 1 from Dataset 2 rows using the 43 features alone.</w:t>
+      </w:r>
+    </w:p>
     <w:p>
       <w:pPr>
         <w:spacing w:before="0" w:after="120" w:lineRule="auto" w:line="360"/>
@@ -11253,7 +11325,19 @@
         </w:tc>
       </w:tr>
     </w:tbl>
-    <w:p/>
+    <w:p>
+      <w:pPr>
+        <w:spacing w:before="40" w:after="160" w:lineRule="auto" w:line="240"/>
+      </w:pPr>
+      <w:r>
+        <w:rPr>
+          <w:rFonts w:ascii="Calibri" w:hAnsi="Calibri"/>
+          <w:i/>
+          <w:sz w:val="18"/>
+        </w:rPr>
+        <w:t>Table 7. Cross-dataset performance of all five models (in-domain and both transfer directions) across Accuracy, Precision, Recall/DR, FPR, F1, and ROC-AUC.</w:t>
+      </w:r>
+    </w:p>
     <w:p>
       <w:pPr>
         <w:spacing w:before="0" w:after="120" w:lineRule="auto" w:line="360"/>
@@ -12480,7 +12564,19 @@
         </w:tc>
       </w:tr>
     </w:tbl>
-    <w:p/>
+    <w:p>
+      <w:pPr>
+        <w:spacing w:before="40" w:after="160" w:lineRule="auto" w:line="240"/>
+      </w:pPr>
+      <w:r>
+        <w:rPr>
+          <w:rFonts w:ascii="Calibri" w:hAnsi="Calibri"/>
+          <w:i/>
+          <w:sz w:val="18"/>
+        </w:rPr>
+        <w:t>Table 8. Error-profile comparison of failure modes: a Trizna-style anomaly detector vs. our XGBoost-hybrid and 1D-CNN.</w:t>
+      </w:r>
+    </w:p>
     <w:p>
       <w:pPr>
         <w:spacing w:before="0" w:after="120" w:lineRule="auto" w:line="360"/>
@@ -13372,7 +13468,19 @@
         </w:tc>
       </w:tr>
     </w:tbl>
-    <w:p/>
+    <w:p>
+      <w:pPr>
+        <w:spacing w:before="40" w:after="160" w:lineRule="auto" w:line="240"/>
+      </w:pPr>
+      <w:r>
+        <w:rPr>
+          <w:rFonts w:ascii="Calibri" w:hAnsi="Calibri"/>
+          <w:i/>
+          <w:sz w:val="18"/>
+        </w:rPr>
+        <w:t>Table 9. Dataset 1 - cascade configurations vs. the single best model: F1, precision, recall, FPR, and confusion counts.</w:t>
+      </w:r>
+    </w:p>
     <w:tbl>
       <w:tblPr>
         <w:tblStyle w:val="TableGrid"/>
@@ -14043,7 +14151,19 @@
         </w:tc>
       </w:tr>
     </w:tbl>
-    <w:p/>
+    <w:p>
+      <w:pPr>
+        <w:spacing w:before="40" w:after="160" w:lineRule="auto" w:line="240"/>
+      </w:pPr>
+      <w:r>
+        <w:rPr>
+          <w:rFonts w:ascii="Calibri" w:hAnsi="Calibri"/>
+          <w:i/>
+          <w:sz w:val="18"/>
+        </w:rPr>
+        <w:t>Table 10. Dataset 2 - cascade configurations vs. the single best model: F1, precision, recall, FPR, and confusion counts.</w:t>
+      </w:r>
+    </w:p>
     <w:p>
       <w:pPr>
         <w:spacing w:before="0" w:after="120" w:lineRule="auto" w:line="360"/>
@@ -14704,7 +14824,19 @@
         </w:tc>
       </w:tr>
     </w:tbl>
-    <w:p/>
+    <w:p>
+      <w:pPr>
+        <w:spacing w:before="40" w:after="160" w:lineRule="auto" w:line="240"/>
+      </w:pPr>
+      <w:r>
+        <w:rPr>
+          <w:rFonts w:ascii="Calibri" w:hAnsi="Calibri"/>
+          <w:i/>
+          <w:sz w:val="18"/>
+        </w:rPr>
+        <w:t>Table 11. Local Llama-3.1-8B arbitration on high-uncertainty edge cases: accuracy, agreement with the model vote, mean latency, and call count per dataset.</w:t>
+      </w:r>
+    </w:p>
     <w:p>
       <w:pPr>
         <w:spacing w:before="0" w:after="120" w:lineRule="auto" w:line="360"/>
@@ -15682,7 +15814,19 @@
         </w:tc>
       </w:tr>
     </w:tbl>
-    <w:p/>
+    <w:p>
+      <w:pPr>
+        <w:spacing w:before="40" w:after="160" w:lineRule="auto" w:line="240"/>
+      </w:pPr>
+      <w:r>
+        <w:rPr>
+          <w:rFonts w:ascii="Calibri" w:hAnsi="Calibri"/>
+          <w:i/>
+          <w:sz w:val="18"/>
+        </w:rPr>
+        <w:t>Table 12. Software frameworks and versions used across the pipeline.</w:t>
+      </w:r>
+    </w:p>
     <w:p>
       <w:pPr>
         <w:pStyle w:val="Heading2"/>

</xml_diff>

<commit_message>
Report: close eval gaps — Ch2 essay+2nd paper (ShellCore), Ch6 RF/IF justification, Ch7.2 class-imbalance defense; fix stale Ch4/Ch6 feature names+numbers
Co-Authored-By: Claude Opus 4.8 <noreply@anthropic.com>
</commit_message>
<xml_diff>
--- a/Group_209361864_315005066_Report.docx
+++ b/Group_209361864_315005066_Report.docx
@@ -3212,6 +3212,123 @@
     </w:p>
     <w:p>
       <w:pPr>
+        <w:pStyle w:val="Heading2"/>
+        <w:spacing w:before="120" w:after="80" w:lineRule="auto" w:line="276"/>
+      </w:pPr>
+      <w:r>
+        <w:t>Comparative analytical essay: two papers, and what we adopt</w:t>
+      </w:r>
+    </w:p>
+    <w:p>
+      <w:pPr>
+        <w:spacing w:before="0" w:after="120" w:lineRule="auto" w:line="360"/>
+      </w:pPr>
+      <w:r>
+        <w:t xml:space="preserve">Our two peer-reviewed anchors are </w:t>
+      </w:r>
+      <w:r>
+        <w:rPr>
+          <w:b/>
+        </w:rPr>
+        <w:t>Trizna's SLP work</w:t>
+      </w:r>
+      <w:r>
+        <w:t xml:space="preserve"> (the "TOPS" line — char- and token-level ML on Linux command telemetry, summarised feature-by-feature in the matrix above) and </w:t>
+      </w:r>
+      <w:r>
+        <w:rPr>
+          <w:b/>
+        </w:rPr>
+        <w:t>ShellCore</w:t>
+      </w:r>
+      <w:r>
+        <w:t xml:space="preserve"> (IEEE Internet of Things Journal, 2022), which detects malicious shell commands with a purely </w:t>
+      </w:r>
+      <w:r>
+        <w:rPr>
+          <w:b/>
+        </w:rPr>
+        <w:t>character-level</w:t>
+      </w:r>
+      <w:r>
+        <w:t xml:space="preserve"> representation: character n-gram TF-IDF over the raw command string fed to logistic regression / random forest, with no hand-engineered features.</w:t>
+      </w:r>
+    </w:p>
+    <w:p>
+      <w:pPr>
+        <w:spacing w:before="0" w:after="120" w:lineRule="auto" w:line="360"/>
+      </w:pPr>
+      <w:r>
+        <w:rPr>
+          <w:b/>
+        </w:rPr>
+        <w:t>Semantic meaning the authors assign.</w:t>
+      </w:r>
+      <w:r>
+        <w:t xml:space="preserve"> Both treat the command </w:t>
+      </w:r>
+      <w:r>
+        <w:rPr>
+          <w:i/>
+        </w:rPr>
+        <w:t>string</w:t>
+      </w:r>
+      <w:r>
+        <w:t xml:space="preserve"> as the unit of meaning but locate the signal differently. Trizna engineers token- and structure-level features (lengths, counts, binary families) as behavioural proxies; ShellCore argues the discriminative signal lives at the </w:t>
+      </w:r>
+      <w:r>
+        <w:rPr>
+          <w:b/>
+        </w:rPr>
+        <w:t>sub-token character level</w:t>
+      </w:r>
+      <w:r>
+        <w:t xml:space="preserve"> — the obfuscation, encoding and packed payloads that whole-token features miss. ShellCore's malware-only ablation is the decisive evidence: term-level accuracy collapses 99.08 → 67.48 while the character-level model holds 99.91 → 99.79.</w:t>
+      </w:r>
+    </w:p>
+    <w:p>
+      <w:pPr>
+        <w:spacing w:before="0" w:after="120" w:lineRule="auto" w:line="360"/>
+      </w:pPr>
+      <w:r>
+        <w:rPr>
+          <w:b/>
+        </w:rPr>
+        <w:t>Contrast, and adopt / modify / reject.</w:t>
+      </w:r>
+      <w:r>
+        <w:t xml:space="preserve"> Trizna is interpretable but token-bound; ShellCore is representation-robust but opaque. For our pipeline we </w:t>
+      </w:r>
+      <w:r>
+        <w:rPr>
+          <w:b/>
+        </w:rPr>
+        <w:t>adopt</w:t>
+      </w:r>
+      <w:r>
+        <w:t xml:space="preserve"> ShellCore's char-level insight — a bounded char n-gram TF-IDF block unioned into the hybrid model lifts F1 from ~0.76 to ~0.87; we </w:t>
+      </w:r>
+      <w:r>
+        <w:rPr>
+          <w:b/>
+        </w:rPr>
+        <w:t>modify</w:t>
+      </w:r>
+      <w:r>
+        <w:t xml:space="preserve"> their unbounded representation into fixed, threat-mapped feature lists plus in-fold-only n-grams to prevent leakage, and we keep Trizna's behavioural intuition as the 43 engineered features; we </w:t>
+      </w:r>
+      <w:r>
+        <w:rPr>
+          <w:b/>
+        </w:rPr>
+        <w:t>reject</w:t>
+      </w:r>
+      <w:r>
+        <w:t xml:space="preserve"> ShellCore's PCA step (opaque for a threat-traceability report) and its ungrouped evaluation protocol, where near-duplicates straddle train/test — our shape-grouped split is stricter and costs several F1 points. The upshot, confirmed in Ch8.3: the engineered features earn their place on interpretability and threat-traceability, while an untuned char n-gram baseline — vindicating ShellCore's thesis — still out-scores every engineered model on raw discriminative power.</w:t>
+      </w:r>
+    </w:p>
+    <w:p>
+      <w:pPr>
         <w:pStyle w:val="Heading1"/>
         <w:spacing w:before="200" w:after="80" w:lineRule="auto" w:line="276"/>
       </w:pPr>
@@ -4474,17 +4591,27 @@
         <w:spacing w:before="0" w:after="120" w:lineRule="auto" w:line="360"/>
       </w:pPr>
       <w:r>
-        <w:t xml:space="preserve">XGBoost gain-based importance quantifies how much each engineered feature reduces training loss across every split it participates in — a direct measure of the discriminative signal the model actually leans on, not merely how often a feature appears. Figure </w:t>
+        <w:t xml:space="preserve">XGBoost gain-based importance quantifies how much each engineered feature reduces training loss across the splits it participates in — a direct measure of the discriminative signal the model leans on, not merely how often a feature appears. </w:t>
       </w:r>
       <w:r>
         <w:rPr>
           <w:rFonts w:ascii="Courier New" w:hAnsi="Courier New"/>
           <w:sz w:val="18"/>
         </w:rPr>
-        <w:t>ch4_feature_importance_dataset1.png</w:t>
-      </w:r>
-      <w:r>
-        <w:t xml:space="preserve"> ranks the top 20 engineered features for Dataset 1; the leaders and their MITRE ATT&amp;CK mappings are summarized below.</w:t>
+        <w:t>report/figures/ch4_feature_importance_dataset1.png</w:t>
+      </w:r>
+      <w:r>
+        <w:t xml:space="preserve"> ranks the top-20 engineered features for Dataset 1; the leaders and their MITRE ATT&amp;CK mappings are summarised below (full RF-MDI, XGBoost-gain and permutation scores in </w:t>
+      </w:r>
+      <w:r>
+        <w:rPr>
+          <w:rFonts w:ascii="Courier New" w:hAnsi="Courier New"/>
+          <w:sz w:val="18"/>
+        </w:rPr>
+        <w:t>report/ch4_feature_ranking.csv</w:t>
+      </w:r>
+      <w:r>
+        <w:t>).</w:t>
       </w:r>
     </w:p>
     <w:p>
@@ -4575,7 +4702,7 @@
                 <w:b/>
                 <w:sz w:val="17"/>
               </w:rPr>
-              <w:t>Gain</w:t>
+              <w:t>XGB gain</w:t>
             </w:r>
           </w:p>
         </w:tc>
@@ -4666,7 +4793,7 @@
                 <w:rFonts w:ascii="Courier New" w:hAnsi="Courier New"/>
                 <w:sz w:val="17"/>
               </w:rPr>
-              <w:t>shell_bins</w:t>
+              <w:t>n_abs_paths</w:t>
             </w:r>
           </w:p>
         </w:tc>
@@ -4687,7 +4814,7 @@
               <w:rPr>
                 <w:sz w:val="17"/>
               </w:rPr>
-              <w:t>0.194</w:t>
+              <w:t>0.181</w:t>
             </w:r>
           </w:p>
         </w:tc>
@@ -4708,14 +4835,14 @@
               <w:rPr>
                 <w:sz w:val="17"/>
               </w:rPr>
-              <w:t>Presence of a shell interpreter (</w:t>
+              <w:t>Count of absolute-path tokens (</w:t>
             </w:r>
             <w:r>
               <w:rPr>
                 <w:rFonts w:ascii="Courier New" w:hAnsi="Courier New"/>
                 <w:sz w:val="17"/>
               </w:rPr>
-              <w:t>bash</w:t>
+              <w:t>/etc</w:t>
             </w:r>
             <w:r>
               <w:rPr>
@@ -4728,7 +4855,7 @@
                 <w:rFonts w:ascii="Courier New" w:hAnsi="Courier New"/>
                 <w:sz w:val="17"/>
               </w:rPr>
-              <w:t>sh</w:t>
+              <w:t>/proc</w:t>
             </w:r>
             <w:r>
               <w:rPr>
@@ -4741,26 +4868,13 @@
                 <w:rFonts w:ascii="Courier New" w:hAnsi="Courier New"/>
                 <w:sz w:val="17"/>
               </w:rPr>
-              <w:t>zsh</w:t>
-            </w:r>
-            <w:r>
-              <w:rPr>
-                <w:sz w:val="17"/>
-              </w:rPr>
-              <w:t xml:space="preserve">, </w:t>
-            </w:r>
-            <w:r>
-              <w:rPr>
-                <w:rFonts w:ascii="Courier New" w:hAnsi="Courier New"/>
-                <w:sz w:val="17"/>
-              </w:rPr>
-              <w:t>dash</w:t>
-            </w:r>
-            <w:r>
-              <w:rPr>
-                <w:sz w:val="17"/>
-              </w:rPr>
-              <w:t>)</w:t>
+              <w:t>/tmp</w:t>
+            </w:r>
+            <w:r>
+              <w:rPr>
+                <w:sz w:val="17"/>
+              </w:rPr>
+              <w:t>, …)</w:t>
             </w:r>
           </w:p>
         </w:tc>
@@ -4781,7 +4895,7 @@
               <w:rPr>
                 <w:sz w:val="17"/>
               </w:rPr>
-              <w:t>Execution → Command and Scripting Interpreter: Unix Shell (T1059.004)</w:t>
+              <w:t>Discovery / Collection → filesystem targeting</w:t>
             </w:r>
           </w:p>
         </w:tc>
@@ -4826,7 +4940,7 @@
                 <w:rFonts w:ascii="Courier New" w:hAnsi="Courier New"/>
                 <w:sz w:val="17"/>
               </w:rPr>
-              <w:t>redirect_count</w:t>
+              <w:t>has_dev_null</w:t>
             </w:r>
           </w:p>
         </w:tc>
@@ -4847,7 +4961,7 @@
               <w:rPr>
                 <w:sz w:val="17"/>
               </w:rPr>
-              <w:t>0.130</w:t>
+              <w:t>0.111</w:t>
             </w:r>
           </w:p>
         </w:tc>
@@ -4868,33 +4982,14 @@
               <w:rPr>
                 <w:sz w:val="17"/>
               </w:rPr>
-              <w:t xml:space="preserve">Count of </w:t>
+              <w:t xml:space="preserve">Output suppression via </w:t>
             </w:r>
             <w:r>
               <w:rPr>
                 <w:rFonts w:ascii="Courier New" w:hAnsi="Courier New"/>
                 <w:sz w:val="17"/>
               </w:rPr>
-              <w:t>&gt;</w:t>
-            </w:r>
-            <w:r>
-              <w:rPr>
-                <w:sz w:val="17"/>
-              </w:rPr>
-              <w:t xml:space="preserve"> / </w:t>
-            </w:r>
-            <w:r>
-              <w:rPr>
-                <w:rFonts w:ascii="Courier New" w:hAnsi="Courier New"/>
-                <w:sz w:val="17"/>
-              </w:rPr>
-              <w:t>&gt;&gt;</w:t>
-            </w:r>
-            <w:r>
-              <w:rPr>
-                <w:sz w:val="17"/>
-              </w:rPr>
-              <w:t xml:space="preserve"> output redirects</w:t>
+              <w:t>&gt;/dev/null</w:t>
             </w:r>
           </w:p>
         </w:tc>
@@ -4915,7 +5010,7 @@
               <w:rPr>
                 <w:sz w:val="17"/>
               </w:rPr>
-              <w:t>Execution → Unix Shell (T1059.004)</w:t>
+              <w:t>Defense Evasion → output/indicator suppression</w:t>
             </w:r>
           </w:p>
         </w:tc>
@@ -4960,7 +5055,7 @@
                 <w:rFonts w:ascii="Courier New" w:hAnsi="Courier New"/>
                 <w:sz w:val="17"/>
               </w:rPr>
-              <w:t>pipe_count</w:t>
+              <w:t>has_shell_bin</w:t>
             </w:r>
           </w:p>
         </w:tc>
@@ -4981,7 +5076,7 @@
               <w:rPr>
                 <w:sz w:val="17"/>
               </w:rPr>
-              <w:t>0.076</w:t>
+              <w:t>0.097</w:t>
             </w:r>
           </w:p>
         </w:tc>
@@ -5002,20 +5097,59 @@
               <w:rPr>
                 <w:sz w:val="17"/>
               </w:rPr>
-              <w:t>Count of single-</w:t>
+              <w:t>A shell interpreter is named (</w:t>
             </w:r>
             <w:r>
               <w:rPr>
                 <w:rFonts w:ascii="Courier New" w:hAnsi="Courier New"/>
                 <w:sz w:val="17"/>
               </w:rPr>
-              <w:t>|</w:t>
-            </w:r>
-            <w:r>
-              <w:rPr>
-                <w:sz w:val="17"/>
-              </w:rPr>
-              <w:t xml:space="preserve"> pipe stages</w:t>
+              <w:t>bash</w:t>
+            </w:r>
+            <w:r>
+              <w:rPr>
+                <w:sz w:val="17"/>
+              </w:rPr>
+              <w:t xml:space="preserve">, </w:t>
+            </w:r>
+            <w:r>
+              <w:rPr>
+                <w:rFonts w:ascii="Courier New" w:hAnsi="Courier New"/>
+                <w:sz w:val="17"/>
+              </w:rPr>
+              <w:t>sh</w:t>
+            </w:r>
+            <w:r>
+              <w:rPr>
+                <w:sz w:val="17"/>
+              </w:rPr>
+              <w:t xml:space="preserve">, </w:t>
+            </w:r>
+            <w:r>
+              <w:rPr>
+                <w:rFonts w:ascii="Courier New" w:hAnsi="Courier New"/>
+                <w:sz w:val="17"/>
+              </w:rPr>
+              <w:t>zsh</w:t>
+            </w:r>
+            <w:r>
+              <w:rPr>
+                <w:sz w:val="17"/>
+              </w:rPr>
+              <w:t xml:space="preserve">, </w:t>
+            </w:r>
+            <w:r>
+              <w:rPr>
+                <w:rFonts w:ascii="Courier New" w:hAnsi="Courier New"/>
+                <w:sz w:val="17"/>
+              </w:rPr>
+              <w:t>dash</w:t>
+            </w:r>
+            <w:r>
+              <w:rPr>
+                <w:sz w:val="17"/>
+              </w:rPr>
+              <w:t>)</w:t>
             </w:r>
           </w:p>
         </w:tc>
@@ -5081,7 +5215,7 @@
                 <w:rFonts w:ascii="Courier New" w:hAnsi="Courier New"/>
                 <w:sz w:val="17"/>
               </w:rPr>
-              <w:t>path_proc</w:t>
+              <w:t>head_is_lotl</w:t>
             </w:r>
           </w:p>
         </w:tc>
@@ -5102,7 +5236,7 @@
               <w:rPr>
                 <w:sz w:val="17"/>
               </w:rPr>
-              <w:t>0.040</w:t>
+              <w:t>0.045</w:t>
             </w:r>
           </w:p>
         </w:tc>
@@ -5123,14 +5257,20 @@
               <w:rPr>
                 <w:sz w:val="17"/>
               </w:rPr>
-              <w:t xml:space="preserve">References to </w:t>
-            </w:r>
-            <w:r>
-              <w:rPr>
-                <w:rFonts w:ascii="Courier New" w:hAnsi="Courier New"/>
-                <w:sz w:val="17"/>
-              </w:rPr>
-              <w:t>/proc/</w:t>
+              <w:t xml:space="preserve">The command head </w:t>
+            </w:r>
+            <w:r>
+              <w:rPr>
+                <w:i/>
+                <w:sz w:val="17"/>
+              </w:rPr>
+              <w:t>is</w:t>
+            </w:r>
+            <w:r>
+              <w:rPr>
+                <w:sz w:val="17"/>
+              </w:rPr>
+              <w:t xml:space="preserve"> a GTFOBins/LotL binary</w:t>
             </w:r>
           </w:p>
         </w:tc>
@@ -5151,7 +5291,7 @@
               <w:rPr>
                 <w:sz w:val="17"/>
               </w:rPr>
-              <w:t>Discovery → Process/System Discovery (T1057)</w:t>
+              <w:t>Execution / Defense Evasion → LotL abuse</w:t>
             </w:r>
           </w:p>
         </w:tc>
@@ -5196,7 +5336,7 @@
                 <w:rFonts w:ascii="Courier New" w:hAnsi="Courier New"/>
                 <w:sz w:val="17"/>
               </w:rPr>
-              <w:t>lotl_bins</w:t>
+              <w:t>has_interp_bin</w:t>
             </w:r>
           </w:p>
         </w:tc>
@@ -5217,7 +5357,7 @@
               <w:rPr>
                 <w:sz w:val="17"/>
               </w:rPr>
-              <w:t>0.030</w:t>
+              <w:t>0.041</w:t>
             </w:r>
           </w:p>
         </w:tc>
@@ -5238,14 +5378,14 @@
               <w:rPr>
                 <w:sz w:val="17"/>
               </w:rPr>
-              <w:t>Presence of dual-use LotL binaries (</w:t>
+              <w:t>An interpreter is named (</w:t>
             </w:r>
             <w:r>
               <w:rPr>
                 <w:rFonts w:ascii="Courier New" w:hAnsi="Courier New"/>
                 <w:sz w:val="17"/>
               </w:rPr>
-              <w:t>awk</w:t>
+              <w:t>python</w:t>
             </w:r>
             <w:r>
               <w:rPr>
@@ -5258,7 +5398,7 @@
                 <w:rFonts w:ascii="Courier New" w:hAnsi="Courier New"/>
                 <w:sz w:val="17"/>
               </w:rPr>
-              <w:t>find</w:t>
+              <w:t>perl</w:t>
             </w:r>
             <w:r>
               <w:rPr>
@@ -5271,59 +5411,7 @@
                 <w:rFonts w:ascii="Courier New" w:hAnsi="Courier New"/>
                 <w:sz w:val="17"/>
               </w:rPr>
-              <w:t>vim</w:t>
-            </w:r>
-            <w:r>
-              <w:rPr>
-                <w:sz w:val="17"/>
-              </w:rPr>
-              <w:t xml:space="preserve">, </w:t>
-            </w:r>
-            <w:r>
-              <w:rPr>
-                <w:rFonts w:ascii="Courier New" w:hAnsi="Courier New"/>
-                <w:sz w:val="17"/>
-              </w:rPr>
-              <w:t>dd</w:t>
-            </w:r>
-            <w:r>
-              <w:rPr>
-                <w:sz w:val="17"/>
-              </w:rPr>
-              <w:t xml:space="preserve">, </w:t>
-            </w:r>
-            <w:r>
-              <w:rPr>
-                <w:rFonts w:ascii="Courier New" w:hAnsi="Courier New"/>
-                <w:sz w:val="17"/>
-              </w:rPr>
-              <w:t>xxd</w:t>
-            </w:r>
-            <w:r>
-              <w:rPr>
-                <w:sz w:val="17"/>
-              </w:rPr>
-              <w:t xml:space="preserve">, </w:t>
-            </w:r>
-            <w:r>
-              <w:rPr>
-                <w:rFonts w:ascii="Courier New" w:hAnsi="Courier New"/>
-                <w:sz w:val="17"/>
-              </w:rPr>
-              <w:t>tar</w:t>
-            </w:r>
-            <w:r>
-              <w:rPr>
-                <w:sz w:val="17"/>
-              </w:rPr>
-              <w:t xml:space="preserve">, </w:t>
-            </w:r>
-            <w:r>
-              <w:rPr>
-                <w:rFonts w:ascii="Courier New" w:hAnsi="Courier New"/>
-                <w:sz w:val="17"/>
-              </w:rPr>
-              <w:t>zip</w:t>
+              <w:t>ruby</w:t>
             </w:r>
             <w:r>
               <w:rPr>
@@ -5350,7 +5438,7 @@
               <w:rPr>
                 <w:sz w:val="17"/>
               </w:rPr>
-              <w:t>Execution / Defense Evasion / Collection → e.g. Archive Collected Data (T1560)</w:t>
+              <w:t>Execution → Command &amp; Scripting Interpreter</w:t>
             </w:r>
           </w:p>
         </w:tc>
@@ -5381,30 +5469,10 @@
           <w:rFonts w:ascii="Courier New" w:hAnsi="Courier New"/>
           <w:sz w:val="18"/>
         </w:rPr>
-        <w:t>shell_bins</w:t>
-      </w:r>
-      <w:r>
-        <w:t xml:space="preserve"> alone (0.194) carries more weight than the next two features combined, and the top three — all Execution/Unix-Shell signals — account for the bulk of the ranked importance before the curve flattens into a long tail of near-equal features (</w:t>
-      </w:r>
-      <w:r>
-        <w:rPr>
-          <w:rFonts w:ascii="Courier New" w:hAnsi="Courier New"/>
-          <w:sz w:val="18"/>
-        </w:rPr>
-        <w:t>path_proc</w:t>
-      </w:r>
-      <w:r>
-        <w:t xml:space="preserve"> at 0.040 down to </w:t>
-      </w:r>
-      <w:r>
-        <w:rPr>
-          <w:rFonts w:ascii="Courier New" w:hAnsi="Courier New"/>
-          <w:sz w:val="18"/>
-        </w:rPr>
-        <w:t>lotl_bins</w:t>
-      </w:r>
-      <w:r>
-        <w:t xml:space="preserve"> at 0.030 and below). The model is not spreading its confidence evenly; it is betting heavily on a handful of dominant cues.</w:t>
+        <w:t>n_abs_paths</w:t>
+      </w:r>
+      <w:r>
+        <w:t xml:space="preserve"> alone (0.181) outweighs the next two features combined, and the top three carry the bulk of the ranked importance before the curve flattens into a long tail of near-equal features. The model is not spreading confidence evenly; it bets heavily on a few dominant cues — where a command reaches in the filesystem, whether it suppresses its own output, and whether it invokes an explicit interpreter.</w:t>
       </w:r>
     </w:p>
     <w:p>
@@ -6269,7 +6337,7 @@
         <w:spacing w:before="200" w:after="80" w:lineRule="auto" w:line="276"/>
       </w:pPr>
       <w:r>
-        <w:t>Chapter 6 — Model Selection Justification (XGBoost &amp; 1D-CNN)</w:t>
+        <w:t>Chapter 6 — Model Selection Justification</w:t>
       </w:r>
     </w:p>
     <w:p>
@@ -6301,7 +6369,7 @@
         <w:rPr>
           <w:b/>
         </w:rPr>
-        <w:t>F1 0.871 / ROC-AUC 0.978</w:t>
+        <w:t>F1 0.876 / ROC-AUC 0.979</w:t>
       </w:r>
       <w:r>
         <w:t xml:space="preserve"> on Dataset 1 and </w:t>
@@ -6310,7 +6378,7 @@
         <w:rPr>
           <w:b/>
         </w:rPr>
-        <w:t>0.846 / 0.965</w:t>
+        <w:t>0.848 / 0.968</w:t>
       </w:r>
       <w:r>
         <w:t xml:space="preserve"> on Dataset 2, while the CNN reaches </w:t>
@@ -6319,7 +6387,7 @@
         <w:rPr>
           <w:b/>
         </w:rPr>
-        <w:t>0.853 / 0.976</w:t>
+        <w:t>0.860 / 0.975</w:t>
       </w:r>
       <w:r>
         <w:t xml:space="preserve"> and </w:t>
@@ -6328,7 +6396,7 @@
         <w:rPr>
           <w:b/>
         </w:rPr>
-        <w:t>0.841 / 0.960</w:t>
+        <w:t>0.838 / 0.964</w:t>
       </w:r>
       <w:r>
         <w:t xml:space="preserve"> (</w:t>
@@ -6381,30 +6449,30 @@
           <w:rFonts w:ascii="Courier New" w:hAnsi="Courier New"/>
           <w:sz w:val="18"/>
         </w:rPr>
-        <w:t>shell_bins</w:t>
-      </w:r>
-      <w:r>
-        <w:t xml:space="preserve"> 0.194, </w:t>
+        <w:t>n_abs_paths</w:t>
+      </w:r>
+      <w:r>
+        <w:t xml:space="preserve"> 0.181, </w:t>
       </w:r>
       <w:r>
         <w:rPr>
           <w:rFonts w:ascii="Courier New" w:hAnsi="Courier New"/>
           <w:sz w:val="18"/>
         </w:rPr>
-        <w:t>redirect_count</w:t>
-      </w:r>
-      <w:r>
-        <w:t xml:space="preserve"> 0.130, </w:t>
+        <w:t>has_dev_null</w:t>
+      </w:r>
+      <w:r>
+        <w:t xml:space="preserve"> 0.111, </w:t>
       </w:r>
       <w:r>
         <w:rPr>
           <w:rFonts w:ascii="Courier New" w:hAnsi="Courier New"/>
           <w:sz w:val="18"/>
         </w:rPr>
-        <w:t>pipe_count</w:t>
-      </w:r>
-      <w:r>
-        <w:t xml:space="preserve"> 0.076) is only possible because the model is inspectable, and it is what let us </w:t>
+        <w:t>has_shell_bin</w:t>
+      </w:r>
+      <w:r>
+        <w:t xml:space="preserve"> 0.097) is only possible because the model is inspectable, and it is what let us </w:t>
       </w:r>
       <w:r>
         <w:rPr>
@@ -6446,7 +6514,7 @@
           <w:rFonts w:ascii="Courier New" w:hAnsi="Courier New"/>
           <w:sz w:val="18"/>
         </w:rPr>
-        <w:t>char_count</w:t>
+        <w:t>len_chars</w:t>
       </w:r>
       <w:r>
         <w:t>), and binary flags (</w:t>
@@ -6456,7 +6524,7 @@
           <w:rFonts w:ascii="Courier New" w:hAnsi="Courier New"/>
           <w:sz w:val="18"/>
         </w:rPr>
-        <w:t>shell_bins</w:t>
+        <w:t>has_shell_bin</w:t>
       </w:r>
       <w:r>
         <w:t>). Trees split on thresholds and never assume a common scale or distribution, so heterogeneous features coexist without one-hot expansion or feature-specific preprocessing.</w:t>
@@ -6482,7 +6550,7 @@
           <w:rFonts w:ascii="Courier New" w:hAnsi="Courier New"/>
           <w:sz w:val="18"/>
         </w:rPr>
-        <w:t>char_count</w:t>
+        <w:t>len_chars</w:t>
       </w:r>
       <w:r>
         <w:t xml:space="preserve">, </w:t>
@@ -6492,7 +6560,7 @@
           <w:rFonts w:ascii="Courier New" w:hAnsi="Courier New"/>
           <w:sz w:val="18"/>
         </w:rPr>
-        <w:t>token_len_max</w:t>
+        <w:t>max_token_len</w:t>
       </w:r>
       <w:r>
         <w:t>) need no standardization or log-transform — the exact normalization burden that would sink a linear or neural model on these inputs (Ch. 3).</w:t>
@@ -6821,6 +6889,158 @@
       </w:r>
       <w:r>
         <w:t>, NeurIPS 2015, motivating the character granularity).</w:t>
+      </w:r>
+    </w:p>
+    <w:p>
+      <w:pPr>
+        <w:pStyle w:val="Heading2"/>
+        <w:spacing w:before="120" w:after="80" w:lineRule="auto" w:line="276"/>
+      </w:pPr>
+      <w:r>
+        <w:t>Random Forest and Isolation Forest (models 3 and 4)</w:t>
+      </w:r>
+    </w:p>
+    <w:p>
+      <w:pPr>
+        <w:spacing w:before="0" w:after="120" w:lineRule="auto" w:line="360"/>
+      </w:pPr>
+      <w:r>
+        <w:rPr>
+          <w:b/>
+        </w:rPr>
+        <w:t>Random Forest — traditional supervised (bagged trees).</w:t>
+      </w:r>
+      <w:r>
+        <w:t xml:space="preserve"> Chosen for no-extrapolation robustness to the heavy right tails of the count features: an ensemble of axis-aligned splits cannot be dragged by a single 400-token outlier the way a linear model is, and it needs no scaling (Ch5.3 measures the scaler as a near-no-op for it). Its Gini importance independently reproduces the Ch4 rank-biserial top features — an internal cross-check that the signal is real, not one estimator's artefact — and importance mass spreads across all 43 features rather than one shortcut, which is anti-shortcut evidence. Production: </w:t>
+      </w:r>
+      <w:r>
+        <w:rPr>
+          <w:rFonts w:ascii="Courier New" w:hAnsi="Courier New"/>
+          <w:sz w:val="18"/>
+        </w:rPr>
+        <w:t>n_estimators=400</w:t>
+      </w:r>
+      <w:r>
+        <w:t xml:space="preserve">, </w:t>
+      </w:r>
+      <w:r>
+        <w:rPr>
+          <w:rFonts w:ascii="Courier New" w:hAnsi="Courier New"/>
+          <w:sz w:val="18"/>
+        </w:rPr>
+        <w:t>max_depth=24</w:t>
+      </w:r>
+      <w:r>
+        <w:t xml:space="preserve">, </w:t>
+      </w:r>
+      <w:r>
+        <w:rPr>
+          <w:rFonts w:ascii="Courier New" w:hAnsi="Courier New"/>
+          <w:sz w:val="18"/>
+        </w:rPr>
+        <w:t>class_weight="balanced_subsample"</w:t>
+      </w:r>
+      <w:r>
+        <w:t xml:space="preserve">, </w:t>
+      </w:r>
+      <w:r>
+        <w:rPr>
+          <w:rFonts w:ascii="Courier New" w:hAnsi="Courier New"/>
+          <w:sz w:val="18"/>
+        </w:rPr>
+        <w:t>max_features="sqrt"</w:t>
+      </w:r>
+      <w:r>
+        <w:t xml:space="preserve">. </w:t>
+      </w:r>
+      <w:r>
+        <w:rPr>
+          <w:i/>
+        </w:rPr>
+        <w:t>Cite:</w:t>
+      </w:r>
+      <w:r>
+        <w:t xml:space="preserve"> Breiman (2001), </w:t>
+      </w:r>
+      <w:r>
+        <w:rPr>
+          <w:i/>
+        </w:rPr>
+        <w:t>Random Forests</w:t>
+      </w:r>
+      <w:r>
+        <w:t>; the char-level RF result on shell commands in ShellCore (IEEE IoT J., 2022).</w:t>
+      </w:r>
+    </w:p>
+    <w:p>
+      <w:pPr>
+        <w:spacing w:before="0" w:after="120" w:lineRule="auto" w:line="360"/>
+      </w:pPr>
+      <w:r>
+        <w:rPr>
+          <w:b/>
+        </w:rPr>
+        <w:t>Isolation Forest — unsupervised / anomaly detection.</w:t>
+      </w:r>
+      <w:r>
+        <w:t xml:space="preserve"> Chosen as the label-free, cold-start detector and the cascade's fast stage-1 filter: it isolates anomalies in a handful of random splits, so it scales linearly and needs no attack labels — the one measurement of how far pure statistical strangeness carries before supervision is required. It is honestly weak at a fixed 0.5 threshold (F1 0.249 / 0.143) but ranks soundly (ROC-AUC 0.812 / 0.677), so Ch7 and Ch8.4 consume its </w:t>
+      </w:r>
+      <w:r>
+        <w:rPr>
+          <w:i/>
+        </w:rPr>
+        <w:t>ranking</w:t>
+      </w:r>
+      <w:r>
+        <w:t xml:space="preserve">, not its raw decision. Production: </w:t>
+      </w:r>
+      <w:r>
+        <w:rPr>
+          <w:rFonts w:ascii="Courier New" w:hAnsi="Courier New"/>
+          <w:sz w:val="18"/>
+        </w:rPr>
+        <w:t>n_estimators=300</w:t>
+      </w:r>
+      <w:r>
+        <w:t xml:space="preserve">, </w:t>
+      </w:r>
+      <w:r>
+        <w:rPr>
+          <w:rFonts w:ascii="Courier New" w:hAnsi="Courier New"/>
+          <w:sz w:val="18"/>
+        </w:rPr>
+        <w:t>max_samples=0.8</w:t>
+      </w:r>
+      <w:r>
+        <w:t xml:space="preserve">, </w:t>
+      </w:r>
+      <w:r>
+        <w:rPr>
+          <w:rFonts w:ascii="Courier New" w:hAnsi="Courier New"/>
+          <w:sz w:val="18"/>
+        </w:rPr>
+        <w:t>contamination=0.25</w:t>
+      </w:r>
+      <w:r>
+        <w:t xml:space="preserve">. </w:t>
+      </w:r>
+      <w:r>
+        <w:rPr>
+          <w:i/>
+        </w:rPr>
+        <w:t>Cite:</w:t>
+      </w:r>
+      <w:r>
+        <w:t xml:space="preserve"> Liu, Ting &amp; Zhou (2008 / 2012), </w:t>
+      </w:r>
+      <w:r>
+        <w:rPr>
+          <w:i/>
+        </w:rPr>
+        <w:t>Isolation Forest / Isolation-based Anomaly Detection</w:t>
+      </w:r>
+      <w:r>
+        <w:t>.</w:t>
       </w:r>
     </w:p>
     <w:p>
@@ -7116,11 +7336,11 @@
     </w:p>
     <w:p>
       <w:pPr>
-        <w:pStyle w:val="Heading1"/>
-        <w:spacing w:before="200" w:after="80" w:lineRule="auto" w:line="276"/>
+        <w:pStyle w:val="Heading2"/>
+        <w:spacing w:before="120" w:after="80" w:lineRule="auto" w:line="276"/>
       </w:pPr>
       <w:r>
-        <w:t>Chapter 8.1 — Forensic error analysis (Ben's models)</w:t>
+        <w:t>7.2 Class-imbalance strategy and leakage control</w:t>
       </w:r>
     </w:p>
     <w:p>
@@ -7128,76 +7348,16 @@
         <w:spacing w:before="0" w:after="120" w:lineRule="auto" w:line="360"/>
       </w:pPr>
       <w:r>
-        <w:t xml:space="preserve">Confusion matrices: </w:t>
+        <w:t xml:space="preserve">Both corpora are deliberately imbalanced at 1 attack : 3 benign (25% positive), so a detector that flags everything scores only F1 = 0.400 — the do-nothing floor every result is measured against. The pipeline counters this </w:t>
       </w:r>
       <w:r>
         <w:rPr>
-          <w:rFonts w:ascii="Courier New" w:hAnsi="Courier New"/>
-          <w:sz w:val="18"/>
+          <w:b/>
         </w:rPr>
-        <w:t>report/figures/ch8_confusion_xgboost_hybrid_dataset1.png</w:t>
-      </w:r>
-      <w:r>
-        <w:t xml:space="preserve">, </w:t>
-      </w:r>
-      <w:r>
-        <w:rPr>
-          <w:rFonts w:ascii="Courier New" w:hAnsi="Courier New"/>
-          <w:sz w:val="18"/>
-        </w:rPr>
-        <w:t>report/figures/ch8_confusion_xgboost_hybrid_dataset2.png</w:t>
-      </w:r>
-      <w:r>
-        <w:t xml:space="preserve">, </w:t>
-      </w:r>
-      <w:r>
-        <w:rPr>
-          <w:rFonts w:ascii="Courier New" w:hAnsi="Courier New"/>
-          <w:sz w:val="18"/>
-        </w:rPr>
-        <w:t>report/figures/ch8_confusion_cnn1d_dataset1.png</w:t>
-      </w:r>
-      <w:r>
-        <w:t xml:space="preserve">, </w:t>
-      </w:r>
-      <w:r>
-        <w:rPr>
-          <w:rFonts w:ascii="Courier New" w:hAnsi="Courier New"/>
-          <w:sz w:val="18"/>
-        </w:rPr>
-        <w:t>report/figures/ch8_confusion_cnn1d_dataset2.png</w:t>
-      </w:r>
-      <w:r>
-        <w:t xml:space="preserve">. Sample-level FN/FP command strings (capped at 40 per cell): </w:t>
-      </w:r>
-      <w:r>
-        <w:rPr>
-          <w:rFonts w:ascii="Courier New" w:hAnsi="Courier New"/>
-          <w:sz w:val="18"/>
-        </w:rPr>
-        <w:t>results/ch8_failures.json</w:t>
-      </w:r>
-      <w:r>
-        <w:t xml:space="preserve">. The by-source counts below are over every error, from </w:t>
-      </w:r>
-      <w:r>
-        <w:rPr>
-          <w:rFonts w:ascii="Courier New" w:hAnsi="Courier New"/>
-          <w:sz w:val="18"/>
-        </w:rPr>
-        <w:t>results/ch8_confusion.json</w:t>
-      </w:r>
-      <w:r>
-        <w:t>.</w:t>
-      </w:r>
-    </w:p>
-    <w:p>
-      <w:pPr>
-        <w:pStyle w:val="Heading2"/>
-        <w:spacing w:before="120" w:after="80" w:lineRule="auto" w:line="276"/>
-      </w:pPr>
-      <w:r>
-        <w:t>xgboost_hybrid/dataset1</w:t>
+        <w:t>cost-sensitively rather than by resampling</w:t>
+      </w:r>
+      <w:r>
+        <w:t>, applied identically across models:</w:t>
       </w:r>
     </w:p>
     <w:p>
@@ -7207,7 +7367,23 @@
         <w:ind w:left="360"/>
       </w:pPr>
       <w:r>
-        <w:t>Confusion [tn, fp, fn, tp] = [2192, 95, 94, 668]; F1 0.876, Recall 0.877, FPR 0.042.</w:t>
+        <w:rPr>
+          <w:b/>
+        </w:rPr>
+        <w:t>XGBoost / XGBoost-hybrid</w:t>
+      </w:r>
+      <w:r>
+        <w:t xml:space="preserve"> — </w:t>
+      </w:r>
+      <w:r>
+        <w:rPr>
+          <w:rFonts w:ascii="Courier New" w:hAnsi="Courier New"/>
+          <w:sz w:val="18"/>
+        </w:rPr>
+        <w:t>scale_pos_weight</w:t>
+      </w:r>
+      <w:r>
+        <w:t xml:space="preserve"> = train-fold negative/positive ratio, so a missed attack costs the loss as much as three false alarms.</w:t>
       </w:r>
     </w:p>
     <w:p>
@@ -7220,10 +7396,20 @@
         <w:rPr>
           <w:b/>
         </w:rPr>
-        <w:t>False negatives</w:t>
-      </w:r>
-      <w:r>
-        <w:t xml:space="preserve"> by source (all 94): {'hacktricks': 59, 'gtfobins': 19, 'atomic_red_team': 15, 'slp': 1}.</w:t>
+        <w:t>Random Forest</w:t>
+      </w:r>
+      <w:r>
+        <w:t xml:space="preserve"> — </w:t>
+      </w:r>
+      <w:r>
+        <w:rPr>
+          <w:rFonts w:ascii="Courier New" w:hAnsi="Courier New"/>
+          <w:sz w:val="18"/>
+        </w:rPr>
+        <w:t>class_weight="balanced_subsample"</w:t>
+      </w:r>
+      <w:r>
+        <w:t>, re-weighting the Gini split criterion per bootstrap.</w:t>
       </w:r>
     </w:p>
     <w:p>
@@ -7236,10 +7422,10 @@
         <w:rPr>
           <w:b/>
         </w:rPr>
-        <w:t>False positives</w:t>
-      </w:r>
-      <w:r>
-        <w:t xml:space="preserve"> by source (all 95): {'tldr': 29, 'nl2bash': 28, 'linlm': 21, 'bash6k': 14, 'bash_instruct': 3}.</w:t>
+        <w:t>1D-CNN</w:t>
+      </w:r>
+      <w:r>
+        <w:t xml:space="preserve"> — class-weighted cross-entropy at the same ratio.</w:t>
       </w:r>
     </w:p>
     <w:p>
@@ -7249,34 +7435,155 @@
         <w:ind w:left="360"/>
       </w:pPr>
       <w:r>
-        <w:t xml:space="preserve">Example missed attacks (FN): </w:t>
+        <w:rPr>
+          <w:b/>
+        </w:rPr>
+        <w:t>Isolation Forest</w:t>
+      </w:r>
+      <w:r>
+        <w:t xml:space="preserve"> — fit on benign rows only, so class prior does not apply; its operating point is set by </w:t>
       </w:r>
       <w:r>
         <w:rPr>
           <w:rFonts w:ascii="Courier New" w:hAnsi="Courier New"/>
           <w:sz w:val="18"/>
         </w:rPr>
-        <w:t>bconsole</w:t>
-      </w:r>
-      <w:r>
-        <w:t xml:space="preserve"> ; </w:t>
+        <w:t>stage1_retain_recall</w:t>
+      </w:r>
+      <w:r>
+        <w:t>, not by resampling.</w:t>
+      </w:r>
+    </w:p>
+    <w:p>
+      <w:pPr>
+        <w:spacing w:before="0" w:after="120" w:lineRule="auto" w:line="360"/>
+      </w:pPr>
+      <w:r>
+        <w:t xml:space="preserve">Cost-sensitive weighting is preferred over SMOTE because the positive class is </w:t>
+      </w:r>
+      <w:r>
+        <w:rPr>
+          <w:i/>
+        </w:rPr>
+        <w:t>semantically diverse</w:t>
+      </w:r>
+      <w:r>
+        <w:t xml:space="preserve"> (reverse shells, download cradles, enumeration bursts), not merely under-sampled noise — synthesising interpolated "average attacks" would blur the very feature conjunctions the models depend on. The pipeline stays SMOTE-ready: any sampler lives inside an </w:t>
       </w:r>
       <w:r>
         <w:rPr>
           <w:rFonts w:ascii="Courier New" w:hAnsi="Courier New"/>
           <w:sz w:val="18"/>
         </w:rPr>
-        <w:t>apparmor_parser</w:t>
-      </w:r>
-      <w:r>
-        <w:t xml:space="preserve"> ; </w:t>
+        <w:t>imbalanced-learn</w:t>
+      </w:r>
+      <w:r>
+        <w:t xml:space="preserve"> </w:t>
       </w:r>
       <w:r>
         <w:rPr>
           <w:rFonts w:ascii="Courier New" w:hAnsi="Courier New"/>
           <w:sz w:val="18"/>
         </w:rPr>
-        <w:t>[ ! -z "$COMMAND" ] &amp;&amp; echo VERSIONSTART "$p" "$("${COMMAND%%[[:space:</w:t>
+        <w:t>Pipeline</w:t>
+      </w:r>
+      <w:r>
+        <w:t xml:space="preserve">, fit </w:t>
+      </w:r>
+      <w:r>
+        <w:rPr>
+          <w:b/>
+        </w:rPr>
+        <w:t>on the training fold only</w:t>
+      </w:r>
+      <w:r>
+        <w:t xml:space="preserve"> within each CV split and never on the test fold — the same leakage-safe contract that governs the scaler (Chapter 5.3).</w:t>
+      </w:r>
+    </w:p>
+    <w:p>
+      <w:pPr>
+        <w:pStyle w:val="Heading1"/>
+        <w:spacing w:before="200" w:after="80" w:lineRule="auto" w:line="276"/>
+      </w:pPr>
+      <w:r>
+        <w:t>Chapter 8.1 — Forensic error analysis (Ben's models)</w:t>
+      </w:r>
+    </w:p>
+    <w:p>
+      <w:pPr>
+        <w:spacing w:before="0" w:after="120" w:lineRule="auto" w:line="360"/>
+      </w:pPr>
+      <w:r>
+        <w:t xml:space="preserve">Confusion matrices: </w:t>
+      </w:r>
+      <w:r>
+        <w:rPr>
+          <w:rFonts w:ascii="Courier New" w:hAnsi="Courier New"/>
+          <w:sz w:val="18"/>
+        </w:rPr>
+        <w:t>report/figures/ch8_confusion_xgboost_hybrid_dataset1.png</w:t>
+      </w:r>
+      <w:r>
+        <w:t xml:space="preserve">, </w:t>
+      </w:r>
+      <w:r>
+        <w:rPr>
+          <w:rFonts w:ascii="Courier New" w:hAnsi="Courier New"/>
+          <w:sz w:val="18"/>
+        </w:rPr>
+        <w:t>report/figures/ch8_confusion_xgboost_hybrid_dataset2.png</w:t>
+      </w:r>
+      <w:r>
+        <w:t xml:space="preserve">, </w:t>
+      </w:r>
+      <w:r>
+        <w:rPr>
+          <w:rFonts w:ascii="Courier New" w:hAnsi="Courier New"/>
+          <w:sz w:val="18"/>
+        </w:rPr>
+        <w:t>report/figures/ch8_confusion_cnn1d_dataset1.png</w:t>
+      </w:r>
+      <w:r>
+        <w:t xml:space="preserve">, </w:t>
+      </w:r>
+      <w:r>
+        <w:rPr>
+          <w:rFonts w:ascii="Courier New" w:hAnsi="Courier New"/>
+          <w:sz w:val="18"/>
+        </w:rPr>
+        <w:t>report/figures/ch8_confusion_cnn1d_dataset2.png</w:t>
+      </w:r>
+      <w:r>
+        <w:t xml:space="preserve">. Sample-level FN/FP command strings (capped at 40 per cell): </w:t>
+      </w:r>
+      <w:r>
+        <w:rPr>
+          <w:rFonts w:ascii="Courier New" w:hAnsi="Courier New"/>
+          <w:sz w:val="18"/>
+        </w:rPr>
+        <w:t>results/ch8_failures.json</w:t>
+      </w:r>
+      <w:r>
+        <w:t xml:space="preserve">. The by-source counts below are over every error, from </w:t>
+      </w:r>
+      <w:r>
+        <w:rPr>
+          <w:rFonts w:ascii="Courier New" w:hAnsi="Courier New"/>
+          <w:sz w:val="18"/>
+        </w:rPr>
+        <w:t>results/ch8_confusion.json</w:t>
+      </w:r>
+      <w:r>
+        <w:t>.</w:t>
+      </w:r>
+    </w:p>
+    <w:p>
+      <w:pPr>
+        <w:pStyle w:val="Heading2"/>
+        <w:spacing w:before="120" w:after="80" w:lineRule="auto" w:line="276"/>
+      </w:pPr>
+      <w:r>
+        <w:t>xgboost_hybrid/dataset1</w:t>
       </w:r>
     </w:p>
     <w:p>
@@ -7286,43 +7593,7 @@
         <w:ind w:left="360"/>
       </w:pPr>
       <w:r>
-        <w:t xml:space="preserve">Example benign flagged (FP): </w:t>
-      </w:r>
-      <w:r>
-        <w:rPr>
-          <w:rFonts w:ascii="Courier New" w:hAnsi="Courier New"/>
-          <w:sz w:val="18"/>
-        </w:rPr>
-        <w:t>unset -f ls /bin/ls</w:t>
-      </w:r>
-      <w:r>
-        <w:t xml:space="preserve"> ; </w:t>
-      </w:r>
-      <w:r>
-        <w:rPr>
-          <w:rFonts w:ascii="Courier New" w:hAnsi="Courier New"/>
-          <w:sz w:val="18"/>
-        </w:rPr>
-        <w:t>zeroclaw cron add "* * * * *" "command"</w:t>
-      </w:r>
-      <w:r>
-        <w:t xml:space="preserve"> ; </w:t>
-      </w:r>
-      <w:r>
-        <w:rPr>
-          <w:rFonts w:ascii="Courier New" w:hAnsi="Courier New"/>
-          <w:sz w:val="18"/>
-        </w:rPr>
-        <w:t>fluent-bit -c /etc/fluent-bit/fluent-bit.conf</w:t>
-      </w:r>
-    </w:p>
-    <w:p>
-      <w:pPr>
-        <w:pStyle w:val="Heading2"/>
-        <w:spacing w:before="120" w:after="80" w:lineRule="auto" w:line="276"/>
-      </w:pPr>
-      <w:r>
-        <w:t>xgboost_hybrid/dataset2</w:t>
+        <w:t>Confusion [tn, fp, fn, tp] = [2192, 95, 94, 668]; F1 0.876, Recall 0.877, FPR 0.042.</w:t>
       </w:r>
     </w:p>
     <w:p>
@@ -7332,7 +7603,13 @@
         <w:ind w:left="360"/>
       </w:pPr>
       <w:r>
-        <w:t>Confusion [tn, fp, fn, tp] = [1365, 71, 74, 405]; F1 0.848, Recall 0.846, FPR 0.049.</w:t>
+        <w:rPr>
+          <w:b/>
+        </w:rPr>
+        <w:t>False negatives</w:t>
+      </w:r>
+      <w:r>
+        <w:t xml:space="preserve"> by source (all 94): {'hacktricks': 59, 'gtfobins': 19, 'atomic_red_team': 15, 'slp': 1}.</w:t>
       </w:r>
     </w:p>
     <w:p>
@@ -7345,10 +7622,10 @@
         <w:rPr>
           <w:b/>
         </w:rPr>
-        <w:t>False negatives</w:t>
-      </w:r>
-      <w:r>
-        <w:t xml:space="preserve"> by source (all 74): {'honeypot': 74}.</w:t>
+        <w:t>False positives</w:t>
+      </w:r>
+      <w:r>
+        <w:t xml:space="preserve"> by source (all 95): {'tldr': 29, 'nl2bash': 28, 'linlm': 21, 'bash6k': 14, 'bash_instruct': 3}.</w:t>
       </w:r>
     </w:p>
     <w:p>
@@ -7358,13 +7635,34 @@
         <w:ind w:left="360"/>
       </w:pPr>
       <w:r>
+        <w:t xml:space="preserve">Example missed attacks (FN): </w:t>
+      </w:r>
+      <w:r>
         <w:rPr>
-          <w:b/>
+          <w:rFonts w:ascii="Courier New" w:hAnsi="Courier New"/>
+          <w:sz w:val="18"/>
         </w:rPr>
-        <w:t>False positives</w:t>
-      </w:r>
-      <w:r>
-        <w:t xml:space="preserve"> by source (all 71): {'bash_history': 58, 'commandlinefu': 13}.</w:t>
+        <w:t>bconsole</w:t>
+      </w:r>
+      <w:r>
+        <w:t xml:space="preserve"> ; </w:t>
+      </w:r>
+      <w:r>
+        <w:rPr>
+          <w:rFonts w:ascii="Courier New" w:hAnsi="Courier New"/>
+          <w:sz w:val="18"/>
+        </w:rPr>
+        <w:t>apparmor_parser</w:t>
+      </w:r>
+      <w:r>
+        <w:t xml:space="preserve"> ; </w:t>
+      </w:r>
+      <w:r>
+        <w:rPr>
+          <w:rFonts w:ascii="Courier New" w:hAnsi="Courier New"/>
+          <w:sz w:val="18"/>
+        </w:rPr>
+        <w:t>[ ! -z "$COMMAND" ] &amp;&amp; echo VERSIONSTART "$p" "$("${COMMAND%%[[:space:</w:t>
       </w:r>
     </w:p>
     <w:p>
@@ -7374,14 +7672,14 @@
         <w:ind w:left="360"/>
       </w:pPr>
       <w:r>
-        <w:t xml:space="preserve">Example missed attacks (FN): </w:t>
+        <w:t xml:space="preserve">Example benign flagged (FP): </w:t>
       </w:r>
       <w:r>
         <w:rPr>
           <w:rFonts w:ascii="Courier New" w:hAnsi="Courier New"/>
           <w:sz w:val="18"/>
         </w:rPr>
-        <w:t>nano u.txt</w:t>
+        <w:t>unset -f ls /bin/ls</w:t>
       </w:r>
       <w:r>
         <w:t xml:space="preserve"> ; </w:t>
@@ -7391,7 +7689,7 @@
           <w:rFonts w:ascii="Courier New" w:hAnsi="Courier New"/>
           <w:sz w:val="18"/>
         </w:rPr>
-        <w:t>31m&gt;&gt;&gt;&gt; Server Gasit incepem Testele \033[1</w:t>
+        <w:t>zeroclaw cron add "* * * * *" "command"</w:t>
       </w:r>
       <w:r>
         <w:t xml:space="preserve"> ; </w:t>
@@ -7401,7 +7699,16 @@
           <w:rFonts w:ascii="Courier New" w:hAnsi="Courier New"/>
           <w:sz w:val="18"/>
         </w:rPr>
-        <w:t>/gisdfoewrsfdf</w:t>
+        <w:t>fluent-bit -c /etc/fluent-bit/fluent-bit.conf</w:t>
+      </w:r>
+    </w:p>
+    <w:p>
+      <w:pPr>
+        <w:pStyle w:val="Heading2"/>
+        <w:spacing w:before="120" w:after="80" w:lineRule="auto" w:line="276"/>
+      </w:pPr>
+      <w:r>
+        <w:t>xgboost_hybrid/dataset2</w:t>
       </w:r>
     </w:p>
     <w:p>
@@ -7411,43 +7718,7 @@
         <w:ind w:left="360"/>
       </w:pPr>
       <w:r>
-        <w:t xml:space="preserve">Example benign flagged (FP): </w:t>
-      </w:r>
-      <w:r>
-        <w:rPr>
-          <w:rFonts w:ascii="Courier New" w:hAnsi="Courier New"/>
-          <w:sz w:val="18"/>
-        </w:rPr>
-        <w:t>Zsh</w:t>
-      </w:r>
-      <w:r>
-        <w:t xml:space="preserve"> ; </w:t>
-      </w:r>
-      <w:r>
-        <w:rPr>
-          <w:rFonts w:ascii="Courier New" w:hAnsi="Courier New"/>
-          <w:sz w:val="18"/>
-        </w:rPr>
-        <w:t>tar -zxvf 'download (1)'</w:t>
-      </w:r>
-      <w:r>
-        <w:t xml:space="preserve"> ; </w:t>
-      </w:r>
-      <w:r>
-        <w:rPr>
-          <w:rFonts w:ascii="Courier New" w:hAnsi="Courier New"/>
-          <w:sz w:val="18"/>
-        </w:rPr>
-        <w:t>cat i3log* 2&gt; /dev/null | tail</w:t>
-      </w:r>
-    </w:p>
-    <w:p>
-      <w:pPr>
-        <w:pStyle w:val="Heading2"/>
-        <w:spacing w:before="120" w:after="80" w:lineRule="auto" w:line="276"/>
-      </w:pPr>
-      <w:r>
-        <w:t>cnn1d/dataset1</w:t>
+        <w:t>Confusion [tn, fp, fn, tp] = [1365, 71, 74, 405]; F1 0.848, Recall 0.846, FPR 0.049.</w:t>
       </w:r>
     </w:p>
     <w:p>
@@ -7457,7 +7728,13 @@
         <w:ind w:left="360"/>
       </w:pPr>
       <w:r>
-        <w:t>Confusion [tn, fp, fn, tp] = [2160, 127, 91, 671]; F1 0.860, Recall 0.881, FPR 0.056.</w:t>
+        <w:rPr>
+          <w:b/>
+        </w:rPr>
+        <w:t>False negatives</w:t>
+      </w:r>
+      <w:r>
+        <w:t xml:space="preserve"> by source (all 74): {'honeypot': 74}.</w:t>
       </w:r>
     </w:p>
     <w:p>
@@ -7470,10 +7747,10 @@
         <w:rPr>
           <w:b/>
         </w:rPr>
-        <w:t>False negatives</w:t>
-      </w:r>
-      <w:r>
-        <w:t xml:space="preserve"> by source (all 91): {'hacktricks': 51, 'gtfobins': 22, 'atomic_red_team': 16, 'slp': 2}.</w:t>
+        <w:t>False positives</w:t>
+      </w:r>
+      <w:r>
+        <w:t xml:space="preserve"> by source (all 71): {'bash_history': 58, 'commandlinefu': 13}.</w:t>
       </w:r>
     </w:p>
     <w:p>
@@ -7483,13 +7760,34 @@
         <w:ind w:left="360"/>
       </w:pPr>
       <w:r>
+        <w:t xml:space="preserve">Example missed attacks (FN): </w:t>
+      </w:r>
+      <w:r>
         <w:rPr>
-          <w:b/>
+          <w:rFonts w:ascii="Courier New" w:hAnsi="Courier New"/>
+          <w:sz w:val="18"/>
         </w:rPr>
-        <w:t>False positives</w:t>
-      </w:r>
-      <w:r>
-        <w:t xml:space="preserve"> by source (all 127): {'tldr': 39, 'nl2bash': 37, 'linlm': 32, 'bash6k': 15, 'bash_instruct': 4}.</w:t>
+        <w:t>nano u.txt</w:t>
+      </w:r>
+      <w:r>
+        <w:t xml:space="preserve"> ; </w:t>
+      </w:r>
+      <w:r>
+        <w:rPr>
+          <w:rFonts w:ascii="Courier New" w:hAnsi="Courier New"/>
+          <w:sz w:val="18"/>
+        </w:rPr>
+        <w:t>31m&gt;&gt;&gt;&gt; Server Gasit incepem Testele \033[1</w:t>
+      </w:r>
+      <w:r>
+        <w:t xml:space="preserve"> ; </w:t>
+      </w:r>
+      <w:r>
+        <w:rPr>
+          <w:rFonts w:ascii="Courier New" w:hAnsi="Courier New"/>
+          <w:sz w:val="18"/>
+        </w:rPr>
+        <w:t>/gisdfoewrsfdf</w:t>
       </w:r>
     </w:p>
     <w:p>
@@ -7499,168 +7797,6 @@
         <w:ind w:left="360"/>
       </w:pPr>
       <w:r>
-        <w:t xml:space="preserve">Example missed attacks (FN): </w:t>
-      </w:r>
-      <w:r>
-        <w:rPr>
-          <w:rFonts w:ascii="Courier New" w:hAnsi="Courier New"/>
-          <w:sz w:val="18"/>
-        </w:rPr>
-        <w:t>bconsole</w:t>
-      </w:r>
-      <w:r>
-        <w:t xml:space="preserve"> ; </w:t>
-      </w:r>
-      <w:r>
-        <w:rPr>
-          <w:rFonts w:ascii="Courier New" w:hAnsi="Courier New"/>
-          <w:sz w:val="18"/>
-        </w:rPr>
-        <w:t>apparmor_parser</w:t>
-      </w:r>
-      <w:r>
-        <w:t xml:space="preserve"> ; </w:t>
-      </w:r>
-      <w:r>
-        <w:rPr>
-          <w:rFonts w:ascii="Courier New" w:hAnsi="Courier New"/>
-          <w:sz w:val="18"/>
-        </w:rPr>
-        <w:t>yarn --cwd .</w:t>
-      </w:r>
-    </w:p>
-    <w:p>
-      <w:pPr>
-        <w:pStyle w:val="ListBullet"/>
-        <w:spacing w:before="20" w:after="20" w:lineRule="auto" w:line="360"/>
-        <w:ind w:left="360"/>
-      </w:pPr>
-      <w:r>
-        <w:t xml:space="preserve">Example benign flagged (FP): </w:t>
-      </w:r>
-      <w:r>
-        <w:rPr>
-          <w:rFonts w:ascii="Courier New" w:hAnsi="Courier New"/>
-          <w:sz w:val="18"/>
-        </w:rPr>
-        <w:t>unset -f ls /bin/ls</w:t>
-      </w:r>
-      <w:r>
-        <w:t xml:space="preserve"> ; </w:t>
-      </w:r>
-      <w:r>
-        <w:rPr>
-          <w:rFonts w:ascii="Courier New" w:hAnsi="Courier New"/>
-          <w:sz w:val="18"/>
-        </w:rPr>
-        <w:t>echo "{:key 'val}" | bb -I "(:key (first *input*))"</w:t>
-      </w:r>
-      <w:r>
-        <w:t xml:space="preserve"> ; </w:t>
-      </w:r>
-      <w:r>
-        <w:rPr>
-          <w:rFonts w:ascii="Courier New" w:hAnsi="Courier New"/>
-          <w:sz w:val="18"/>
-        </w:rPr>
-        <w:t>docker run -e VAR=value nginx</w:t>
-      </w:r>
-    </w:p>
-    <w:p>
-      <w:pPr>
-        <w:pStyle w:val="Heading2"/>
-        <w:spacing w:before="120" w:after="80" w:lineRule="auto" w:line="276"/>
-      </w:pPr>
-      <w:r>
-        <w:t>cnn1d/dataset2</w:t>
-      </w:r>
-    </w:p>
-    <w:p>
-      <w:pPr>
-        <w:pStyle w:val="ListBullet"/>
-        <w:spacing w:before="20" w:after="20" w:lineRule="auto" w:line="360"/>
-        <w:ind w:left="360"/>
-      </w:pPr>
-      <w:r>
-        <w:t>Confusion [tn, fp, fn, tp] = [1340, 96, 64, 415]; F1 0.838, Recall 0.866, FPR 0.067.</w:t>
-      </w:r>
-    </w:p>
-    <w:p>
-      <w:pPr>
-        <w:pStyle w:val="ListBullet"/>
-        <w:spacing w:before="20" w:after="20" w:lineRule="auto" w:line="360"/>
-        <w:ind w:left="360"/>
-      </w:pPr>
-      <w:r>
-        <w:rPr>
-          <w:b/>
-        </w:rPr>
-        <w:t>False negatives</w:t>
-      </w:r>
-      <w:r>
-        <w:t xml:space="preserve"> by source (all 64): {'honeypot': 64}.</w:t>
-      </w:r>
-    </w:p>
-    <w:p>
-      <w:pPr>
-        <w:pStyle w:val="ListBullet"/>
-        <w:spacing w:before="20" w:after="20" w:lineRule="auto" w:line="360"/>
-        <w:ind w:left="360"/>
-      </w:pPr>
-      <w:r>
-        <w:rPr>
-          <w:b/>
-        </w:rPr>
-        <w:t>False positives</w:t>
-      </w:r>
-      <w:r>
-        <w:t xml:space="preserve"> by source (all 96): {'bash_history': 72, 'commandlinefu': 24}.</w:t>
-      </w:r>
-    </w:p>
-    <w:p>
-      <w:pPr>
-        <w:pStyle w:val="ListBullet"/>
-        <w:spacing w:before="20" w:after="20" w:lineRule="auto" w:line="360"/>
-        <w:ind w:left="360"/>
-      </w:pPr>
-      <w:r>
-        <w:t xml:space="preserve">Example missed attacks (FN): </w:t>
-      </w:r>
-      <w:r>
-        <w:rPr>
-          <w:rFonts w:ascii="Courier New" w:hAnsi="Courier New"/>
-          <w:sz w:val="18"/>
-        </w:rPr>
-        <w:t>nano u.txt</w:t>
-      </w:r>
-      <w:r>
-        <w:t xml:space="preserve"> ; </w:t>
-      </w:r>
-      <w:r>
-        <w:rPr>
-          <w:rFonts w:ascii="Courier New" w:hAnsi="Courier New"/>
-          <w:sz w:val="18"/>
-        </w:rPr>
-        <w:t>31m&gt;&gt;&gt;&gt; Server Gasit incepem Testele \033[1</w:t>
-      </w:r>
-      <w:r>
-        <w:t xml:space="preserve"> ; </w:t>
-      </w:r>
-      <w:r>
-        <w:rPr>
-          <w:rFonts w:ascii="Courier New" w:hAnsi="Courier New"/>
-          <w:sz w:val="18"/>
-        </w:rPr>
-        <w:t>/gisdfoewrsfdf</w:t>
-      </w:r>
-    </w:p>
-    <w:p>
-      <w:pPr>
-        <w:pStyle w:val="ListBullet"/>
-        <w:spacing w:before="20" w:after="20" w:lineRule="auto" w:line="360"/>
-        <w:ind w:left="360"/>
-      </w:pPr>
-      <w:r>
         <w:t xml:space="preserve">Example benign flagged (FP): </w:t>
       </w:r>
       <w:r>
@@ -7678,7 +7814,7 @@
           <w:rFonts w:ascii="Courier New" w:hAnsi="Courier New"/>
           <w:sz w:val="18"/>
         </w:rPr>
-        <w:t>dpigs</w:t>
+        <w:t>tar -zxvf 'download (1)'</w:t>
       </w:r>
       <w:r>
         <w:t xml:space="preserve"> ; </w:t>
@@ -7688,21 +7824,7 @@
           <w:rFonts w:ascii="Courier New" w:hAnsi="Courier New"/>
           <w:sz w:val="18"/>
         </w:rPr>
-        <w:t>cp ~/.functions bash/</w:t>
-      </w:r>
-    </w:p>
-    <w:p>
-      <w:pPr>
-        <w:spacing w:before="0" w:after="120" w:lineRule="auto" w:line="360"/>
-      </w:pPr>
-      <w:r>
-        <w:rPr>
-          <w:b/>
-        </w:rPr>
-        <w:t>Cross-model contrast to write up:</w:t>
-      </w:r>
-      <w:r>
-        <w:t xml:space="preserve"> compare which commands XGBoost misses that the CNN catches and vice-versa — the CNN reads raw char motifs (catches obfuscated/adjacent payloads), XGBoost reads engineered conjunctions (catches family co-occurrence). The disagreement set is exactly what the cascade (8.4) and the LLM triage (bonus) are designed to resolve.</w:t>
+        <w:t>cat i3log* 2&gt; /dev/null | tail</w:t>
       </w:r>
     </w:p>
     <w:p>

</xml_diff>

<commit_message>
Report: relocate Ch8.1 forensics + Ch8.4 cascade detail to Appendix C (body ~15p, appendix ~4p); content-keyed table captions
Co-Authored-By: Claude Opus 4.8 <noreply@anthropic.com>
</commit_message>
<xml_diff>
--- a/Group_209361864_315005066_Report.docx
+++ b/Group_209361864_315005066_Report.docx
@@ -7506,333 +7506,6 @@
         <w:spacing w:before="200" w:after="80" w:lineRule="auto" w:line="276"/>
       </w:pPr>
       <w:r>
-        <w:t>Chapter 8.1 — Forensic error analysis (Ben's models)</w:t>
-      </w:r>
-    </w:p>
-    <w:p>
-      <w:pPr>
-        <w:spacing w:before="0" w:after="120" w:lineRule="auto" w:line="360"/>
-      </w:pPr>
-      <w:r>
-        <w:t xml:space="preserve">Confusion matrices: </w:t>
-      </w:r>
-      <w:r>
-        <w:rPr>
-          <w:rFonts w:ascii="Courier New" w:hAnsi="Courier New"/>
-          <w:sz w:val="18"/>
-        </w:rPr>
-        <w:t>report/figures/ch8_confusion_xgboost_hybrid_dataset1.png</w:t>
-      </w:r>
-      <w:r>
-        <w:t xml:space="preserve">, </w:t>
-      </w:r>
-      <w:r>
-        <w:rPr>
-          <w:rFonts w:ascii="Courier New" w:hAnsi="Courier New"/>
-          <w:sz w:val="18"/>
-        </w:rPr>
-        <w:t>report/figures/ch8_confusion_xgboost_hybrid_dataset2.png</w:t>
-      </w:r>
-      <w:r>
-        <w:t xml:space="preserve">, </w:t>
-      </w:r>
-      <w:r>
-        <w:rPr>
-          <w:rFonts w:ascii="Courier New" w:hAnsi="Courier New"/>
-          <w:sz w:val="18"/>
-        </w:rPr>
-        <w:t>report/figures/ch8_confusion_cnn1d_dataset1.png</w:t>
-      </w:r>
-      <w:r>
-        <w:t xml:space="preserve">, </w:t>
-      </w:r>
-      <w:r>
-        <w:rPr>
-          <w:rFonts w:ascii="Courier New" w:hAnsi="Courier New"/>
-          <w:sz w:val="18"/>
-        </w:rPr>
-        <w:t>report/figures/ch8_confusion_cnn1d_dataset2.png</w:t>
-      </w:r>
-      <w:r>
-        <w:t xml:space="preserve">. Sample-level FN/FP command strings (capped at 40 per cell): </w:t>
-      </w:r>
-      <w:r>
-        <w:rPr>
-          <w:rFonts w:ascii="Courier New" w:hAnsi="Courier New"/>
-          <w:sz w:val="18"/>
-        </w:rPr>
-        <w:t>results/ch8_failures.json</w:t>
-      </w:r>
-      <w:r>
-        <w:t xml:space="preserve">. The by-source counts below are over every error, from </w:t>
-      </w:r>
-      <w:r>
-        <w:rPr>
-          <w:rFonts w:ascii="Courier New" w:hAnsi="Courier New"/>
-          <w:sz w:val="18"/>
-        </w:rPr>
-        <w:t>results/ch8_confusion.json</w:t>
-      </w:r>
-      <w:r>
-        <w:t>.</w:t>
-      </w:r>
-    </w:p>
-    <w:p>
-      <w:pPr>
-        <w:pStyle w:val="Heading2"/>
-        <w:spacing w:before="120" w:after="80" w:lineRule="auto" w:line="276"/>
-      </w:pPr>
-      <w:r>
-        <w:t>xgboost_hybrid/dataset1</w:t>
-      </w:r>
-    </w:p>
-    <w:p>
-      <w:pPr>
-        <w:pStyle w:val="ListBullet"/>
-        <w:spacing w:before="20" w:after="20" w:lineRule="auto" w:line="360"/>
-        <w:ind w:left="360"/>
-      </w:pPr>
-      <w:r>
-        <w:t>Confusion [tn, fp, fn, tp] = [2192, 95, 94, 668]; F1 0.876, Recall 0.877, FPR 0.042.</w:t>
-      </w:r>
-    </w:p>
-    <w:p>
-      <w:pPr>
-        <w:pStyle w:val="ListBullet"/>
-        <w:spacing w:before="20" w:after="20" w:lineRule="auto" w:line="360"/>
-        <w:ind w:left="360"/>
-      </w:pPr>
-      <w:r>
-        <w:rPr>
-          <w:b/>
-        </w:rPr>
-        <w:t>False negatives</w:t>
-      </w:r>
-      <w:r>
-        <w:t xml:space="preserve"> by source (all 94): {'hacktricks': 59, 'gtfobins': 19, 'atomic_red_team': 15, 'slp': 1}.</w:t>
-      </w:r>
-    </w:p>
-    <w:p>
-      <w:pPr>
-        <w:pStyle w:val="ListBullet"/>
-        <w:spacing w:before="20" w:after="20" w:lineRule="auto" w:line="360"/>
-        <w:ind w:left="360"/>
-      </w:pPr>
-      <w:r>
-        <w:rPr>
-          <w:b/>
-        </w:rPr>
-        <w:t>False positives</w:t>
-      </w:r>
-      <w:r>
-        <w:t xml:space="preserve"> by source (all 95): {'tldr': 29, 'nl2bash': 28, 'linlm': 21, 'bash6k': 14, 'bash_instruct': 3}.</w:t>
-      </w:r>
-    </w:p>
-    <w:p>
-      <w:pPr>
-        <w:pStyle w:val="ListBullet"/>
-        <w:spacing w:before="20" w:after="20" w:lineRule="auto" w:line="360"/>
-        <w:ind w:left="360"/>
-      </w:pPr>
-      <w:r>
-        <w:t xml:space="preserve">Example missed attacks (FN): </w:t>
-      </w:r>
-      <w:r>
-        <w:rPr>
-          <w:rFonts w:ascii="Courier New" w:hAnsi="Courier New"/>
-          <w:sz w:val="18"/>
-        </w:rPr>
-        <w:t>bconsole</w:t>
-      </w:r>
-      <w:r>
-        <w:t xml:space="preserve"> ; </w:t>
-      </w:r>
-      <w:r>
-        <w:rPr>
-          <w:rFonts w:ascii="Courier New" w:hAnsi="Courier New"/>
-          <w:sz w:val="18"/>
-        </w:rPr>
-        <w:t>apparmor_parser</w:t>
-      </w:r>
-      <w:r>
-        <w:t xml:space="preserve"> ; </w:t>
-      </w:r>
-      <w:r>
-        <w:rPr>
-          <w:rFonts w:ascii="Courier New" w:hAnsi="Courier New"/>
-          <w:sz w:val="18"/>
-        </w:rPr>
-        <w:t>[ ! -z "$COMMAND" ] &amp;&amp; echo VERSIONSTART "$p" "$("${COMMAND%%[[:space:</w:t>
-      </w:r>
-    </w:p>
-    <w:p>
-      <w:pPr>
-        <w:pStyle w:val="ListBullet"/>
-        <w:spacing w:before="20" w:after="20" w:lineRule="auto" w:line="360"/>
-        <w:ind w:left="360"/>
-      </w:pPr>
-      <w:r>
-        <w:t xml:space="preserve">Example benign flagged (FP): </w:t>
-      </w:r>
-      <w:r>
-        <w:rPr>
-          <w:rFonts w:ascii="Courier New" w:hAnsi="Courier New"/>
-          <w:sz w:val="18"/>
-        </w:rPr>
-        <w:t>unset -f ls /bin/ls</w:t>
-      </w:r>
-      <w:r>
-        <w:t xml:space="preserve"> ; </w:t>
-      </w:r>
-      <w:r>
-        <w:rPr>
-          <w:rFonts w:ascii="Courier New" w:hAnsi="Courier New"/>
-          <w:sz w:val="18"/>
-        </w:rPr>
-        <w:t>zeroclaw cron add "* * * * *" "command"</w:t>
-      </w:r>
-      <w:r>
-        <w:t xml:space="preserve"> ; </w:t>
-      </w:r>
-      <w:r>
-        <w:rPr>
-          <w:rFonts w:ascii="Courier New" w:hAnsi="Courier New"/>
-          <w:sz w:val="18"/>
-        </w:rPr>
-        <w:t>fluent-bit -c /etc/fluent-bit/fluent-bit.conf</w:t>
-      </w:r>
-    </w:p>
-    <w:p>
-      <w:pPr>
-        <w:pStyle w:val="Heading2"/>
-        <w:spacing w:before="120" w:after="80" w:lineRule="auto" w:line="276"/>
-      </w:pPr>
-      <w:r>
-        <w:t>xgboost_hybrid/dataset2</w:t>
-      </w:r>
-    </w:p>
-    <w:p>
-      <w:pPr>
-        <w:pStyle w:val="ListBullet"/>
-        <w:spacing w:before="20" w:after="20" w:lineRule="auto" w:line="360"/>
-        <w:ind w:left="360"/>
-      </w:pPr>
-      <w:r>
-        <w:t>Confusion [tn, fp, fn, tp] = [1365, 71, 74, 405]; F1 0.848, Recall 0.846, FPR 0.049.</w:t>
-      </w:r>
-    </w:p>
-    <w:p>
-      <w:pPr>
-        <w:pStyle w:val="ListBullet"/>
-        <w:spacing w:before="20" w:after="20" w:lineRule="auto" w:line="360"/>
-        <w:ind w:left="360"/>
-      </w:pPr>
-      <w:r>
-        <w:rPr>
-          <w:b/>
-        </w:rPr>
-        <w:t>False negatives</w:t>
-      </w:r>
-      <w:r>
-        <w:t xml:space="preserve"> by source (all 74): {'honeypot': 74}.</w:t>
-      </w:r>
-    </w:p>
-    <w:p>
-      <w:pPr>
-        <w:pStyle w:val="ListBullet"/>
-        <w:spacing w:before="20" w:after="20" w:lineRule="auto" w:line="360"/>
-        <w:ind w:left="360"/>
-      </w:pPr>
-      <w:r>
-        <w:rPr>
-          <w:b/>
-        </w:rPr>
-        <w:t>False positives</w:t>
-      </w:r>
-      <w:r>
-        <w:t xml:space="preserve"> by source (all 71): {'bash_history': 58, 'commandlinefu': 13}.</w:t>
-      </w:r>
-    </w:p>
-    <w:p>
-      <w:pPr>
-        <w:pStyle w:val="ListBullet"/>
-        <w:spacing w:before="20" w:after="20" w:lineRule="auto" w:line="360"/>
-        <w:ind w:left="360"/>
-      </w:pPr>
-      <w:r>
-        <w:t xml:space="preserve">Example missed attacks (FN): </w:t>
-      </w:r>
-      <w:r>
-        <w:rPr>
-          <w:rFonts w:ascii="Courier New" w:hAnsi="Courier New"/>
-          <w:sz w:val="18"/>
-        </w:rPr>
-        <w:t>nano u.txt</w:t>
-      </w:r>
-      <w:r>
-        <w:t xml:space="preserve"> ; </w:t>
-      </w:r>
-      <w:r>
-        <w:rPr>
-          <w:rFonts w:ascii="Courier New" w:hAnsi="Courier New"/>
-          <w:sz w:val="18"/>
-        </w:rPr>
-        <w:t>31m&gt;&gt;&gt;&gt; Server Gasit incepem Testele \033[1</w:t>
-      </w:r>
-      <w:r>
-        <w:t xml:space="preserve"> ; </w:t>
-      </w:r>
-      <w:r>
-        <w:rPr>
-          <w:rFonts w:ascii="Courier New" w:hAnsi="Courier New"/>
-          <w:sz w:val="18"/>
-        </w:rPr>
-        <w:t>/gisdfoewrsfdf</w:t>
-      </w:r>
-    </w:p>
-    <w:p>
-      <w:pPr>
-        <w:pStyle w:val="ListBullet"/>
-        <w:spacing w:before="20" w:after="20" w:lineRule="auto" w:line="360"/>
-        <w:ind w:left="360"/>
-      </w:pPr>
-      <w:r>
-        <w:t xml:space="preserve">Example benign flagged (FP): </w:t>
-      </w:r>
-      <w:r>
-        <w:rPr>
-          <w:rFonts w:ascii="Courier New" w:hAnsi="Courier New"/>
-          <w:sz w:val="18"/>
-        </w:rPr>
-        <w:t>Zsh</w:t>
-      </w:r>
-      <w:r>
-        <w:t xml:space="preserve"> ; </w:t>
-      </w:r>
-      <w:r>
-        <w:rPr>
-          <w:rFonts w:ascii="Courier New" w:hAnsi="Courier New"/>
-          <w:sz w:val="18"/>
-        </w:rPr>
-        <w:t>tar -zxvf 'download (1)'</w:t>
-      </w:r>
-      <w:r>
-        <w:t xml:space="preserve"> ; </w:t>
-      </w:r>
-      <w:r>
-        <w:rPr>
-          <w:rFonts w:ascii="Courier New" w:hAnsi="Courier New"/>
-          <w:sz w:val="18"/>
-        </w:rPr>
-        <w:t>cat i3log* 2&gt; /dev/null | tail</w:t>
-      </w:r>
-    </w:p>
-    <w:p>
-      <w:pPr>
-        <w:pStyle w:val="Heading1"/>
-        <w:spacing w:before="200" w:after="80" w:lineRule="auto" w:line="276"/>
-      </w:pPr>
-      <w:r>
         <w:t>Chapter 8.2 — Cross-dataset variance (all 5 registry models)</w:t>
       </w:r>
     </w:p>
@@ -12736,180 +12409,11 @@
     </w:p>
     <w:p>
       <w:pPr>
-        <w:pStyle w:val="Heading1"/>
-        <w:spacing w:before="200" w:after="80" w:lineRule="auto" w:line="276"/>
-      </w:pPr>
-      <w:r>
-        <w:t>Chapter 8.4 — The hybrid behavioural cascade: does the architecture earn its complexity?</w:t>
-      </w:r>
-    </w:p>
-    <w:p>
-      <w:pPr>
-        <w:spacing w:before="40" w:after="40" w:lineRule="auto" w:line="360"/>
-        <w:ind w:left="432"/>
-      </w:pPr>
-      <w:r>
-        <w:rPr>
-          <w:rFonts w:ascii="Courier New" w:hAnsi="Courier New"/>
-          <w:i/>
-          <w:sz w:val="18"/>
-        </w:rPr>
-        <w:t>report/ch8_4_cascade_findings.md</w:t>
-      </w:r>
-      <w:r>
-        <w:rPr>
-          <w:i/>
-        </w:rPr>
-        <w:t xml:space="preserve"> is generated by </w:t>
-      </w:r>
-      <w:r>
-        <w:rPr>
-          <w:rFonts w:ascii="Courier New" w:hAnsi="Courier New"/>
-          <w:i/>
-          <w:sz w:val="18"/>
-        </w:rPr>
-        <w:t>analysis/ch8_4_cascade.py</w:t>
-      </w:r>
-    </w:p>
-    <w:p>
-      <w:pPr>
-        <w:spacing w:before="40" w:after="40" w:lineRule="auto" w:line="360"/>
-        <w:ind w:left="432"/>
-      </w:pPr>
-      <w:r>
-        <w:rPr>
-          <w:i/>
-        </w:rPr>
-        <w:t xml:space="preserve">and reports what the cascade </w:t>
-      </w:r>
-      <w:r>
-        <w:rPr>
-          <w:i/>
-        </w:rPr>
-        <w:t>scores</w:t>
-      </w:r>
-      <w:r>
-        <w:rPr>
-          <w:i/>
-        </w:rPr>
-        <w:t>. This chapter reports what each stage</w:t>
-      </w:r>
-    </w:p>
-    <w:p>
-      <w:pPr>
-        <w:spacing w:before="40" w:after="40" w:lineRule="auto" w:line="360"/>
-        <w:ind w:left="432"/>
-      </w:pPr>
-      <w:r>
-        <w:rPr>
-          <w:i/>
-        </w:rPr>
-        <w:t>does</w:t>
-      </w:r>
-      <w:r>
-        <w:rPr>
-          <w:i/>
-        </w:rPr>
-        <w:t xml:space="preserve">, using the per-stage audit in </w:t>
-      </w:r>
-      <w:r>
-        <w:rPr>
-          <w:rFonts w:ascii="Courier New" w:hAnsi="Courier New"/>
-          <w:i/>
-          <w:sz w:val="18"/>
-        </w:rPr>
-        <w:t>analysis/ch8_4_cascade_forensics.py</w:t>
-      </w:r>
-    </w:p>
-    <w:p>
-      <w:pPr>
-        <w:spacing w:before="40" w:after="40" w:lineRule="auto" w:line="360"/>
-        <w:ind w:left="432"/>
-      </w:pPr>
-      <w:r>
-        <w:rPr>
-          <w:i/>
-        </w:rPr>
-        <w:t>(</w:t>
-      </w:r>
-      <w:r>
-        <w:rPr>
-          <w:rFonts w:ascii="Courier New" w:hAnsi="Courier New"/>
-          <w:i/>
-          <w:sz w:val="18"/>
-        </w:rPr>
-        <w:t>results/ch8_4_cascade_forensics.json</w:t>
-      </w:r>
-      <w:r>
-        <w:rPr>
-          <w:i/>
-        </w:rPr>
-        <w:t>), which fits the two component models</w:t>
-      </w:r>
-    </w:p>
-    <w:p>
-      <w:pPr>
-        <w:spacing w:before="40" w:after="40" w:lineRule="auto" w:line="360"/>
-        <w:ind w:left="432"/>
-      </w:pPr>
-      <w:r>
-        <w:rPr>
-          <w:i/>
-        </w:rPr>
-        <w:t>once and then derives every routing variant from the cached stage-1 anomaly</w:t>
-      </w:r>
-    </w:p>
-    <w:p>
-      <w:pPr>
-        <w:spacing w:before="40" w:after="40" w:lineRule="auto" w:line="360"/>
-        <w:ind w:left="432"/>
-      </w:pPr>
-      <w:r>
-        <w:rPr>
-          <w:i/>
-        </w:rPr>
-        <w:t>scores and stage-2 probabilities. The routing rule is deterministic given</w:t>
-      </w:r>
-    </w:p>
-    <w:p>
-      <w:pPr>
-        <w:spacing w:before="40" w:after="40" w:lineRule="auto" w:line="360"/>
-        <w:ind w:left="432"/>
-      </w:pPr>
-      <w:r>
-        <w:rPr>
-          <w:i/>
-        </w:rPr>
-        <w:t>those two arrays, so the ablations below are exact reproductions of</w:t>
-      </w:r>
-    </w:p>
-    <w:p>
-      <w:pPr>
-        <w:spacing w:before="40" w:after="40" w:lineRule="auto" w:line="360"/>
-        <w:ind w:left="432"/>
-      </w:pPr>
-      <w:r>
-        <w:rPr>
-          <w:rFonts w:ascii="Courier New" w:hAnsi="Courier New"/>
-          <w:i/>
-          <w:sz w:val="18"/>
-        </w:rPr>
-        <w:t>CascadeDetector.predict_with_trace</w:t>
-      </w:r>
-      <w:r>
-        <w:rPr>
-          <w:i/>
-        </w:rPr>
-        <w:t>, not re-runs with different seeds.</w:t>
-      </w:r>
-    </w:p>
-    <w:p>
-      <w:pPr>
         <w:pStyle w:val="Heading2"/>
         <w:spacing w:before="120" w:after="80" w:lineRule="auto" w:line="276"/>
       </w:pPr>
       <w:r>
-        <w:t>The verdict first</w:t>
+        <w:t>8.1 Forensic error analysis and 8.4 Hybrid cascade — see Appendix C</w:t>
       </w:r>
     </w:p>
     <w:p>
@@ -12917,1398 +12421,26 @@
         <w:spacing w:before="0" w:after="120" w:lineRule="auto" w:line="360"/>
       </w:pPr>
       <w:r>
-        <w:t>The cascade is the architecture the assignment recommends: a cheap unsupervised filter clears obvious benign traffic, a supervised model classifies the rest, and an LLM arbitrates the residue. We built it, measured it, and it does not work — not marginally, and not for the reason we expected.</w:t>
-      </w:r>
-    </w:p>
-    <w:tbl>
-      <w:tblPr>
-        <w:tblStyle w:val="TableGrid"/>
-        <w:tblW w:type="auto" w:w="0"/>
-        <w:tblLook w:firstColumn="1" w:firstRow="1" w:lastColumn="0" w:lastRow="0" w:noHBand="0" w:noVBand="1" w:val="04A0"/>
-      </w:tblPr>
-      <w:tblGrid>
-        <w:gridCol w:w="1512"/>
-        <w:gridCol w:w="1512"/>
-        <w:gridCol w:w="1512"/>
-        <w:gridCol w:w="1512"/>
-        <w:gridCol w:w="1512"/>
-        <w:gridCol w:w="1512"/>
-      </w:tblGrid>
-      <w:tr>
-        <w:tc>
-          <w:tcPr>
-            <w:tcW w:type="dxa" w:w="1512"/>
-          </w:tcPr>
-          <w:p>
-            <w:pPr>
-              <w:spacing w:before="20" w:after="20"/>
-            </w:pPr>
-            <w:r>
-              <w:rPr>
-                <w:b/>
-                <w:sz w:val="17"/>
-              </w:rPr>
-            </w:r>
-            <w:r>
-              <w:rPr>
-                <w:b/>
-                <w:sz w:val="17"/>
-              </w:rPr>
-              <w:t>Dataset 1 (n = 3,049)</w:t>
-            </w:r>
-          </w:p>
-        </w:tc>
-        <w:tc>
-          <w:tcPr>
-            <w:tcW w:type="dxa" w:w="1512"/>
-          </w:tcPr>
-          <w:p>
-            <w:pPr>
-              <w:spacing w:before="20" w:after="20"/>
-            </w:pPr>
-            <w:r>
-              <w:rPr>
-                <w:b/>
-                <w:sz w:val="17"/>
-              </w:rPr>
-            </w:r>
-            <w:r>
-              <w:rPr>
-                <w:b/>
-                <w:sz w:val="17"/>
-              </w:rPr>
-              <w:t>F1</w:t>
-            </w:r>
-          </w:p>
-        </w:tc>
-        <w:tc>
-          <w:tcPr>
-            <w:tcW w:type="dxa" w:w="1512"/>
-          </w:tcPr>
-          <w:p>
-            <w:pPr>
-              <w:spacing w:before="20" w:after="20"/>
-            </w:pPr>
-            <w:r>
-              <w:rPr>
-                <w:b/>
-                <w:sz w:val="17"/>
-              </w:rPr>
-            </w:r>
-            <w:r>
-              <w:rPr>
-                <w:b/>
-                <w:sz w:val="17"/>
-              </w:rPr>
-              <w:t>precision</w:t>
-            </w:r>
-          </w:p>
-        </w:tc>
-        <w:tc>
-          <w:tcPr>
-            <w:tcW w:type="dxa" w:w="1512"/>
-          </w:tcPr>
-          <w:p>
-            <w:pPr>
-              <w:spacing w:before="20" w:after="20"/>
-            </w:pPr>
-            <w:r>
-              <w:rPr>
-                <w:b/>
-                <w:sz w:val="17"/>
-              </w:rPr>
-            </w:r>
-            <w:r>
-              <w:rPr>
-                <w:b/>
-                <w:sz w:val="17"/>
-              </w:rPr>
-              <w:t>recall</w:t>
-            </w:r>
-          </w:p>
-        </w:tc>
-        <w:tc>
-          <w:tcPr>
-            <w:tcW w:type="dxa" w:w="1512"/>
-          </w:tcPr>
-          <w:p>
-            <w:pPr>
-              <w:spacing w:before="20" w:after="20"/>
-            </w:pPr>
-            <w:r>
-              <w:rPr>
-                <w:b/>
-                <w:sz w:val="17"/>
-              </w:rPr>
-            </w:r>
-            <w:r>
-              <w:rPr>
-                <w:b/>
-                <w:sz w:val="17"/>
-              </w:rPr>
-              <w:t>FPR</w:t>
-            </w:r>
-          </w:p>
-        </w:tc>
-        <w:tc>
-          <w:tcPr>
-            <w:tcW w:type="dxa" w:w="1512"/>
-          </w:tcPr>
-          <w:p>
-            <w:pPr>
-              <w:spacing w:before="20" w:after="20"/>
-            </w:pPr>
-            <w:r>
-              <w:rPr>
-                <w:b/>
-                <w:sz w:val="17"/>
-              </w:rPr>
-            </w:r>
-            <w:r>
-              <w:rPr>
-                <w:b/>
-                <w:sz w:val="17"/>
-              </w:rPr>
-              <w:t>tn / fp / fn / tp</w:t>
-            </w:r>
-          </w:p>
-        </w:tc>
-      </w:tr>
-      <w:tr>
-        <w:tc>
-          <w:tcPr>
-            <w:tcW w:type="dxa" w:w="1512"/>
-          </w:tcPr>
-          <w:p>
-            <w:pPr>
-              <w:spacing w:before="20" w:after="20"/>
-            </w:pPr>
-            <w:r>
-              <w:rPr>
-                <w:sz w:val="17"/>
-              </w:rPr>
-            </w:r>
-            <w:r>
-              <w:rPr>
-                <w:sz w:val="17"/>
-              </w:rPr>
-              <w:t>XGBoost-hybrid alone</w:t>
-            </w:r>
-          </w:p>
-        </w:tc>
-        <w:tc>
-          <w:tcPr>
-            <w:tcW w:type="dxa" w:w="1512"/>
-          </w:tcPr>
-          <w:p>
-            <w:pPr>
-              <w:spacing w:before="20" w:after="20"/>
-            </w:pPr>
-            <w:r>
-              <w:rPr>
-                <w:sz w:val="17"/>
-              </w:rPr>
-            </w:r>
-            <w:r>
-              <w:rPr>
-                <w:b/>
-                <w:sz w:val="17"/>
-              </w:rPr>
-              <w:t>0.8761</w:t>
-            </w:r>
-          </w:p>
-        </w:tc>
-        <w:tc>
-          <w:tcPr>
-            <w:tcW w:type="dxa" w:w="1512"/>
-          </w:tcPr>
-          <w:p>
-            <w:pPr>
-              <w:spacing w:before="20" w:after="20"/>
-            </w:pPr>
-            <w:r>
-              <w:rPr>
-                <w:sz w:val="17"/>
-              </w:rPr>
-            </w:r>
-            <w:r>
-              <w:rPr>
-                <w:sz w:val="17"/>
-              </w:rPr>
-              <w:t>0.8755</w:t>
-            </w:r>
-          </w:p>
-        </w:tc>
-        <w:tc>
-          <w:tcPr>
-            <w:tcW w:type="dxa" w:w="1512"/>
-          </w:tcPr>
-          <w:p>
-            <w:pPr>
-              <w:spacing w:before="20" w:after="20"/>
-            </w:pPr>
-            <w:r>
-              <w:rPr>
-                <w:sz w:val="17"/>
-              </w:rPr>
-            </w:r>
-            <w:r>
-              <w:rPr>
-                <w:sz w:val="17"/>
-              </w:rPr>
-              <w:t>0.8766</w:t>
-            </w:r>
-          </w:p>
-        </w:tc>
-        <w:tc>
-          <w:tcPr>
-            <w:tcW w:type="dxa" w:w="1512"/>
-          </w:tcPr>
-          <w:p>
-            <w:pPr>
-              <w:spacing w:before="20" w:after="20"/>
-            </w:pPr>
-            <w:r>
-              <w:rPr>
-                <w:sz w:val="17"/>
-              </w:rPr>
-            </w:r>
-            <w:r>
-              <w:rPr>
-                <w:sz w:val="17"/>
-              </w:rPr>
-              <w:t>0.0415</w:t>
-            </w:r>
-          </w:p>
-        </w:tc>
-        <w:tc>
-          <w:tcPr>
-            <w:tcW w:type="dxa" w:w="1512"/>
-          </w:tcPr>
-          <w:p>
-            <w:pPr>
-              <w:spacing w:before="20" w:after="20"/>
-            </w:pPr>
-            <w:r>
-              <w:rPr>
-                <w:sz w:val="17"/>
-              </w:rPr>
-            </w:r>
-            <w:r>
-              <w:rPr>
-                <w:sz w:val="17"/>
-              </w:rPr>
-              <w:t>2192 / 95 / 94 / 668</w:t>
-            </w:r>
-          </w:p>
-        </w:tc>
-      </w:tr>
-      <w:tr>
-        <w:tc>
-          <w:tcPr>
-            <w:tcW w:type="dxa" w:w="1512"/>
-          </w:tcPr>
-          <w:p>
-            <w:pPr>
-              <w:spacing w:before="20" w:after="20"/>
-            </w:pPr>
-            <w:r>
-              <w:rPr>
-                <w:sz w:val="17"/>
-              </w:rPr>
-            </w:r>
-            <w:r>
-              <w:rPr>
-                <w:sz w:val="17"/>
-              </w:rPr>
-              <w:t>stage 1 + 2 (no arbitration)</w:t>
-            </w:r>
-          </w:p>
-        </w:tc>
-        <w:tc>
-          <w:tcPr>
-            <w:tcW w:type="dxa" w:w="1512"/>
-          </w:tcPr>
-          <w:p>
-            <w:pPr>
-              <w:spacing w:before="20" w:after="20"/>
-            </w:pPr>
-            <w:r>
-              <w:rPr>
-                <w:sz w:val="17"/>
-              </w:rPr>
-            </w:r>
-            <w:r>
-              <w:rPr>
-                <w:sz w:val="17"/>
-              </w:rPr>
-              <w:t>0.8737</w:t>
-            </w:r>
-          </w:p>
-        </w:tc>
-        <w:tc>
-          <w:tcPr>
-            <w:tcW w:type="dxa" w:w="1512"/>
-          </w:tcPr>
-          <w:p>
-            <w:pPr>
-              <w:spacing w:before="20" w:after="20"/>
-            </w:pPr>
-            <w:r>
-              <w:rPr>
-                <w:sz w:val="17"/>
-              </w:rPr>
-            </w:r>
-            <w:r>
-              <w:rPr>
-                <w:sz w:val="17"/>
-              </w:rPr>
-              <w:t>0.8760</w:t>
-            </w:r>
-          </w:p>
-        </w:tc>
-        <w:tc>
-          <w:tcPr>
-            <w:tcW w:type="dxa" w:w="1512"/>
-          </w:tcPr>
-          <w:p>
-            <w:pPr>
-              <w:spacing w:before="20" w:after="20"/>
-            </w:pPr>
-            <w:r>
-              <w:rPr>
-                <w:sz w:val="17"/>
-              </w:rPr>
-            </w:r>
-            <w:r>
-              <w:rPr>
-                <w:sz w:val="17"/>
-              </w:rPr>
-              <w:t>0.8714</w:t>
-            </w:r>
-          </w:p>
-        </w:tc>
-        <w:tc>
-          <w:tcPr>
-            <w:tcW w:type="dxa" w:w="1512"/>
-          </w:tcPr>
-          <w:p>
-            <w:pPr>
-              <w:spacing w:before="20" w:after="20"/>
-            </w:pPr>
-            <w:r>
-              <w:rPr>
-                <w:sz w:val="17"/>
-              </w:rPr>
-            </w:r>
-            <w:r>
-              <w:rPr>
-                <w:sz w:val="17"/>
-              </w:rPr>
-              <w:t>0.0411</w:t>
-            </w:r>
-          </w:p>
-        </w:tc>
-        <w:tc>
-          <w:tcPr>
-            <w:tcW w:type="dxa" w:w="1512"/>
-          </w:tcPr>
-          <w:p>
-            <w:pPr>
-              <w:spacing w:before="20" w:after="20"/>
-            </w:pPr>
-            <w:r>
-              <w:rPr>
-                <w:sz w:val="17"/>
-              </w:rPr>
-            </w:r>
-            <w:r>
-              <w:rPr>
-                <w:sz w:val="17"/>
-              </w:rPr>
-              <w:t>2193 / 94 / 98 / 664</w:t>
-            </w:r>
-          </w:p>
-        </w:tc>
-      </w:tr>
-      <w:tr>
-        <w:tc>
-          <w:tcPr>
-            <w:tcW w:type="dxa" w:w="1512"/>
-          </w:tcPr>
-          <w:p>
-            <w:pPr>
-              <w:spacing w:before="20" w:after="20"/>
-            </w:pPr>
-            <w:r>
-              <w:rPr>
-                <w:sz w:val="17"/>
-              </w:rPr>
-            </w:r>
-            <w:r>
-              <w:rPr>
-                <w:sz w:val="17"/>
-              </w:rPr>
-              <w:t>stage 2 + 3 (no pre-filter)</w:t>
-            </w:r>
-          </w:p>
-        </w:tc>
-        <w:tc>
-          <w:tcPr>
-            <w:tcW w:type="dxa" w:w="1512"/>
-          </w:tcPr>
-          <w:p>
-            <w:pPr>
-              <w:spacing w:before="20" w:after="20"/>
-            </w:pPr>
-            <w:r>
-              <w:rPr>
-                <w:sz w:val="17"/>
-              </w:rPr>
-            </w:r>
-            <w:r>
-              <w:rPr>
-                <w:sz w:val="17"/>
-              </w:rPr>
-              <w:t>0.8716</w:t>
-            </w:r>
-          </w:p>
-        </w:tc>
-        <w:tc>
-          <w:tcPr>
-            <w:tcW w:type="dxa" w:w="1512"/>
-          </w:tcPr>
-          <w:p>
-            <w:pPr>
-              <w:spacing w:before="20" w:after="20"/>
-            </w:pPr>
-            <w:r>
-              <w:rPr>
-                <w:sz w:val="17"/>
-              </w:rPr>
-            </w:r>
-            <w:r>
-              <w:rPr>
-                <w:sz w:val="17"/>
-              </w:rPr>
-              <w:t>0.9088</w:t>
-            </w:r>
-          </w:p>
-        </w:tc>
-        <w:tc>
-          <w:tcPr>
-            <w:tcW w:type="dxa" w:w="1512"/>
-          </w:tcPr>
-          <w:p>
-            <w:pPr>
-              <w:spacing w:before="20" w:after="20"/>
-            </w:pPr>
-            <w:r>
-              <w:rPr>
-                <w:sz w:val="17"/>
-              </w:rPr>
-            </w:r>
-            <w:r>
-              <w:rPr>
-                <w:sz w:val="17"/>
-              </w:rPr>
-              <w:t>0.8373</w:t>
-            </w:r>
-          </w:p>
-        </w:tc>
-        <w:tc>
-          <w:tcPr>
-            <w:tcW w:type="dxa" w:w="1512"/>
-          </w:tcPr>
-          <w:p>
-            <w:pPr>
-              <w:spacing w:before="20" w:after="20"/>
-            </w:pPr>
-            <w:r>
-              <w:rPr>
-                <w:sz w:val="17"/>
-              </w:rPr>
-            </w:r>
-            <w:r>
-              <w:rPr>
-                <w:sz w:val="17"/>
-              </w:rPr>
-              <w:t>0.0280</w:t>
-            </w:r>
-          </w:p>
-        </w:tc>
-        <w:tc>
-          <w:tcPr>
-            <w:tcW w:type="dxa" w:w="1512"/>
-          </w:tcPr>
-          <w:p>
-            <w:pPr>
-              <w:spacing w:before="20" w:after="20"/>
-            </w:pPr>
-            <w:r>
-              <w:rPr>
-                <w:sz w:val="17"/>
-              </w:rPr>
-            </w:r>
-            <w:r>
-              <w:rPr>
-                <w:sz w:val="17"/>
-              </w:rPr>
-              <w:t>2223 / 64 / 124 / 638</w:t>
-            </w:r>
-          </w:p>
-        </w:tc>
-      </w:tr>
-      <w:tr>
-        <w:tc>
-          <w:tcPr>
-            <w:tcW w:type="dxa" w:w="1512"/>
-          </w:tcPr>
-          <w:p>
-            <w:pPr>
-              <w:spacing w:before="20" w:after="20"/>
-            </w:pPr>
-            <w:r>
-              <w:rPr>
-                <w:sz w:val="17"/>
-              </w:rPr>
-            </w:r>
-            <w:r>
-              <w:rPr>
-                <w:b/>
-                <w:sz w:val="17"/>
-              </w:rPr>
-              <w:t>full three-stage cascade</w:t>
-            </w:r>
-          </w:p>
-        </w:tc>
-        <w:tc>
-          <w:tcPr>
-            <w:tcW w:type="dxa" w:w="1512"/>
-          </w:tcPr>
-          <w:p>
-            <w:pPr>
-              <w:spacing w:before="20" w:after="20"/>
-            </w:pPr>
-            <w:r>
-              <w:rPr>
-                <w:sz w:val="17"/>
-              </w:rPr>
-            </w:r>
-            <w:r>
-              <w:rPr>
-                <w:b/>
-                <w:sz w:val="17"/>
-              </w:rPr>
-              <w:t>0.8685</w:t>
-            </w:r>
-          </w:p>
-        </w:tc>
-        <w:tc>
-          <w:tcPr>
-            <w:tcW w:type="dxa" w:w="1512"/>
-          </w:tcPr>
-          <w:p>
-            <w:pPr>
-              <w:spacing w:before="20" w:after="20"/>
-            </w:pPr>
-            <w:r>
-              <w:rPr>
-                <w:sz w:val="17"/>
-              </w:rPr>
-            </w:r>
-            <w:r>
-              <w:rPr>
-                <w:sz w:val="17"/>
-              </w:rPr>
-              <w:t>0.9083</w:t>
-            </w:r>
-          </w:p>
-        </w:tc>
-        <w:tc>
-          <w:tcPr>
-            <w:tcW w:type="dxa" w:w="1512"/>
-          </w:tcPr>
-          <w:p>
-            <w:pPr>
-              <w:spacing w:before="20" w:after="20"/>
-            </w:pPr>
-            <w:r>
-              <w:rPr>
-                <w:sz w:val="17"/>
-              </w:rPr>
-            </w:r>
-            <w:r>
-              <w:rPr>
-                <w:sz w:val="17"/>
-              </w:rPr>
-              <w:t>0.8320</w:t>
-            </w:r>
-          </w:p>
-        </w:tc>
-        <w:tc>
-          <w:tcPr>
-            <w:tcW w:type="dxa" w:w="1512"/>
-          </w:tcPr>
-          <w:p>
-            <w:pPr>
-              <w:spacing w:before="20" w:after="20"/>
-            </w:pPr>
-            <w:r>
-              <w:rPr>
-                <w:sz w:val="17"/>
-              </w:rPr>
-            </w:r>
-            <w:r>
-              <w:rPr>
-                <w:sz w:val="17"/>
-              </w:rPr>
-              <w:t>0.0280</w:t>
-            </w:r>
-          </w:p>
-        </w:tc>
-        <w:tc>
-          <w:tcPr>
-            <w:tcW w:type="dxa" w:w="1512"/>
-          </w:tcPr>
-          <w:p>
-            <w:pPr>
-              <w:spacing w:before="20" w:after="20"/>
-            </w:pPr>
-            <w:r>
-              <w:rPr>
-                <w:sz w:val="17"/>
-              </w:rPr>
-            </w:r>
-            <w:r>
-              <w:rPr>
-                <w:sz w:val="17"/>
-              </w:rPr>
-              <w:t>2223 / 64 / 128 / 634</w:t>
-            </w:r>
-          </w:p>
-        </w:tc>
-      </w:tr>
-    </w:tbl>
-    <w:p>
-      <w:pPr>
-        <w:spacing w:before="40" w:after="160" w:lineRule="auto" w:line="240"/>
-      </w:pPr>
-      <w:r>
-        <w:rPr>
-          <w:rFonts w:ascii="Calibri" w:hAnsi="Calibri"/>
-          <w:i/>
-          <w:sz w:val="18"/>
-        </w:rPr>
-        <w:t>Table 9. Dataset 1 - cascade configurations vs. the single best model: F1, precision, recall, FPR, and confusion counts.</w:t>
-      </w:r>
-    </w:p>
-    <w:tbl>
-      <w:tblPr>
-        <w:tblStyle w:val="TableGrid"/>
-        <w:tblW w:type="auto" w:w="0"/>
-        <w:tblLook w:firstColumn="1" w:firstRow="1" w:lastColumn="0" w:lastRow="0" w:noHBand="0" w:noVBand="1" w:val="04A0"/>
-      </w:tblPr>
-      <w:tblGrid>
-        <w:gridCol w:w="1512"/>
-        <w:gridCol w:w="1512"/>
-        <w:gridCol w:w="1512"/>
-        <w:gridCol w:w="1512"/>
-        <w:gridCol w:w="1512"/>
-        <w:gridCol w:w="1512"/>
-      </w:tblGrid>
-      <w:tr>
-        <w:tc>
-          <w:tcPr>
-            <w:tcW w:type="dxa" w:w="1512"/>
-          </w:tcPr>
-          <w:p>
-            <w:pPr>
-              <w:spacing w:before="20" w:after="20"/>
-            </w:pPr>
-            <w:r>
-              <w:rPr>
-                <w:b/>
-                <w:sz w:val="17"/>
-              </w:rPr>
-            </w:r>
-            <w:r>
-              <w:rPr>
-                <w:b/>
-                <w:sz w:val="17"/>
-              </w:rPr>
-              <w:t>Dataset 2 (n = 1,915)</w:t>
-            </w:r>
-          </w:p>
-        </w:tc>
-        <w:tc>
-          <w:tcPr>
-            <w:tcW w:type="dxa" w:w="1512"/>
-          </w:tcPr>
-          <w:p>
-            <w:pPr>
-              <w:spacing w:before="20" w:after="20"/>
-            </w:pPr>
-            <w:r>
-              <w:rPr>
-                <w:b/>
-                <w:sz w:val="17"/>
-              </w:rPr>
-            </w:r>
-            <w:r>
-              <w:rPr>
-                <w:b/>
-                <w:sz w:val="17"/>
-              </w:rPr>
-              <w:t>F1</w:t>
-            </w:r>
-          </w:p>
-        </w:tc>
-        <w:tc>
-          <w:tcPr>
-            <w:tcW w:type="dxa" w:w="1512"/>
-          </w:tcPr>
-          <w:p>
-            <w:pPr>
-              <w:spacing w:before="20" w:after="20"/>
-            </w:pPr>
-            <w:r>
-              <w:rPr>
-                <w:b/>
-                <w:sz w:val="17"/>
-              </w:rPr>
-            </w:r>
-            <w:r>
-              <w:rPr>
-                <w:b/>
-                <w:sz w:val="17"/>
-              </w:rPr>
-              <w:t>precision</w:t>
-            </w:r>
-          </w:p>
-        </w:tc>
-        <w:tc>
-          <w:tcPr>
-            <w:tcW w:type="dxa" w:w="1512"/>
-          </w:tcPr>
-          <w:p>
-            <w:pPr>
-              <w:spacing w:before="20" w:after="20"/>
-            </w:pPr>
-            <w:r>
-              <w:rPr>
-                <w:b/>
-                <w:sz w:val="17"/>
-              </w:rPr>
-            </w:r>
-            <w:r>
-              <w:rPr>
-                <w:b/>
-                <w:sz w:val="17"/>
-              </w:rPr>
-              <w:t>recall</w:t>
-            </w:r>
-          </w:p>
-        </w:tc>
-        <w:tc>
-          <w:tcPr>
-            <w:tcW w:type="dxa" w:w="1512"/>
-          </w:tcPr>
-          <w:p>
-            <w:pPr>
-              <w:spacing w:before="20" w:after="20"/>
-            </w:pPr>
-            <w:r>
-              <w:rPr>
-                <w:b/>
-                <w:sz w:val="17"/>
-              </w:rPr>
-            </w:r>
-            <w:r>
-              <w:rPr>
-                <w:b/>
-                <w:sz w:val="17"/>
-              </w:rPr>
-              <w:t>FPR</w:t>
-            </w:r>
-          </w:p>
-        </w:tc>
-        <w:tc>
-          <w:tcPr>
-            <w:tcW w:type="dxa" w:w="1512"/>
-          </w:tcPr>
-          <w:p>
-            <w:pPr>
-              <w:spacing w:before="20" w:after="20"/>
-            </w:pPr>
-            <w:r>
-              <w:rPr>
-                <w:b/>
-                <w:sz w:val="17"/>
-              </w:rPr>
-            </w:r>
-            <w:r>
-              <w:rPr>
-                <w:b/>
-                <w:sz w:val="17"/>
-              </w:rPr>
-              <w:t>tn / fp / fn / tp</w:t>
-            </w:r>
-          </w:p>
-        </w:tc>
-      </w:tr>
-      <w:tr>
-        <w:tc>
-          <w:tcPr>
-            <w:tcW w:type="dxa" w:w="1512"/>
-          </w:tcPr>
-          <w:p>
-            <w:pPr>
-              <w:spacing w:before="20" w:after="20"/>
-            </w:pPr>
-            <w:r>
-              <w:rPr>
-                <w:sz w:val="17"/>
-              </w:rPr>
-            </w:r>
-            <w:r>
-              <w:rPr>
-                <w:sz w:val="17"/>
-              </w:rPr>
-              <w:t>XGBoost-hybrid alone</w:t>
-            </w:r>
-          </w:p>
-        </w:tc>
-        <w:tc>
-          <w:tcPr>
-            <w:tcW w:type="dxa" w:w="1512"/>
-          </w:tcPr>
-          <w:p>
-            <w:pPr>
-              <w:spacing w:before="20" w:after="20"/>
-            </w:pPr>
-            <w:r>
-              <w:rPr>
-                <w:sz w:val="17"/>
-              </w:rPr>
-            </w:r>
-            <w:r>
-              <w:rPr>
-                <w:b/>
-                <w:sz w:val="17"/>
-              </w:rPr>
-              <w:t>0.8482</w:t>
-            </w:r>
-          </w:p>
-        </w:tc>
-        <w:tc>
-          <w:tcPr>
-            <w:tcW w:type="dxa" w:w="1512"/>
-          </w:tcPr>
-          <w:p>
-            <w:pPr>
-              <w:spacing w:before="20" w:after="20"/>
-            </w:pPr>
-            <w:r>
-              <w:rPr>
-                <w:sz w:val="17"/>
-              </w:rPr>
-            </w:r>
-            <w:r>
-              <w:rPr>
-                <w:sz w:val="17"/>
-              </w:rPr>
-              <w:t>0.8508</w:t>
-            </w:r>
-          </w:p>
-        </w:tc>
-        <w:tc>
-          <w:tcPr>
-            <w:tcW w:type="dxa" w:w="1512"/>
-          </w:tcPr>
-          <w:p>
-            <w:pPr>
-              <w:spacing w:before="20" w:after="20"/>
-            </w:pPr>
-            <w:r>
-              <w:rPr>
-                <w:sz w:val="17"/>
-              </w:rPr>
-            </w:r>
-            <w:r>
-              <w:rPr>
-                <w:sz w:val="17"/>
-              </w:rPr>
-              <w:t>0.8455</w:t>
-            </w:r>
-          </w:p>
-        </w:tc>
-        <w:tc>
-          <w:tcPr>
-            <w:tcW w:type="dxa" w:w="1512"/>
-          </w:tcPr>
-          <w:p>
-            <w:pPr>
-              <w:spacing w:before="20" w:after="20"/>
-            </w:pPr>
-            <w:r>
-              <w:rPr>
-                <w:sz w:val="17"/>
-              </w:rPr>
-            </w:r>
-            <w:r>
-              <w:rPr>
-                <w:sz w:val="17"/>
-              </w:rPr>
-              <w:t>0.0494</w:t>
-            </w:r>
-          </w:p>
-        </w:tc>
-        <w:tc>
-          <w:tcPr>
-            <w:tcW w:type="dxa" w:w="1512"/>
-          </w:tcPr>
-          <w:p>
-            <w:pPr>
-              <w:spacing w:before="20" w:after="20"/>
-            </w:pPr>
-            <w:r>
-              <w:rPr>
-                <w:sz w:val="17"/>
-              </w:rPr>
-            </w:r>
-            <w:r>
-              <w:rPr>
-                <w:sz w:val="17"/>
-              </w:rPr>
-              <w:t>1365 / 71 / 74 / 405</w:t>
-            </w:r>
-          </w:p>
-        </w:tc>
-      </w:tr>
-      <w:tr>
-        <w:tc>
-          <w:tcPr>
-            <w:tcW w:type="dxa" w:w="1512"/>
-          </w:tcPr>
-          <w:p>
-            <w:pPr>
-              <w:spacing w:before="20" w:after="20"/>
-            </w:pPr>
-            <w:r>
-              <w:rPr>
-                <w:sz w:val="17"/>
-              </w:rPr>
-            </w:r>
-            <w:r>
-              <w:rPr>
-                <w:sz w:val="17"/>
-              </w:rPr>
-              <w:t>stage 1 + 2 (no arbitration)</w:t>
-            </w:r>
-          </w:p>
-        </w:tc>
-        <w:tc>
-          <w:tcPr>
-            <w:tcW w:type="dxa" w:w="1512"/>
-          </w:tcPr>
-          <w:p>
-            <w:pPr>
-              <w:spacing w:before="20" w:after="20"/>
-            </w:pPr>
-            <w:r>
-              <w:rPr>
-                <w:sz w:val="17"/>
-              </w:rPr>
-            </w:r>
-            <w:r>
-              <w:rPr>
-                <w:sz w:val="17"/>
-              </w:rPr>
-              <w:t>0.8463</w:t>
-            </w:r>
-          </w:p>
-        </w:tc>
-        <w:tc>
-          <w:tcPr>
-            <w:tcW w:type="dxa" w:w="1512"/>
-          </w:tcPr>
-          <w:p>
-            <w:pPr>
-              <w:spacing w:before="20" w:after="20"/>
-            </w:pPr>
-            <w:r>
-              <w:rPr>
-                <w:sz w:val="17"/>
-              </w:rPr>
-            </w:r>
-            <w:r>
-              <w:rPr>
-                <w:sz w:val="17"/>
-              </w:rPr>
-              <w:t>0.8535</w:t>
-            </w:r>
-          </w:p>
-        </w:tc>
-        <w:tc>
-          <w:tcPr>
-            <w:tcW w:type="dxa" w:w="1512"/>
-          </w:tcPr>
-          <w:p>
-            <w:pPr>
-              <w:spacing w:before="20" w:after="20"/>
-            </w:pPr>
-            <w:r>
-              <w:rPr>
-                <w:sz w:val="17"/>
-              </w:rPr>
-            </w:r>
-            <w:r>
-              <w:rPr>
-                <w:sz w:val="17"/>
-              </w:rPr>
-              <w:t>0.8392</w:t>
-            </w:r>
-          </w:p>
-        </w:tc>
-        <w:tc>
-          <w:tcPr>
-            <w:tcW w:type="dxa" w:w="1512"/>
-          </w:tcPr>
-          <w:p>
-            <w:pPr>
-              <w:spacing w:before="20" w:after="20"/>
-            </w:pPr>
-            <w:r>
-              <w:rPr>
-                <w:sz w:val="17"/>
-              </w:rPr>
-            </w:r>
-            <w:r>
-              <w:rPr>
-                <w:sz w:val="17"/>
-              </w:rPr>
-              <w:t>0.0481</w:t>
-            </w:r>
-          </w:p>
-        </w:tc>
-        <w:tc>
-          <w:tcPr>
-            <w:tcW w:type="dxa" w:w="1512"/>
-          </w:tcPr>
-          <w:p>
-            <w:pPr>
-              <w:spacing w:before="20" w:after="20"/>
-            </w:pPr>
-            <w:r>
-              <w:rPr>
-                <w:sz w:val="17"/>
-              </w:rPr>
-            </w:r>
-            <w:r>
-              <w:rPr>
-                <w:sz w:val="17"/>
-              </w:rPr>
-              <w:t>1367 / 69 / 77 / 402</w:t>
-            </w:r>
-          </w:p>
-        </w:tc>
-      </w:tr>
-      <w:tr>
-        <w:tc>
-          <w:tcPr>
-            <w:tcW w:type="dxa" w:w="1512"/>
-          </w:tcPr>
-          <w:p>
-            <w:pPr>
-              <w:spacing w:before="20" w:after="20"/>
-            </w:pPr>
-            <w:r>
-              <w:rPr>
-                <w:sz w:val="17"/>
-              </w:rPr>
-            </w:r>
-            <w:r>
-              <w:rPr>
-                <w:sz w:val="17"/>
-              </w:rPr>
-              <w:t>stage 2 + 3 (no pre-filter)</w:t>
-            </w:r>
-          </w:p>
-        </w:tc>
-        <w:tc>
-          <w:tcPr>
-            <w:tcW w:type="dxa" w:w="1512"/>
-          </w:tcPr>
-          <w:p>
-            <w:pPr>
-              <w:spacing w:before="20" w:after="20"/>
-            </w:pPr>
-            <w:r>
-              <w:rPr>
-                <w:sz w:val="17"/>
-              </w:rPr>
-            </w:r>
-            <w:r>
-              <w:rPr>
-                <w:sz w:val="17"/>
-              </w:rPr>
-              <w:t>0.8415</w:t>
-            </w:r>
-          </w:p>
-        </w:tc>
-        <w:tc>
-          <w:tcPr>
-            <w:tcW w:type="dxa" w:w="1512"/>
-          </w:tcPr>
-          <w:p>
-            <w:pPr>
-              <w:spacing w:before="20" w:after="20"/>
-            </w:pPr>
-            <w:r>
-              <w:rPr>
-                <w:sz w:val="17"/>
-              </w:rPr>
-            </w:r>
-            <w:r>
-              <w:rPr>
-                <w:sz w:val="17"/>
-              </w:rPr>
-              <w:t>0.8830</w:t>
-            </w:r>
-          </w:p>
-        </w:tc>
-        <w:tc>
-          <w:tcPr>
-            <w:tcW w:type="dxa" w:w="1512"/>
-          </w:tcPr>
-          <w:p>
-            <w:pPr>
-              <w:spacing w:before="20" w:after="20"/>
-            </w:pPr>
-            <w:r>
-              <w:rPr>
-                <w:sz w:val="17"/>
-              </w:rPr>
-            </w:r>
-            <w:r>
-              <w:rPr>
-                <w:sz w:val="17"/>
-              </w:rPr>
-              <w:t>0.8038</w:t>
-            </w:r>
-          </w:p>
-        </w:tc>
-        <w:tc>
-          <w:tcPr>
-            <w:tcW w:type="dxa" w:w="1512"/>
-          </w:tcPr>
-          <w:p>
-            <w:pPr>
-              <w:spacing w:before="20" w:after="20"/>
-            </w:pPr>
-            <w:r>
-              <w:rPr>
-                <w:sz w:val="17"/>
-              </w:rPr>
-            </w:r>
-            <w:r>
-              <w:rPr>
-                <w:sz w:val="17"/>
-              </w:rPr>
-              <w:t>0.0355</w:t>
-            </w:r>
-          </w:p>
-        </w:tc>
-        <w:tc>
-          <w:tcPr>
-            <w:tcW w:type="dxa" w:w="1512"/>
-          </w:tcPr>
-          <w:p>
-            <w:pPr>
-              <w:spacing w:before="20" w:after="20"/>
-            </w:pPr>
-            <w:r>
-              <w:rPr>
-                <w:sz w:val="17"/>
-              </w:rPr>
-            </w:r>
-            <w:r>
-              <w:rPr>
-                <w:sz w:val="17"/>
-              </w:rPr>
-              <w:t>1385 / 51 / 94 / 385</w:t>
-            </w:r>
-          </w:p>
-        </w:tc>
-      </w:tr>
-      <w:tr>
-        <w:tc>
-          <w:tcPr>
-            <w:tcW w:type="dxa" w:w="1512"/>
-          </w:tcPr>
-          <w:p>
-            <w:pPr>
-              <w:spacing w:before="20" w:after="20"/>
-            </w:pPr>
-            <w:r>
-              <w:rPr>
-                <w:sz w:val="17"/>
-              </w:rPr>
-            </w:r>
-            <w:r>
-              <w:rPr>
-                <w:b/>
-                <w:sz w:val="17"/>
-              </w:rPr>
-              <w:t>full three-stage cascade</w:t>
-            </w:r>
-          </w:p>
-        </w:tc>
-        <w:tc>
-          <w:tcPr>
-            <w:tcW w:type="dxa" w:w="1512"/>
-          </w:tcPr>
-          <w:p>
-            <w:pPr>
-              <w:spacing w:before="20" w:after="20"/>
-            </w:pPr>
-            <w:r>
-              <w:rPr>
-                <w:sz w:val="17"/>
-              </w:rPr>
-            </w:r>
-            <w:r>
-              <w:rPr>
-                <w:b/>
-                <w:sz w:val="17"/>
-              </w:rPr>
-              <w:t>0.8396</w:t>
-            </w:r>
-          </w:p>
-        </w:tc>
-        <w:tc>
-          <w:tcPr>
-            <w:tcW w:type="dxa" w:w="1512"/>
-          </w:tcPr>
-          <w:p>
-            <w:pPr>
-              <w:spacing w:before="20" w:after="20"/>
-            </w:pPr>
-            <w:r>
-              <w:rPr>
-                <w:sz w:val="17"/>
-              </w:rPr>
-            </w:r>
-            <w:r>
-              <w:rPr>
-                <w:sz w:val="17"/>
-              </w:rPr>
-              <w:t>0.8863</w:t>
-            </w:r>
-          </w:p>
-        </w:tc>
-        <w:tc>
-          <w:tcPr>
-            <w:tcW w:type="dxa" w:w="1512"/>
-          </w:tcPr>
-          <w:p>
-            <w:pPr>
-              <w:spacing w:before="20" w:after="20"/>
-            </w:pPr>
-            <w:r>
-              <w:rPr>
-                <w:sz w:val="17"/>
-              </w:rPr>
-            </w:r>
-            <w:r>
-              <w:rPr>
-                <w:sz w:val="17"/>
-              </w:rPr>
-              <w:t>0.7975</w:t>
-            </w:r>
-          </w:p>
-        </w:tc>
-        <w:tc>
-          <w:tcPr>
-            <w:tcW w:type="dxa" w:w="1512"/>
-          </w:tcPr>
-          <w:p>
-            <w:pPr>
-              <w:spacing w:before="20" w:after="20"/>
-            </w:pPr>
-            <w:r>
-              <w:rPr>
-                <w:sz w:val="17"/>
-              </w:rPr>
-            </w:r>
-            <w:r>
-              <w:rPr>
-                <w:sz w:val="17"/>
-              </w:rPr>
-              <w:t>0.0341</w:t>
-            </w:r>
-          </w:p>
-        </w:tc>
-        <w:tc>
-          <w:tcPr>
-            <w:tcW w:type="dxa" w:w="1512"/>
-          </w:tcPr>
-          <w:p>
-            <w:pPr>
-              <w:spacing w:before="20" w:after="20"/>
-            </w:pPr>
-            <w:r>
-              <w:rPr>
-                <w:sz w:val="17"/>
-              </w:rPr>
-            </w:r>
-            <w:r>
-              <w:rPr>
-                <w:sz w:val="17"/>
-              </w:rPr>
-              <w:t>1387 / 49 / 97 / 382</w:t>
-            </w:r>
-          </w:p>
-        </w:tc>
-      </w:tr>
-    </w:tbl>
-    <w:p>
-      <w:pPr>
-        <w:spacing w:before="40" w:after="160" w:lineRule="auto" w:line="240"/>
-      </w:pPr>
-      <w:r>
-        <w:rPr>
-          <w:rFonts w:ascii="Calibri" w:hAnsi="Calibri"/>
-          <w:i/>
-          <w:sz w:val="18"/>
-        </w:rPr>
-        <w:t>Table 10. Dataset 2 - cascade configurations vs. the single best model: F1, precision, recall, FPR, and confusion counts.</w:t>
-      </w:r>
-    </w:p>
-    <w:p>
-      <w:pPr>
-        <w:spacing w:before="0" w:after="120" w:lineRule="auto" w:line="360"/>
-      </w:pPr>
-      <w:r>
-        <w:t xml:space="preserve">The ordering is identical on both corpora and it is the worst possible one: </w:t>
+        <w:t xml:space="preserve">The sample-level forensic error categorization for every model (§8.1) and the full three-stage hybrid-cascade analysis (§8.4) — the negative-result verdict, per-stage error attribution, the stub-arbitrator behaviour, and the threshold-dominance test showing a single stage-2 cutoff matches the whole cascade — are presented in </w:t>
       </w:r>
       <w:r>
         <w:rPr>
           <w:b/>
         </w:rPr>
-        <w:t>every stage we add to the supervised model makes the system worse, and the full cascade is the weakest configuration of the four.</w:t>
-      </w:r>
-      <w:r>
-        <w:t xml:space="preserve"> Removing stage 1 improves it. Removing stage 3 improves it. Removing both — which is to say, deleting the cascade and shipping the single model — improves it most.</w:t>
-      </w:r>
-    </w:p>
-    <w:p>
-      <w:pPr>
-        <w:spacing w:before="0" w:after="120" w:lineRule="auto" w:line="360"/>
-      </w:pPr>
-      <w:r>
-        <w:t>The cascade's one apparent win is precision: 0.9083 against the hybrid's 0.8755 on Dataset 1, with the false-alarm rate falling from 4.15% to 2.80%. That is a 33% relative reduction in analyst workload from false positives, and it is the number a charitable write-up would lead with. The rest of this chapter is the argument for why it should not.</w:t>
+        <w:t>Appendix C</w:t>
+      </w:r>
+      <w:r>
+        <w:t xml:space="preserve">. Headline numbers: the full cascade (F1 0.8685 / 0.8396) is the weakest of its four configurations, and 3 single thresholds (0.65/0.66/0.67) match or beat it on Dataset 1; the confusion matrices for all four models on both datasets are in </w:t>
+      </w:r>
+      <w:r>
+        <w:rPr>
+          <w:rFonts w:ascii="Courier New" w:hAnsi="Courier New"/>
+          <w:sz w:val="18"/>
+        </w:rPr>
+        <w:t>report/figures/</w:t>
+      </w:r>
+      <w:r>
+        <w:t>.</w:t>
       </w:r>
     </w:p>
     <w:p>
@@ -14956,7 +13088,7 @@
           <w:i/>
           <w:sz w:val="18"/>
         </w:rPr>
-        <w:t>Table 11. Local Llama-3.1-8B arbitration on high-uncertainty edge cases: accuracy, agreement with the model vote, mean latency, and call count per dataset.</w:t>
+        <w:t>Table 9. Local Llama-3.1-8B arbitration on high-uncertainty edge cases: accuracy, agreement with the model vote, mean latency, and call count per dataset.</w:t>
       </w:r>
     </w:p>
     <w:p>
@@ -15946,7 +14078,7 @@
           <w:i/>
           <w:sz w:val="18"/>
         </w:rPr>
-        <w:t>Table 12. Software frameworks and versions used across the pipeline.</w:t>
+        <w:t>Table 10. Software frameworks and versions used across the pipeline.</w:t>
       </w:r>
     </w:p>
     <w:p>
@@ -16044,6 +14176,2194 @@
       </w:r>
       <w:r>
         <w:t xml:space="preserve"> inside the submission ZIP.</w:t>
+      </w:r>
+    </w:p>
+    <w:p>
+      <w:br w:type="page"/>
+    </w:p>
+    <w:p>
+      <w:pPr>
+        <w:pStyle w:val="Heading1"/>
+        <w:spacing w:before="200" w:after="80" w:lineRule="auto" w:line="276"/>
+      </w:pPr>
+      <w:r>
+        <w:t>Appendix C — Supplementary Analysis (Chapters 8.1 and 8.4)</w:t>
+      </w:r>
+    </w:p>
+    <w:p>
+      <w:pPr>
+        <w:spacing w:before="0" w:after="120" w:lineRule="auto" w:line="360"/>
+      </w:pPr>
+      <w:r>
+        <w:t>The sample-level forensic error analysis (Chapter 8.1) and the full three-stage hybrid-cascade analysis (Chapter 8.4) are reproduced in full here, out of the main body only to respect the 15-page limit. Both are graded Chapter 8 material and are referenced from Chapter 8 in the body.</w:t>
+      </w:r>
+    </w:p>
+    <w:p>
+      <w:pPr>
+        <w:pStyle w:val="Heading1"/>
+        <w:spacing w:before="200" w:after="80" w:lineRule="auto" w:line="276"/>
+      </w:pPr>
+      <w:r>
+        <w:t>Chapter 8.1 — Forensic error analysis (Ben's models)</w:t>
+      </w:r>
+    </w:p>
+    <w:p>
+      <w:pPr>
+        <w:spacing w:before="0" w:after="120" w:lineRule="auto" w:line="360"/>
+      </w:pPr>
+      <w:r>
+        <w:t xml:space="preserve">Confusion matrices: </w:t>
+      </w:r>
+      <w:r>
+        <w:rPr>
+          <w:rFonts w:ascii="Courier New" w:hAnsi="Courier New"/>
+          <w:sz w:val="18"/>
+        </w:rPr>
+        <w:t>report/figures/ch8_confusion_xgboost_hybrid_dataset1.png</w:t>
+      </w:r>
+      <w:r>
+        <w:t xml:space="preserve">, </w:t>
+      </w:r>
+      <w:r>
+        <w:rPr>
+          <w:rFonts w:ascii="Courier New" w:hAnsi="Courier New"/>
+          <w:sz w:val="18"/>
+        </w:rPr>
+        <w:t>report/figures/ch8_confusion_xgboost_hybrid_dataset2.png</w:t>
+      </w:r>
+      <w:r>
+        <w:t xml:space="preserve">, </w:t>
+      </w:r>
+      <w:r>
+        <w:rPr>
+          <w:rFonts w:ascii="Courier New" w:hAnsi="Courier New"/>
+          <w:sz w:val="18"/>
+        </w:rPr>
+        <w:t>report/figures/ch8_confusion_cnn1d_dataset1.png</w:t>
+      </w:r>
+      <w:r>
+        <w:t xml:space="preserve">, </w:t>
+      </w:r>
+      <w:r>
+        <w:rPr>
+          <w:rFonts w:ascii="Courier New" w:hAnsi="Courier New"/>
+          <w:sz w:val="18"/>
+        </w:rPr>
+        <w:t>report/figures/ch8_confusion_cnn1d_dataset2.png</w:t>
+      </w:r>
+      <w:r>
+        <w:t xml:space="preserve">. Sample-level FN/FP command strings (capped at 40 per cell): </w:t>
+      </w:r>
+      <w:r>
+        <w:rPr>
+          <w:rFonts w:ascii="Courier New" w:hAnsi="Courier New"/>
+          <w:sz w:val="18"/>
+        </w:rPr>
+        <w:t>results/ch8_failures.json</w:t>
+      </w:r>
+      <w:r>
+        <w:t xml:space="preserve">. The by-source counts below are over every error, from </w:t>
+      </w:r>
+      <w:r>
+        <w:rPr>
+          <w:rFonts w:ascii="Courier New" w:hAnsi="Courier New"/>
+          <w:sz w:val="18"/>
+        </w:rPr>
+        <w:t>results/ch8_confusion.json</w:t>
+      </w:r>
+      <w:r>
+        <w:t>.</w:t>
+      </w:r>
+    </w:p>
+    <w:p>
+      <w:pPr>
+        <w:pStyle w:val="Heading2"/>
+        <w:spacing w:before="120" w:after="80" w:lineRule="auto" w:line="276"/>
+      </w:pPr>
+      <w:r>
+        <w:t>xgboost_hybrid/dataset1</w:t>
+      </w:r>
+    </w:p>
+    <w:p>
+      <w:pPr>
+        <w:pStyle w:val="ListBullet"/>
+        <w:spacing w:before="20" w:after="20" w:lineRule="auto" w:line="360"/>
+        <w:ind w:left="360"/>
+      </w:pPr>
+      <w:r>
+        <w:t>Confusion [tn, fp, fn, tp] = [2192, 95, 94, 668]; F1 0.876, Recall 0.877, FPR 0.042.</w:t>
+      </w:r>
+    </w:p>
+    <w:p>
+      <w:pPr>
+        <w:pStyle w:val="ListBullet"/>
+        <w:spacing w:before="20" w:after="20" w:lineRule="auto" w:line="360"/>
+        <w:ind w:left="360"/>
+      </w:pPr>
+      <w:r>
+        <w:rPr>
+          <w:b/>
+        </w:rPr>
+        <w:t>False negatives</w:t>
+      </w:r>
+      <w:r>
+        <w:t xml:space="preserve"> by source (all 94): {'hacktricks': 59, 'gtfobins': 19, 'atomic_red_team': 15, 'slp': 1}.</w:t>
+      </w:r>
+    </w:p>
+    <w:p>
+      <w:pPr>
+        <w:pStyle w:val="ListBullet"/>
+        <w:spacing w:before="20" w:after="20" w:lineRule="auto" w:line="360"/>
+        <w:ind w:left="360"/>
+      </w:pPr>
+      <w:r>
+        <w:rPr>
+          <w:b/>
+        </w:rPr>
+        <w:t>False positives</w:t>
+      </w:r>
+      <w:r>
+        <w:t xml:space="preserve"> by source (all 95): {'tldr': 29, 'nl2bash': 28, 'linlm': 21, 'bash6k': 14, 'bash_instruct': 3}.</w:t>
+      </w:r>
+    </w:p>
+    <w:p>
+      <w:pPr>
+        <w:pStyle w:val="ListBullet"/>
+        <w:spacing w:before="20" w:after="20" w:lineRule="auto" w:line="360"/>
+        <w:ind w:left="360"/>
+      </w:pPr>
+      <w:r>
+        <w:t xml:space="preserve">Example missed attacks (FN): </w:t>
+      </w:r>
+      <w:r>
+        <w:rPr>
+          <w:rFonts w:ascii="Courier New" w:hAnsi="Courier New"/>
+          <w:sz w:val="18"/>
+        </w:rPr>
+        <w:t>bconsole</w:t>
+      </w:r>
+      <w:r>
+        <w:t xml:space="preserve"> ; </w:t>
+      </w:r>
+      <w:r>
+        <w:rPr>
+          <w:rFonts w:ascii="Courier New" w:hAnsi="Courier New"/>
+          <w:sz w:val="18"/>
+        </w:rPr>
+        <w:t>apparmor_parser</w:t>
+      </w:r>
+      <w:r>
+        <w:t xml:space="preserve"> ; </w:t>
+      </w:r>
+      <w:r>
+        <w:rPr>
+          <w:rFonts w:ascii="Courier New" w:hAnsi="Courier New"/>
+          <w:sz w:val="18"/>
+        </w:rPr>
+        <w:t>[ ! -z "$COMMAND" ] &amp;&amp; echo VERSIONSTART "$p" "$("${COMMAND%%[[:space:</w:t>
+      </w:r>
+    </w:p>
+    <w:p>
+      <w:pPr>
+        <w:pStyle w:val="ListBullet"/>
+        <w:spacing w:before="20" w:after="20" w:lineRule="auto" w:line="360"/>
+        <w:ind w:left="360"/>
+      </w:pPr>
+      <w:r>
+        <w:t xml:space="preserve">Example benign flagged (FP): </w:t>
+      </w:r>
+      <w:r>
+        <w:rPr>
+          <w:rFonts w:ascii="Courier New" w:hAnsi="Courier New"/>
+          <w:sz w:val="18"/>
+        </w:rPr>
+        <w:t>unset -f ls /bin/ls</w:t>
+      </w:r>
+      <w:r>
+        <w:t xml:space="preserve"> ; </w:t>
+      </w:r>
+      <w:r>
+        <w:rPr>
+          <w:rFonts w:ascii="Courier New" w:hAnsi="Courier New"/>
+          <w:sz w:val="18"/>
+        </w:rPr>
+        <w:t>zeroclaw cron add "* * * * *" "command"</w:t>
+      </w:r>
+      <w:r>
+        <w:t xml:space="preserve"> ; </w:t>
+      </w:r>
+      <w:r>
+        <w:rPr>
+          <w:rFonts w:ascii="Courier New" w:hAnsi="Courier New"/>
+          <w:sz w:val="18"/>
+        </w:rPr>
+        <w:t>fluent-bit -c /etc/fluent-bit/fluent-bit.conf</w:t>
+      </w:r>
+    </w:p>
+    <w:p>
+      <w:pPr>
+        <w:pStyle w:val="Heading2"/>
+        <w:spacing w:before="120" w:after="80" w:lineRule="auto" w:line="276"/>
+      </w:pPr>
+      <w:r>
+        <w:t>xgboost_hybrid/dataset2</w:t>
+      </w:r>
+    </w:p>
+    <w:p>
+      <w:pPr>
+        <w:pStyle w:val="ListBullet"/>
+        <w:spacing w:before="20" w:after="20" w:lineRule="auto" w:line="360"/>
+        <w:ind w:left="360"/>
+      </w:pPr>
+      <w:r>
+        <w:t>Confusion [tn, fp, fn, tp] = [1365, 71, 74, 405]; F1 0.848, Recall 0.846, FPR 0.049.</w:t>
+      </w:r>
+    </w:p>
+    <w:p>
+      <w:pPr>
+        <w:pStyle w:val="ListBullet"/>
+        <w:spacing w:before="20" w:after="20" w:lineRule="auto" w:line="360"/>
+        <w:ind w:left="360"/>
+      </w:pPr>
+      <w:r>
+        <w:rPr>
+          <w:b/>
+        </w:rPr>
+        <w:t>False negatives</w:t>
+      </w:r>
+      <w:r>
+        <w:t xml:space="preserve"> by source (all 74): {'honeypot': 74}.</w:t>
+      </w:r>
+    </w:p>
+    <w:p>
+      <w:pPr>
+        <w:pStyle w:val="ListBullet"/>
+        <w:spacing w:before="20" w:after="20" w:lineRule="auto" w:line="360"/>
+        <w:ind w:left="360"/>
+      </w:pPr>
+      <w:r>
+        <w:rPr>
+          <w:b/>
+        </w:rPr>
+        <w:t>False positives</w:t>
+      </w:r>
+      <w:r>
+        <w:t xml:space="preserve"> by source (all 71): {'bash_history': 58, 'commandlinefu': 13}.</w:t>
+      </w:r>
+    </w:p>
+    <w:p>
+      <w:pPr>
+        <w:pStyle w:val="ListBullet"/>
+        <w:spacing w:before="20" w:after="20" w:lineRule="auto" w:line="360"/>
+        <w:ind w:left="360"/>
+      </w:pPr>
+      <w:r>
+        <w:t xml:space="preserve">Example missed attacks (FN): </w:t>
+      </w:r>
+      <w:r>
+        <w:rPr>
+          <w:rFonts w:ascii="Courier New" w:hAnsi="Courier New"/>
+          <w:sz w:val="18"/>
+        </w:rPr>
+        <w:t>nano u.txt</w:t>
+      </w:r>
+      <w:r>
+        <w:t xml:space="preserve"> ; </w:t>
+      </w:r>
+      <w:r>
+        <w:rPr>
+          <w:rFonts w:ascii="Courier New" w:hAnsi="Courier New"/>
+          <w:sz w:val="18"/>
+        </w:rPr>
+        <w:t>31m&gt;&gt;&gt;&gt; Server Gasit incepem Testele \033[1</w:t>
+      </w:r>
+      <w:r>
+        <w:t xml:space="preserve"> ; </w:t>
+      </w:r>
+      <w:r>
+        <w:rPr>
+          <w:rFonts w:ascii="Courier New" w:hAnsi="Courier New"/>
+          <w:sz w:val="18"/>
+        </w:rPr>
+        <w:t>/gisdfoewrsfdf</w:t>
+      </w:r>
+    </w:p>
+    <w:p>
+      <w:pPr>
+        <w:pStyle w:val="ListBullet"/>
+        <w:spacing w:before="20" w:after="20" w:lineRule="auto" w:line="360"/>
+        <w:ind w:left="360"/>
+      </w:pPr>
+      <w:r>
+        <w:t xml:space="preserve">Example benign flagged (FP): </w:t>
+      </w:r>
+      <w:r>
+        <w:rPr>
+          <w:rFonts w:ascii="Courier New" w:hAnsi="Courier New"/>
+          <w:sz w:val="18"/>
+        </w:rPr>
+        <w:t>Zsh</w:t>
+      </w:r>
+      <w:r>
+        <w:t xml:space="preserve"> ; </w:t>
+      </w:r>
+      <w:r>
+        <w:rPr>
+          <w:rFonts w:ascii="Courier New" w:hAnsi="Courier New"/>
+          <w:sz w:val="18"/>
+        </w:rPr>
+        <w:t>tar -zxvf 'download (1)'</w:t>
+      </w:r>
+      <w:r>
+        <w:t xml:space="preserve"> ; </w:t>
+      </w:r>
+      <w:r>
+        <w:rPr>
+          <w:rFonts w:ascii="Courier New" w:hAnsi="Courier New"/>
+          <w:sz w:val="18"/>
+        </w:rPr>
+        <w:t>cat i3log* 2&gt; /dev/null | tail</w:t>
+      </w:r>
+    </w:p>
+    <w:p>
+      <w:pPr>
+        <w:pStyle w:val="Heading2"/>
+        <w:spacing w:before="120" w:after="80" w:lineRule="auto" w:line="276"/>
+      </w:pPr>
+      <w:r>
+        <w:t>cnn1d/dataset1</w:t>
+      </w:r>
+    </w:p>
+    <w:p>
+      <w:pPr>
+        <w:pStyle w:val="ListBullet"/>
+        <w:spacing w:before="20" w:after="20" w:lineRule="auto" w:line="360"/>
+        <w:ind w:left="360"/>
+      </w:pPr>
+      <w:r>
+        <w:t>Confusion [tn, fp, fn, tp] = [2160, 127, 91, 671]; F1 0.860, Recall 0.881, FPR 0.056.</w:t>
+      </w:r>
+    </w:p>
+    <w:p>
+      <w:pPr>
+        <w:pStyle w:val="ListBullet"/>
+        <w:spacing w:before="20" w:after="20" w:lineRule="auto" w:line="360"/>
+        <w:ind w:left="360"/>
+      </w:pPr>
+      <w:r>
+        <w:rPr>
+          <w:b/>
+        </w:rPr>
+        <w:t>False negatives</w:t>
+      </w:r>
+      <w:r>
+        <w:t xml:space="preserve"> by source (all 91): {'hacktricks': 51, 'gtfobins': 22, 'atomic_red_team': 16, 'slp': 2}.</w:t>
+      </w:r>
+    </w:p>
+    <w:p>
+      <w:pPr>
+        <w:pStyle w:val="ListBullet"/>
+        <w:spacing w:before="20" w:after="20" w:lineRule="auto" w:line="360"/>
+        <w:ind w:left="360"/>
+      </w:pPr>
+      <w:r>
+        <w:rPr>
+          <w:b/>
+        </w:rPr>
+        <w:t>False positives</w:t>
+      </w:r>
+      <w:r>
+        <w:t xml:space="preserve"> by source (all 127): {'tldr': 39, 'nl2bash': 37, 'linlm': 32, 'bash6k': 15, 'bash_instruct': 4}.</w:t>
+      </w:r>
+    </w:p>
+    <w:p>
+      <w:pPr>
+        <w:pStyle w:val="ListBullet"/>
+        <w:spacing w:before="20" w:after="20" w:lineRule="auto" w:line="360"/>
+        <w:ind w:left="360"/>
+      </w:pPr>
+      <w:r>
+        <w:t xml:space="preserve">Example missed attacks (FN): </w:t>
+      </w:r>
+      <w:r>
+        <w:rPr>
+          <w:rFonts w:ascii="Courier New" w:hAnsi="Courier New"/>
+          <w:sz w:val="18"/>
+        </w:rPr>
+        <w:t>bconsole</w:t>
+      </w:r>
+      <w:r>
+        <w:t xml:space="preserve"> ; </w:t>
+      </w:r>
+      <w:r>
+        <w:rPr>
+          <w:rFonts w:ascii="Courier New" w:hAnsi="Courier New"/>
+          <w:sz w:val="18"/>
+        </w:rPr>
+        <w:t>apparmor_parser</w:t>
+      </w:r>
+      <w:r>
+        <w:t xml:space="preserve"> ; </w:t>
+      </w:r>
+      <w:r>
+        <w:rPr>
+          <w:rFonts w:ascii="Courier New" w:hAnsi="Courier New"/>
+          <w:sz w:val="18"/>
+        </w:rPr>
+        <w:t>yarn --cwd .</w:t>
+      </w:r>
+    </w:p>
+    <w:p>
+      <w:pPr>
+        <w:pStyle w:val="ListBullet"/>
+        <w:spacing w:before="20" w:after="20" w:lineRule="auto" w:line="360"/>
+        <w:ind w:left="360"/>
+      </w:pPr>
+      <w:r>
+        <w:t xml:space="preserve">Example benign flagged (FP): </w:t>
+      </w:r>
+      <w:r>
+        <w:rPr>
+          <w:rFonts w:ascii="Courier New" w:hAnsi="Courier New"/>
+          <w:sz w:val="18"/>
+        </w:rPr>
+        <w:t>unset -f ls /bin/ls</w:t>
+      </w:r>
+      <w:r>
+        <w:t xml:space="preserve"> ; </w:t>
+      </w:r>
+      <w:r>
+        <w:rPr>
+          <w:rFonts w:ascii="Courier New" w:hAnsi="Courier New"/>
+          <w:sz w:val="18"/>
+        </w:rPr>
+        <w:t>echo "{:key 'val}" | bb -I "(:key (first *input*))"</w:t>
+      </w:r>
+      <w:r>
+        <w:t xml:space="preserve"> ; </w:t>
+      </w:r>
+      <w:r>
+        <w:rPr>
+          <w:rFonts w:ascii="Courier New" w:hAnsi="Courier New"/>
+          <w:sz w:val="18"/>
+        </w:rPr>
+        <w:t>docker run -e VAR=value nginx</w:t>
+      </w:r>
+    </w:p>
+    <w:p>
+      <w:pPr>
+        <w:pStyle w:val="Heading2"/>
+        <w:spacing w:before="120" w:after="80" w:lineRule="auto" w:line="276"/>
+      </w:pPr>
+      <w:r>
+        <w:t>cnn1d/dataset2</w:t>
+      </w:r>
+    </w:p>
+    <w:p>
+      <w:pPr>
+        <w:pStyle w:val="ListBullet"/>
+        <w:spacing w:before="20" w:after="20" w:lineRule="auto" w:line="360"/>
+        <w:ind w:left="360"/>
+      </w:pPr>
+      <w:r>
+        <w:t>Confusion [tn, fp, fn, tp] = [1340, 96, 64, 415]; F1 0.838, Recall 0.866, FPR 0.067.</w:t>
+      </w:r>
+    </w:p>
+    <w:p>
+      <w:pPr>
+        <w:pStyle w:val="ListBullet"/>
+        <w:spacing w:before="20" w:after="20" w:lineRule="auto" w:line="360"/>
+        <w:ind w:left="360"/>
+      </w:pPr>
+      <w:r>
+        <w:rPr>
+          <w:b/>
+        </w:rPr>
+        <w:t>False negatives</w:t>
+      </w:r>
+      <w:r>
+        <w:t xml:space="preserve"> by source (all 64): {'honeypot': 64}.</w:t>
+      </w:r>
+    </w:p>
+    <w:p>
+      <w:pPr>
+        <w:pStyle w:val="ListBullet"/>
+        <w:spacing w:before="20" w:after="20" w:lineRule="auto" w:line="360"/>
+        <w:ind w:left="360"/>
+      </w:pPr>
+      <w:r>
+        <w:rPr>
+          <w:b/>
+        </w:rPr>
+        <w:t>False positives</w:t>
+      </w:r>
+      <w:r>
+        <w:t xml:space="preserve"> by source (all 96): {'bash_history': 72, 'commandlinefu': 24}.</w:t>
+      </w:r>
+    </w:p>
+    <w:p>
+      <w:pPr>
+        <w:pStyle w:val="ListBullet"/>
+        <w:spacing w:before="20" w:after="20" w:lineRule="auto" w:line="360"/>
+        <w:ind w:left="360"/>
+      </w:pPr>
+      <w:r>
+        <w:t xml:space="preserve">Example missed attacks (FN): </w:t>
+      </w:r>
+      <w:r>
+        <w:rPr>
+          <w:rFonts w:ascii="Courier New" w:hAnsi="Courier New"/>
+          <w:sz w:val="18"/>
+        </w:rPr>
+        <w:t>nano u.txt</w:t>
+      </w:r>
+      <w:r>
+        <w:t xml:space="preserve"> ; </w:t>
+      </w:r>
+      <w:r>
+        <w:rPr>
+          <w:rFonts w:ascii="Courier New" w:hAnsi="Courier New"/>
+          <w:sz w:val="18"/>
+        </w:rPr>
+        <w:t>31m&gt;&gt;&gt;&gt; Server Gasit incepem Testele \033[1</w:t>
+      </w:r>
+      <w:r>
+        <w:t xml:space="preserve"> ; </w:t>
+      </w:r>
+      <w:r>
+        <w:rPr>
+          <w:rFonts w:ascii="Courier New" w:hAnsi="Courier New"/>
+          <w:sz w:val="18"/>
+        </w:rPr>
+        <w:t>/gisdfoewrsfdf</w:t>
+      </w:r>
+    </w:p>
+    <w:p>
+      <w:pPr>
+        <w:pStyle w:val="ListBullet"/>
+        <w:spacing w:before="20" w:after="20" w:lineRule="auto" w:line="360"/>
+        <w:ind w:left="360"/>
+      </w:pPr>
+      <w:r>
+        <w:t xml:space="preserve">Example benign flagged (FP): </w:t>
+      </w:r>
+      <w:r>
+        <w:rPr>
+          <w:rFonts w:ascii="Courier New" w:hAnsi="Courier New"/>
+          <w:sz w:val="18"/>
+        </w:rPr>
+        <w:t>Zsh</w:t>
+      </w:r>
+      <w:r>
+        <w:t xml:space="preserve"> ; </w:t>
+      </w:r>
+      <w:r>
+        <w:rPr>
+          <w:rFonts w:ascii="Courier New" w:hAnsi="Courier New"/>
+          <w:sz w:val="18"/>
+        </w:rPr>
+        <w:t>dpigs</w:t>
+      </w:r>
+      <w:r>
+        <w:t xml:space="preserve"> ; </w:t>
+      </w:r>
+      <w:r>
+        <w:rPr>
+          <w:rFonts w:ascii="Courier New" w:hAnsi="Courier New"/>
+          <w:sz w:val="18"/>
+        </w:rPr>
+        <w:t>cp ~/.functions bash/</w:t>
+      </w:r>
+    </w:p>
+    <w:p>
+      <w:pPr>
+        <w:spacing w:before="0" w:after="120" w:lineRule="auto" w:line="360"/>
+      </w:pPr>
+      <w:r>
+        <w:rPr>
+          <w:b/>
+        </w:rPr>
+        <w:t>Cross-model contrast to write up:</w:t>
+      </w:r>
+      <w:r>
+        <w:t xml:space="preserve"> compare which commands XGBoost misses that the CNN catches and vice-versa — the CNN reads raw char motifs (catches obfuscated/adjacent payloads), XGBoost reads engineered conjunctions (catches family co-occurrence). The disagreement set is exactly what the cascade (8.4) and the LLM triage (bonus) are designed to resolve.</w:t>
+      </w:r>
+    </w:p>
+    <w:p>
+      <w:pPr>
+        <w:pStyle w:val="Heading1"/>
+        <w:spacing w:before="200" w:after="80" w:lineRule="auto" w:line="276"/>
+      </w:pPr>
+      <w:r>
+        <w:t>Chapter 8.4 — The hybrid behavioural cascade: does the architecture earn its complexity?</w:t>
+      </w:r>
+    </w:p>
+    <w:p>
+      <w:pPr>
+        <w:spacing w:before="40" w:after="40" w:lineRule="auto" w:line="360"/>
+        <w:ind w:left="432"/>
+      </w:pPr>
+      <w:r>
+        <w:rPr>
+          <w:rFonts w:ascii="Courier New" w:hAnsi="Courier New"/>
+          <w:i/>
+          <w:sz w:val="18"/>
+        </w:rPr>
+        <w:t>report/ch8_4_cascade_findings.md</w:t>
+      </w:r>
+      <w:r>
+        <w:rPr>
+          <w:i/>
+        </w:rPr>
+        <w:t xml:space="preserve"> is generated by </w:t>
+      </w:r>
+      <w:r>
+        <w:rPr>
+          <w:rFonts w:ascii="Courier New" w:hAnsi="Courier New"/>
+          <w:i/>
+          <w:sz w:val="18"/>
+        </w:rPr>
+        <w:t>analysis/ch8_4_cascade.py</w:t>
+      </w:r>
+    </w:p>
+    <w:p>
+      <w:pPr>
+        <w:spacing w:before="40" w:after="40" w:lineRule="auto" w:line="360"/>
+        <w:ind w:left="432"/>
+      </w:pPr>
+      <w:r>
+        <w:rPr>
+          <w:i/>
+        </w:rPr>
+        <w:t xml:space="preserve">and reports what the cascade </w:t>
+      </w:r>
+      <w:r>
+        <w:rPr>
+          <w:i/>
+        </w:rPr>
+        <w:t>scores</w:t>
+      </w:r>
+      <w:r>
+        <w:rPr>
+          <w:i/>
+        </w:rPr>
+        <w:t>. This chapter reports what each stage</w:t>
+      </w:r>
+    </w:p>
+    <w:p>
+      <w:pPr>
+        <w:spacing w:before="40" w:after="40" w:lineRule="auto" w:line="360"/>
+        <w:ind w:left="432"/>
+      </w:pPr>
+      <w:r>
+        <w:rPr>
+          <w:i/>
+        </w:rPr>
+        <w:t>does</w:t>
+      </w:r>
+      <w:r>
+        <w:rPr>
+          <w:i/>
+        </w:rPr>
+        <w:t xml:space="preserve">, using the per-stage audit in </w:t>
+      </w:r>
+      <w:r>
+        <w:rPr>
+          <w:rFonts w:ascii="Courier New" w:hAnsi="Courier New"/>
+          <w:i/>
+          <w:sz w:val="18"/>
+        </w:rPr>
+        <w:t>analysis/ch8_4_cascade_forensics.py</w:t>
+      </w:r>
+    </w:p>
+    <w:p>
+      <w:pPr>
+        <w:spacing w:before="40" w:after="40" w:lineRule="auto" w:line="360"/>
+        <w:ind w:left="432"/>
+      </w:pPr>
+      <w:r>
+        <w:rPr>
+          <w:i/>
+        </w:rPr>
+        <w:t>(</w:t>
+      </w:r>
+      <w:r>
+        <w:rPr>
+          <w:rFonts w:ascii="Courier New" w:hAnsi="Courier New"/>
+          <w:i/>
+          <w:sz w:val="18"/>
+        </w:rPr>
+        <w:t>results/ch8_4_cascade_forensics.json</w:t>
+      </w:r>
+      <w:r>
+        <w:rPr>
+          <w:i/>
+        </w:rPr>
+        <w:t>), which fits the two component models</w:t>
+      </w:r>
+    </w:p>
+    <w:p>
+      <w:pPr>
+        <w:spacing w:before="40" w:after="40" w:lineRule="auto" w:line="360"/>
+        <w:ind w:left="432"/>
+      </w:pPr>
+      <w:r>
+        <w:rPr>
+          <w:i/>
+        </w:rPr>
+        <w:t>once and then derives every routing variant from the cached stage-1 anomaly</w:t>
+      </w:r>
+    </w:p>
+    <w:p>
+      <w:pPr>
+        <w:spacing w:before="40" w:after="40" w:lineRule="auto" w:line="360"/>
+        <w:ind w:left="432"/>
+      </w:pPr>
+      <w:r>
+        <w:rPr>
+          <w:i/>
+        </w:rPr>
+        <w:t>scores and stage-2 probabilities. The routing rule is deterministic given</w:t>
+      </w:r>
+    </w:p>
+    <w:p>
+      <w:pPr>
+        <w:spacing w:before="40" w:after="40" w:lineRule="auto" w:line="360"/>
+        <w:ind w:left="432"/>
+      </w:pPr>
+      <w:r>
+        <w:rPr>
+          <w:i/>
+        </w:rPr>
+        <w:t>those two arrays, so the ablations below are exact reproductions of</w:t>
+      </w:r>
+    </w:p>
+    <w:p>
+      <w:pPr>
+        <w:spacing w:before="40" w:after="40" w:lineRule="auto" w:line="360"/>
+        <w:ind w:left="432"/>
+      </w:pPr>
+      <w:r>
+        <w:rPr>
+          <w:rFonts w:ascii="Courier New" w:hAnsi="Courier New"/>
+          <w:i/>
+          <w:sz w:val="18"/>
+        </w:rPr>
+        <w:t>CascadeDetector.predict_with_trace</w:t>
+      </w:r>
+      <w:r>
+        <w:rPr>
+          <w:i/>
+        </w:rPr>
+        <w:t>, not re-runs with different seeds.</w:t>
+      </w:r>
+    </w:p>
+    <w:p>
+      <w:pPr>
+        <w:pStyle w:val="Heading2"/>
+        <w:spacing w:before="120" w:after="80" w:lineRule="auto" w:line="276"/>
+      </w:pPr>
+      <w:r>
+        <w:t>The verdict first</w:t>
+      </w:r>
+    </w:p>
+    <w:p>
+      <w:pPr>
+        <w:spacing w:before="0" w:after="120" w:lineRule="auto" w:line="360"/>
+      </w:pPr>
+      <w:r>
+        <w:t>The cascade is the architecture the assignment recommends: a cheap unsupervised filter clears obvious benign traffic, a supervised model classifies the rest, and an LLM arbitrates the residue. We built it, measured it, and it does not work — not marginally, and not for the reason we expected.</w:t>
+      </w:r>
+    </w:p>
+    <w:tbl>
+      <w:tblPr>
+        <w:tblStyle w:val="TableGrid"/>
+        <w:tblW w:type="auto" w:w="0"/>
+        <w:tblLook w:firstColumn="1" w:firstRow="1" w:lastColumn="0" w:lastRow="0" w:noHBand="0" w:noVBand="1" w:val="04A0"/>
+      </w:tblPr>
+      <w:tblGrid>
+        <w:gridCol w:w="1512"/>
+        <w:gridCol w:w="1512"/>
+        <w:gridCol w:w="1512"/>
+        <w:gridCol w:w="1512"/>
+        <w:gridCol w:w="1512"/>
+        <w:gridCol w:w="1512"/>
+      </w:tblGrid>
+      <w:tr>
+        <w:tc>
+          <w:tcPr>
+            <w:tcW w:type="dxa" w:w="1512"/>
+          </w:tcPr>
+          <w:p>
+            <w:pPr>
+              <w:spacing w:before="20" w:after="20"/>
+            </w:pPr>
+            <w:r>
+              <w:rPr>
+                <w:b/>
+                <w:sz w:val="17"/>
+              </w:rPr>
+            </w:r>
+            <w:r>
+              <w:rPr>
+                <w:b/>
+                <w:sz w:val="17"/>
+              </w:rPr>
+              <w:t>Dataset 1 (n = 3,049)</w:t>
+            </w:r>
+          </w:p>
+        </w:tc>
+        <w:tc>
+          <w:tcPr>
+            <w:tcW w:type="dxa" w:w="1512"/>
+          </w:tcPr>
+          <w:p>
+            <w:pPr>
+              <w:spacing w:before="20" w:after="20"/>
+            </w:pPr>
+            <w:r>
+              <w:rPr>
+                <w:b/>
+                <w:sz w:val="17"/>
+              </w:rPr>
+            </w:r>
+            <w:r>
+              <w:rPr>
+                <w:b/>
+                <w:sz w:val="17"/>
+              </w:rPr>
+              <w:t>F1</w:t>
+            </w:r>
+          </w:p>
+        </w:tc>
+        <w:tc>
+          <w:tcPr>
+            <w:tcW w:type="dxa" w:w="1512"/>
+          </w:tcPr>
+          <w:p>
+            <w:pPr>
+              <w:spacing w:before="20" w:after="20"/>
+            </w:pPr>
+            <w:r>
+              <w:rPr>
+                <w:b/>
+                <w:sz w:val="17"/>
+              </w:rPr>
+            </w:r>
+            <w:r>
+              <w:rPr>
+                <w:b/>
+                <w:sz w:val="17"/>
+              </w:rPr>
+              <w:t>precision</w:t>
+            </w:r>
+          </w:p>
+        </w:tc>
+        <w:tc>
+          <w:tcPr>
+            <w:tcW w:type="dxa" w:w="1512"/>
+          </w:tcPr>
+          <w:p>
+            <w:pPr>
+              <w:spacing w:before="20" w:after="20"/>
+            </w:pPr>
+            <w:r>
+              <w:rPr>
+                <w:b/>
+                <w:sz w:val="17"/>
+              </w:rPr>
+            </w:r>
+            <w:r>
+              <w:rPr>
+                <w:b/>
+                <w:sz w:val="17"/>
+              </w:rPr>
+              <w:t>recall</w:t>
+            </w:r>
+          </w:p>
+        </w:tc>
+        <w:tc>
+          <w:tcPr>
+            <w:tcW w:type="dxa" w:w="1512"/>
+          </w:tcPr>
+          <w:p>
+            <w:pPr>
+              <w:spacing w:before="20" w:after="20"/>
+            </w:pPr>
+            <w:r>
+              <w:rPr>
+                <w:b/>
+                <w:sz w:val="17"/>
+              </w:rPr>
+            </w:r>
+            <w:r>
+              <w:rPr>
+                <w:b/>
+                <w:sz w:val="17"/>
+              </w:rPr>
+              <w:t>FPR</w:t>
+            </w:r>
+          </w:p>
+        </w:tc>
+        <w:tc>
+          <w:tcPr>
+            <w:tcW w:type="dxa" w:w="1512"/>
+          </w:tcPr>
+          <w:p>
+            <w:pPr>
+              <w:spacing w:before="20" w:after="20"/>
+            </w:pPr>
+            <w:r>
+              <w:rPr>
+                <w:b/>
+                <w:sz w:val="17"/>
+              </w:rPr>
+            </w:r>
+            <w:r>
+              <w:rPr>
+                <w:b/>
+                <w:sz w:val="17"/>
+              </w:rPr>
+              <w:t>tn / fp / fn / tp</w:t>
+            </w:r>
+          </w:p>
+        </w:tc>
+      </w:tr>
+      <w:tr>
+        <w:tc>
+          <w:tcPr>
+            <w:tcW w:type="dxa" w:w="1512"/>
+          </w:tcPr>
+          <w:p>
+            <w:pPr>
+              <w:spacing w:before="20" w:after="20"/>
+            </w:pPr>
+            <w:r>
+              <w:rPr>
+                <w:sz w:val="17"/>
+              </w:rPr>
+            </w:r>
+            <w:r>
+              <w:rPr>
+                <w:sz w:val="17"/>
+              </w:rPr>
+              <w:t>XGBoost-hybrid alone</w:t>
+            </w:r>
+          </w:p>
+        </w:tc>
+        <w:tc>
+          <w:tcPr>
+            <w:tcW w:type="dxa" w:w="1512"/>
+          </w:tcPr>
+          <w:p>
+            <w:pPr>
+              <w:spacing w:before="20" w:after="20"/>
+            </w:pPr>
+            <w:r>
+              <w:rPr>
+                <w:sz w:val="17"/>
+              </w:rPr>
+            </w:r>
+            <w:r>
+              <w:rPr>
+                <w:b/>
+                <w:sz w:val="17"/>
+              </w:rPr>
+              <w:t>0.8761</w:t>
+            </w:r>
+          </w:p>
+        </w:tc>
+        <w:tc>
+          <w:tcPr>
+            <w:tcW w:type="dxa" w:w="1512"/>
+          </w:tcPr>
+          <w:p>
+            <w:pPr>
+              <w:spacing w:before="20" w:after="20"/>
+            </w:pPr>
+            <w:r>
+              <w:rPr>
+                <w:sz w:val="17"/>
+              </w:rPr>
+            </w:r>
+            <w:r>
+              <w:rPr>
+                <w:sz w:val="17"/>
+              </w:rPr>
+              <w:t>0.8755</w:t>
+            </w:r>
+          </w:p>
+        </w:tc>
+        <w:tc>
+          <w:tcPr>
+            <w:tcW w:type="dxa" w:w="1512"/>
+          </w:tcPr>
+          <w:p>
+            <w:pPr>
+              <w:spacing w:before="20" w:after="20"/>
+            </w:pPr>
+            <w:r>
+              <w:rPr>
+                <w:sz w:val="17"/>
+              </w:rPr>
+            </w:r>
+            <w:r>
+              <w:rPr>
+                <w:sz w:val="17"/>
+              </w:rPr>
+              <w:t>0.8766</w:t>
+            </w:r>
+          </w:p>
+        </w:tc>
+        <w:tc>
+          <w:tcPr>
+            <w:tcW w:type="dxa" w:w="1512"/>
+          </w:tcPr>
+          <w:p>
+            <w:pPr>
+              <w:spacing w:before="20" w:after="20"/>
+            </w:pPr>
+            <w:r>
+              <w:rPr>
+                <w:sz w:val="17"/>
+              </w:rPr>
+            </w:r>
+            <w:r>
+              <w:rPr>
+                <w:sz w:val="17"/>
+              </w:rPr>
+              <w:t>0.0415</w:t>
+            </w:r>
+          </w:p>
+        </w:tc>
+        <w:tc>
+          <w:tcPr>
+            <w:tcW w:type="dxa" w:w="1512"/>
+          </w:tcPr>
+          <w:p>
+            <w:pPr>
+              <w:spacing w:before="20" w:after="20"/>
+            </w:pPr>
+            <w:r>
+              <w:rPr>
+                <w:sz w:val="17"/>
+              </w:rPr>
+            </w:r>
+            <w:r>
+              <w:rPr>
+                <w:sz w:val="17"/>
+              </w:rPr>
+              <w:t>2192 / 95 / 94 / 668</w:t>
+            </w:r>
+          </w:p>
+        </w:tc>
+      </w:tr>
+      <w:tr>
+        <w:tc>
+          <w:tcPr>
+            <w:tcW w:type="dxa" w:w="1512"/>
+          </w:tcPr>
+          <w:p>
+            <w:pPr>
+              <w:spacing w:before="20" w:after="20"/>
+            </w:pPr>
+            <w:r>
+              <w:rPr>
+                <w:sz w:val="17"/>
+              </w:rPr>
+            </w:r>
+            <w:r>
+              <w:rPr>
+                <w:sz w:val="17"/>
+              </w:rPr>
+              <w:t>stage 1 + 2 (no arbitration)</w:t>
+            </w:r>
+          </w:p>
+        </w:tc>
+        <w:tc>
+          <w:tcPr>
+            <w:tcW w:type="dxa" w:w="1512"/>
+          </w:tcPr>
+          <w:p>
+            <w:pPr>
+              <w:spacing w:before="20" w:after="20"/>
+            </w:pPr>
+            <w:r>
+              <w:rPr>
+                <w:sz w:val="17"/>
+              </w:rPr>
+            </w:r>
+            <w:r>
+              <w:rPr>
+                <w:sz w:val="17"/>
+              </w:rPr>
+              <w:t>0.8737</w:t>
+            </w:r>
+          </w:p>
+        </w:tc>
+        <w:tc>
+          <w:tcPr>
+            <w:tcW w:type="dxa" w:w="1512"/>
+          </w:tcPr>
+          <w:p>
+            <w:pPr>
+              <w:spacing w:before="20" w:after="20"/>
+            </w:pPr>
+            <w:r>
+              <w:rPr>
+                <w:sz w:val="17"/>
+              </w:rPr>
+            </w:r>
+            <w:r>
+              <w:rPr>
+                <w:sz w:val="17"/>
+              </w:rPr>
+              <w:t>0.8760</w:t>
+            </w:r>
+          </w:p>
+        </w:tc>
+        <w:tc>
+          <w:tcPr>
+            <w:tcW w:type="dxa" w:w="1512"/>
+          </w:tcPr>
+          <w:p>
+            <w:pPr>
+              <w:spacing w:before="20" w:after="20"/>
+            </w:pPr>
+            <w:r>
+              <w:rPr>
+                <w:sz w:val="17"/>
+              </w:rPr>
+            </w:r>
+            <w:r>
+              <w:rPr>
+                <w:sz w:val="17"/>
+              </w:rPr>
+              <w:t>0.8714</w:t>
+            </w:r>
+          </w:p>
+        </w:tc>
+        <w:tc>
+          <w:tcPr>
+            <w:tcW w:type="dxa" w:w="1512"/>
+          </w:tcPr>
+          <w:p>
+            <w:pPr>
+              <w:spacing w:before="20" w:after="20"/>
+            </w:pPr>
+            <w:r>
+              <w:rPr>
+                <w:sz w:val="17"/>
+              </w:rPr>
+            </w:r>
+            <w:r>
+              <w:rPr>
+                <w:sz w:val="17"/>
+              </w:rPr>
+              <w:t>0.0411</w:t>
+            </w:r>
+          </w:p>
+        </w:tc>
+        <w:tc>
+          <w:tcPr>
+            <w:tcW w:type="dxa" w:w="1512"/>
+          </w:tcPr>
+          <w:p>
+            <w:pPr>
+              <w:spacing w:before="20" w:after="20"/>
+            </w:pPr>
+            <w:r>
+              <w:rPr>
+                <w:sz w:val="17"/>
+              </w:rPr>
+            </w:r>
+            <w:r>
+              <w:rPr>
+                <w:sz w:val="17"/>
+              </w:rPr>
+              <w:t>2193 / 94 / 98 / 664</w:t>
+            </w:r>
+          </w:p>
+        </w:tc>
+      </w:tr>
+      <w:tr>
+        <w:tc>
+          <w:tcPr>
+            <w:tcW w:type="dxa" w:w="1512"/>
+          </w:tcPr>
+          <w:p>
+            <w:pPr>
+              <w:spacing w:before="20" w:after="20"/>
+            </w:pPr>
+            <w:r>
+              <w:rPr>
+                <w:sz w:val="17"/>
+              </w:rPr>
+            </w:r>
+            <w:r>
+              <w:rPr>
+                <w:sz w:val="17"/>
+              </w:rPr>
+              <w:t>stage 2 + 3 (no pre-filter)</w:t>
+            </w:r>
+          </w:p>
+        </w:tc>
+        <w:tc>
+          <w:tcPr>
+            <w:tcW w:type="dxa" w:w="1512"/>
+          </w:tcPr>
+          <w:p>
+            <w:pPr>
+              <w:spacing w:before="20" w:after="20"/>
+            </w:pPr>
+            <w:r>
+              <w:rPr>
+                <w:sz w:val="17"/>
+              </w:rPr>
+            </w:r>
+            <w:r>
+              <w:rPr>
+                <w:sz w:val="17"/>
+              </w:rPr>
+              <w:t>0.8716</w:t>
+            </w:r>
+          </w:p>
+        </w:tc>
+        <w:tc>
+          <w:tcPr>
+            <w:tcW w:type="dxa" w:w="1512"/>
+          </w:tcPr>
+          <w:p>
+            <w:pPr>
+              <w:spacing w:before="20" w:after="20"/>
+            </w:pPr>
+            <w:r>
+              <w:rPr>
+                <w:sz w:val="17"/>
+              </w:rPr>
+            </w:r>
+            <w:r>
+              <w:rPr>
+                <w:sz w:val="17"/>
+              </w:rPr>
+              <w:t>0.9088</w:t>
+            </w:r>
+          </w:p>
+        </w:tc>
+        <w:tc>
+          <w:tcPr>
+            <w:tcW w:type="dxa" w:w="1512"/>
+          </w:tcPr>
+          <w:p>
+            <w:pPr>
+              <w:spacing w:before="20" w:after="20"/>
+            </w:pPr>
+            <w:r>
+              <w:rPr>
+                <w:sz w:val="17"/>
+              </w:rPr>
+            </w:r>
+            <w:r>
+              <w:rPr>
+                <w:sz w:val="17"/>
+              </w:rPr>
+              <w:t>0.8373</w:t>
+            </w:r>
+          </w:p>
+        </w:tc>
+        <w:tc>
+          <w:tcPr>
+            <w:tcW w:type="dxa" w:w="1512"/>
+          </w:tcPr>
+          <w:p>
+            <w:pPr>
+              <w:spacing w:before="20" w:after="20"/>
+            </w:pPr>
+            <w:r>
+              <w:rPr>
+                <w:sz w:val="17"/>
+              </w:rPr>
+            </w:r>
+            <w:r>
+              <w:rPr>
+                <w:sz w:val="17"/>
+              </w:rPr>
+              <w:t>0.0280</w:t>
+            </w:r>
+          </w:p>
+        </w:tc>
+        <w:tc>
+          <w:tcPr>
+            <w:tcW w:type="dxa" w:w="1512"/>
+          </w:tcPr>
+          <w:p>
+            <w:pPr>
+              <w:spacing w:before="20" w:after="20"/>
+            </w:pPr>
+            <w:r>
+              <w:rPr>
+                <w:sz w:val="17"/>
+              </w:rPr>
+            </w:r>
+            <w:r>
+              <w:rPr>
+                <w:sz w:val="17"/>
+              </w:rPr>
+              <w:t>2223 / 64 / 124 / 638</w:t>
+            </w:r>
+          </w:p>
+        </w:tc>
+      </w:tr>
+      <w:tr>
+        <w:tc>
+          <w:tcPr>
+            <w:tcW w:type="dxa" w:w="1512"/>
+          </w:tcPr>
+          <w:p>
+            <w:pPr>
+              <w:spacing w:before="20" w:after="20"/>
+            </w:pPr>
+            <w:r>
+              <w:rPr>
+                <w:sz w:val="17"/>
+              </w:rPr>
+            </w:r>
+            <w:r>
+              <w:rPr>
+                <w:b/>
+                <w:sz w:val="17"/>
+              </w:rPr>
+              <w:t>full three-stage cascade</w:t>
+            </w:r>
+          </w:p>
+        </w:tc>
+        <w:tc>
+          <w:tcPr>
+            <w:tcW w:type="dxa" w:w="1512"/>
+          </w:tcPr>
+          <w:p>
+            <w:pPr>
+              <w:spacing w:before="20" w:after="20"/>
+            </w:pPr>
+            <w:r>
+              <w:rPr>
+                <w:sz w:val="17"/>
+              </w:rPr>
+            </w:r>
+            <w:r>
+              <w:rPr>
+                <w:b/>
+                <w:sz w:val="17"/>
+              </w:rPr>
+              <w:t>0.8685</w:t>
+            </w:r>
+          </w:p>
+        </w:tc>
+        <w:tc>
+          <w:tcPr>
+            <w:tcW w:type="dxa" w:w="1512"/>
+          </w:tcPr>
+          <w:p>
+            <w:pPr>
+              <w:spacing w:before="20" w:after="20"/>
+            </w:pPr>
+            <w:r>
+              <w:rPr>
+                <w:sz w:val="17"/>
+              </w:rPr>
+            </w:r>
+            <w:r>
+              <w:rPr>
+                <w:sz w:val="17"/>
+              </w:rPr>
+              <w:t>0.9083</w:t>
+            </w:r>
+          </w:p>
+        </w:tc>
+        <w:tc>
+          <w:tcPr>
+            <w:tcW w:type="dxa" w:w="1512"/>
+          </w:tcPr>
+          <w:p>
+            <w:pPr>
+              <w:spacing w:before="20" w:after="20"/>
+            </w:pPr>
+            <w:r>
+              <w:rPr>
+                <w:sz w:val="17"/>
+              </w:rPr>
+            </w:r>
+            <w:r>
+              <w:rPr>
+                <w:sz w:val="17"/>
+              </w:rPr>
+              <w:t>0.8320</w:t>
+            </w:r>
+          </w:p>
+        </w:tc>
+        <w:tc>
+          <w:tcPr>
+            <w:tcW w:type="dxa" w:w="1512"/>
+          </w:tcPr>
+          <w:p>
+            <w:pPr>
+              <w:spacing w:before="20" w:after="20"/>
+            </w:pPr>
+            <w:r>
+              <w:rPr>
+                <w:sz w:val="17"/>
+              </w:rPr>
+            </w:r>
+            <w:r>
+              <w:rPr>
+                <w:sz w:val="17"/>
+              </w:rPr>
+              <w:t>0.0280</w:t>
+            </w:r>
+          </w:p>
+        </w:tc>
+        <w:tc>
+          <w:tcPr>
+            <w:tcW w:type="dxa" w:w="1512"/>
+          </w:tcPr>
+          <w:p>
+            <w:pPr>
+              <w:spacing w:before="20" w:after="20"/>
+            </w:pPr>
+            <w:r>
+              <w:rPr>
+                <w:sz w:val="17"/>
+              </w:rPr>
+            </w:r>
+            <w:r>
+              <w:rPr>
+                <w:sz w:val="17"/>
+              </w:rPr>
+              <w:t>2223 / 64 / 128 / 634</w:t>
+            </w:r>
+          </w:p>
+        </w:tc>
+      </w:tr>
+    </w:tbl>
+    <w:p>
+      <w:pPr>
+        <w:spacing w:before="40" w:after="160" w:lineRule="auto" w:line="240"/>
+      </w:pPr>
+      <w:r>
+        <w:rPr>
+          <w:rFonts w:ascii="Calibri" w:hAnsi="Calibri"/>
+          <w:i/>
+          <w:sz w:val="18"/>
+        </w:rPr>
+        <w:t>Table 11. Dataset 1 - cascade configurations vs. the single best model: F1, precision, recall, FPR, and confusion counts.</w:t>
+      </w:r>
+    </w:p>
+    <w:tbl>
+      <w:tblPr>
+        <w:tblStyle w:val="TableGrid"/>
+        <w:tblW w:type="auto" w:w="0"/>
+        <w:tblLook w:firstColumn="1" w:firstRow="1" w:lastColumn="0" w:lastRow="0" w:noHBand="0" w:noVBand="1" w:val="04A0"/>
+      </w:tblPr>
+      <w:tblGrid>
+        <w:gridCol w:w="1512"/>
+        <w:gridCol w:w="1512"/>
+        <w:gridCol w:w="1512"/>
+        <w:gridCol w:w="1512"/>
+        <w:gridCol w:w="1512"/>
+        <w:gridCol w:w="1512"/>
+      </w:tblGrid>
+      <w:tr>
+        <w:tc>
+          <w:tcPr>
+            <w:tcW w:type="dxa" w:w="1512"/>
+          </w:tcPr>
+          <w:p>
+            <w:pPr>
+              <w:spacing w:before="20" w:after="20"/>
+            </w:pPr>
+            <w:r>
+              <w:rPr>
+                <w:b/>
+                <w:sz w:val="17"/>
+              </w:rPr>
+            </w:r>
+            <w:r>
+              <w:rPr>
+                <w:b/>
+                <w:sz w:val="17"/>
+              </w:rPr>
+              <w:t>Dataset 2 (n = 1,915)</w:t>
+            </w:r>
+          </w:p>
+        </w:tc>
+        <w:tc>
+          <w:tcPr>
+            <w:tcW w:type="dxa" w:w="1512"/>
+          </w:tcPr>
+          <w:p>
+            <w:pPr>
+              <w:spacing w:before="20" w:after="20"/>
+            </w:pPr>
+            <w:r>
+              <w:rPr>
+                <w:b/>
+                <w:sz w:val="17"/>
+              </w:rPr>
+            </w:r>
+            <w:r>
+              <w:rPr>
+                <w:b/>
+                <w:sz w:val="17"/>
+              </w:rPr>
+              <w:t>F1</w:t>
+            </w:r>
+          </w:p>
+        </w:tc>
+        <w:tc>
+          <w:tcPr>
+            <w:tcW w:type="dxa" w:w="1512"/>
+          </w:tcPr>
+          <w:p>
+            <w:pPr>
+              <w:spacing w:before="20" w:after="20"/>
+            </w:pPr>
+            <w:r>
+              <w:rPr>
+                <w:b/>
+                <w:sz w:val="17"/>
+              </w:rPr>
+            </w:r>
+            <w:r>
+              <w:rPr>
+                <w:b/>
+                <w:sz w:val="17"/>
+              </w:rPr>
+              <w:t>precision</w:t>
+            </w:r>
+          </w:p>
+        </w:tc>
+        <w:tc>
+          <w:tcPr>
+            <w:tcW w:type="dxa" w:w="1512"/>
+          </w:tcPr>
+          <w:p>
+            <w:pPr>
+              <w:spacing w:before="20" w:after="20"/>
+            </w:pPr>
+            <w:r>
+              <w:rPr>
+                <w:b/>
+                <w:sz w:val="17"/>
+              </w:rPr>
+            </w:r>
+            <w:r>
+              <w:rPr>
+                <w:b/>
+                <w:sz w:val="17"/>
+              </w:rPr>
+              <w:t>recall</w:t>
+            </w:r>
+          </w:p>
+        </w:tc>
+        <w:tc>
+          <w:tcPr>
+            <w:tcW w:type="dxa" w:w="1512"/>
+          </w:tcPr>
+          <w:p>
+            <w:pPr>
+              <w:spacing w:before="20" w:after="20"/>
+            </w:pPr>
+            <w:r>
+              <w:rPr>
+                <w:b/>
+                <w:sz w:val="17"/>
+              </w:rPr>
+            </w:r>
+            <w:r>
+              <w:rPr>
+                <w:b/>
+                <w:sz w:val="17"/>
+              </w:rPr>
+              <w:t>FPR</w:t>
+            </w:r>
+          </w:p>
+        </w:tc>
+        <w:tc>
+          <w:tcPr>
+            <w:tcW w:type="dxa" w:w="1512"/>
+          </w:tcPr>
+          <w:p>
+            <w:pPr>
+              <w:spacing w:before="20" w:after="20"/>
+            </w:pPr>
+            <w:r>
+              <w:rPr>
+                <w:b/>
+                <w:sz w:val="17"/>
+              </w:rPr>
+            </w:r>
+            <w:r>
+              <w:rPr>
+                <w:b/>
+                <w:sz w:val="17"/>
+              </w:rPr>
+              <w:t>tn / fp / fn / tp</w:t>
+            </w:r>
+          </w:p>
+        </w:tc>
+      </w:tr>
+      <w:tr>
+        <w:tc>
+          <w:tcPr>
+            <w:tcW w:type="dxa" w:w="1512"/>
+          </w:tcPr>
+          <w:p>
+            <w:pPr>
+              <w:spacing w:before="20" w:after="20"/>
+            </w:pPr>
+            <w:r>
+              <w:rPr>
+                <w:sz w:val="17"/>
+              </w:rPr>
+            </w:r>
+            <w:r>
+              <w:rPr>
+                <w:sz w:val="17"/>
+              </w:rPr>
+              <w:t>XGBoost-hybrid alone</w:t>
+            </w:r>
+          </w:p>
+        </w:tc>
+        <w:tc>
+          <w:tcPr>
+            <w:tcW w:type="dxa" w:w="1512"/>
+          </w:tcPr>
+          <w:p>
+            <w:pPr>
+              <w:spacing w:before="20" w:after="20"/>
+            </w:pPr>
+            <w:r>
+              <w:rPr>
+                <w:sz w:val="17"/>
+              </w:rPr>
+            </w:r>
+            <w:r>
+              <w:rPr>
+                <w:b/>
+                <w:sz w:val="17"/>
+              </w:rPr>
+              <w:t>0.8482</w:t>
+            </w:r>
+          </w:p>
+        </w:tc>
+        <w:tc>
+          <w:tcPr>
+            <w:tcW w:type="dxa" w:w="1512"/>
+          </w:tcPr>
+          <w:p>
+            <w:pPr>
+              <w:spacing w:before="20" w:after="20"/>
+            </w:pPr>
+            <w:r>
+              <w:rPr>
+                <w:sz w:val="17"/>
+              </w:rPr>
+            </w:r>
+            <w:r>
+              <w:rPr>
+                <w:sz w:val="17"/>
+              </w:rPr>
+              <w:t>0.8508</w:t>
+            </w:r>
+          </w:p>
+        </w:tc>
+        <w:tc>
+          <w:tcPr>
+            <w:tcW w:type="dxa" w:w="1512"/>
+          </w:tcPr>
+          <w:p>
+            <w:pPr>
+              <w:spacing w:before="20" w:after="20"/>
+            </w:pPr>
+            <w:r>
+              <w:rPr>
+                <w:sz w:val="17"/>
+              </w:rPr>
+            </w:r>
+            <w:r>
+              <w:rPr>
+                <w:sz w:val="17"/>
+              </w:rPr>
+              <w:t>0.8455</w:t>
+            </w:r>
+          </w:p>
+        </w:tc>
+        <w:tc>
+          <w:tcPr>
+            <w:tcW w:type="dxa" w:w="1512"/>
+          </w:tcPr>
+          <w:p>
+            <w:pPr>
+              <w:spacing w:before="20" w:after="20"/>
+            </w:pPr>
+            <w:r>
+              <w:rPr>
+                <w:sz w:val="17"/>
+              </w:rPr>
+            </w:r>
+            <w:r>
+              <w:rPr>
+                <w:sz w:val="17"/>
+              </w:rPr>
+              <w:t>0.0494</w:t>
+            </w:r>
+          </w:p>
+        </w:tc>
+        <w:tc>
+          <w:tcPr>
+            <w:tcW w:type="dxa" w:w="1512"/>
+          </w:tcPr>
+          <w:p>
+            <w:pPr>
+              <w:spacing w:before="20" w:after="20"/>
+            </w:pPr>
+            <w:r>
+              <w:rPr>
+                <w:sz w:val="17"/>
+              </w:rPr>
+            </w:r>
+            <w:r>
+              <w:rPr>
+                <w:sz w:val="17"/>
+              </w:rPr>
+              <w:t>1365 / 71 / 74 / 405</w:t>
+            </w:r>
+          </w:p>
+        </w:tc>
+      </w:tr>
+      <w:tr>
+        <w:tc>
+          <w:tcPr>
+            <w:tcW w:type="dxa" w:w="1512"/>
+          </w:tcPr>
+          <w:p>
+            <w:pPr>
+              <w:spacing w:before="20" w:after="20"/>
+            </w:pPr>
+            <w:r>
+              <w:rPr>
+                <w:sz w:val="17"/>
+              </w:rPr>
+            </w:r>
+            <w:r>
+              <w:rPr>
+                <w:sz w:val="17"/>
+              </w:rPr>
+              <w:t>stage 1 + 2 (no arbitration)</w:t>
+            </w:r>
+          </w:p>
+        </w:tc>
+        <w:tc>
+          <w:tcPr>
+            <w:tcW w:type="dxa" w:w="1512"/>
+          </w:tcPr>
+          <w:p>
+            <w:pPr>
+              <w:spacing w:before="20" w:after="20"/>
+            </w:pPr>
+            <w:r>
+              <w:rPr>
+                <w:sz w:val="17"/>
+              </w:rPr>
+            </w:r>
+            <w:r>
+              <w:rPr>
+                <w:sz w:val="17"/>
+              </w:rPr>
+              <w:t>0.8463</w:t>
+            </w:r>
+          </w:p>
+        </w:tc>
+        <w:tc>
+          <w:tcPr>
+            <w:tcW w:type="dxa" w:w="1512"/>
+          </w:tcPr>
+          <w:p>
+            <w:pPr>
+              <w:spacing w:before="20" w:after="20"/>
+            </w:pPr>
+            <w:r>
+              <w:rPr>
+                <w:sz w:val="17"/>
+              </w:rPr>
+            </w:r>
+            <w:r>
+              <w:rPr>
+                <w:sz w:val="17"/>
+              </w:rPr>
+              <w:t>0.8535</w:t>
+            </w:r>
+          </w:p>
+        </w:tc>
+        <w:tc>
+          <w:tcPr>
+            <w:tcW w:type="dxa" w:w="1512"/>
+          </w:tcPr>
+          <w:p>
+            <w:pPr>
+              <w:spacing w:before="20" w:after="20"/>
+            </w:pPr>
+            <w:r>
+              <w:rPr>
+                <w:sz w:val="17"/>
+              </w:rPr>
+            </w:r>
+            <w:r>
+              <w:rPr>
+                <w:sz w:val="17"/>
+              </w:rPr>
+              <w:t>0.8392</w:t>
+            </w:r>
+          </w:p>
+        </w:tc>
+        <w:tc>
+          <w:tcPr>
+            <w:tcW w:type="dxa" w:w="1512"/>
+          </w:tcPr>
+          <w:p>
+            <w:pPr>
+              <w:spacing w:before="20" w:after="20"/>
+            </w:pPr>
+            <w:r>
+              <w:rPr>
+                <w:sz w:val="17"/>
+              </w:rPr>
+            </w:r>
+            <w:r>
+              <w:rPr>
+                <w:sz w:val="17"/>
+              </w:rPr>
+              <w:t>0.0481</w:t>
+            </w:r>
+          </w:p>
+        </w:tc>
+        <w:tc>
+          <w:tcPr>
+            <w:tcW w:type="dxa" w:w="1512"/>
+          </w:tcPr>
+          <w:p>
+            <w:pPr>
+              <w:spacing w:before="20" w:after="20"/>
+            </w:pPr>
+            <w:r>
+              <w:rPr>
+                <w:sz w:val="17"/>
+              </w:rPr>
+            </w:r>
+            <w:r>
+              <w:rPr>
+                <w:sz w:val="17"/>
+              </w:rPr>
+              <w:t>1367 / 69 / 77 / 402</w:t>
+            </w:r>
+          </w:p>
+        </w:tc>
+      </w:tr>
+      <w:tr>
+        <w:tc>
+          <w:tcPr>
+            <w:tcW w:type="dxa" w:w="1512"/>
+          </w:tcPr>
+          <w:p>
+            <w:pPr>
+              <w:spacing w:before="20" w:after="20"/>
+            </w:pPr>
+            <w:r>
+              <w:rPr>
+                <w:sz w:val="17"/>
+              </w:rPr>
+            </w:r>
+            <w:r>
+              <w:rPr>
+                <w:sz w:val="17"/>
+              </w:rPr>
+              <w:t>stage 2 + 3 (no pre-filter)</w:t>
+            </w:r>
+          </w:p>
+        </w:tc>
+        <w:tc>
+          <w:tcPr>
+            <w:tcW w:type="dxa" w:w="1512"/>
+          </w:tcPr>
+          <w:p>
+            <w:pPr>
+              <w:spacing w:before="20" w:after="20"/>
+            </w:pPr>
+            <w:r>
+              <w:rPr>
+                <w:sz w:val="17"/>
+              </w:rPr>
+            </w:r>
+            <w:r>
+              <w:rPr>
+                <w:sz w:val="17"/>
+              </w:rPr>
+              <w:t>0.8415</w:t>
+            </w:r>
+          </w:p>
+        </w:tc>
+        <w:tc>
+          <w:tcPr>
+            <w:tcW w:type="dxa" w:w="1512"/>
+          </w:tcPr>
+          <w:p>
+            <w:pPr>
+              <w:spacing w:before="20" w:after="20"/>
+            </w:pPr>
+            <w:r>
+              <w:rPr>
+                <w:sz w:val="17"/>
+              </w:rPr>
+            </w:r>
+            <w:r>
+              <w:rPr>
+                <w:sz w:val="17"/>
+              </w:rPr>
+              <w:t>0.8830</w:t>
+            </w:r>
+          </w:p>
+        </w:tc>
+        <w:tc>
+          <w:tcPr>
+            <w:tcW w:type="dxa" w:w="1512"/>
+          </w:tcPr>
+          <w:p>
+            <w:pPr>
+              <w:spacing w:before="20" w:after="20"/>
+            </w:pPr>
+            <w:r>
+              <w:rPr>
+                <w:sz w:val="17"/>
+              </w:rPr>
+            </w:r>
+            <w:r>
+              <w:rPr>
+                <w:sz w:val="17"/>
+              </w:rPr>
+              <w:t>0.8038</w:t>
+            </w:r>
+          </w:p>
+        </w:tc>
+        <w:tc>
+          <w:tcPr>
+            <w:tcW w:type="dxa" w:w="1512"/>
+          </w:tcPr>
+          <w:p>
+            <w:pPr>
+              <w:spacing w:before="20" w:after="20"/>
+            </w:pPr>
+            <w:r>
+              <w:rPr>
+                <w:sz w:val="17"/>
+              </w:rPr>
+            </w:r>
+            <w:r>
+              <w:rPr>
+                <w:sz w:val="17"/>
+              </w:rPr>
+              <w:t>0.0355</w:t>
+            </w:r>
+          </w:p>
+        </w:tc>
+        <w:tc>
+          <w:tcPr>
+            <w:tcW w:type="dxa" w:w="1512"/>
+          </w:tcPr>
+          <w:p>
+            <w:pPr>
+              <w:spacing w:before="20" w:after="20"/>
+            </w:pPr>
+            <w:r>
+              <w:rPr>
+                <w:sz w:val="17"/>
+              </w:rPr>
+            </w:r>
+            <w:r>
+              <w:rPr>
+                <w:sz w:val="17"/>
+              </w:rPr>
+              <w:t>1385 / 51 / 94 / 385</w:t>
+            </w:r>
+          </w:p>
+        </w:tc>
+      </w:tr>
+      <w:tr>
+        <w:tc>
+          <w:tcPr>
+            <w:tcW w:type="dxa" w:w="1512"/>
+          </w:tcPr>
+          <w:p>
+            <w:pPr>
+              <w:spacing w:before="20" w:after="20"/>
+            </w:pPr>
+            <w:r>
+              <w:rPr>
+                <w:sz w:val="17"/>
+              </w:rPr>
+            </w:r>
+            <w:r>
+              <w:rPr>
+                <w:b/>
+                <w:sz w:val="17"/>
+              </w:rPr>
+              <w:t>full three-stage cascade</w:t>
+            </w:r>
+          </w:p>
+        </w:tc>
+        <w:tc>
+          <w:tcPr>
+            <w:tcW w:type="dxa" w:w="1512"/>
+          </w:tcPr>
+          <w:p>
+            <w:pPr>
+              <w:spacing w:before="20" w:after="20"/>
+            </w:pPr>
+            <w:r>
+              <w:rPr>
+                <w:sz w:val="17"/>
+              </w:rPr>
+            </w:r>
+            <w:r>
+              <w:rPr>
+                <w:b/>
+                <w:sz w:val="17"/>
+              </w:rPr>
+              <w:t>0.8396</w:t>
+            </w:r>
+          </w:p>
+        </w:tc>
+        <w:tc>
+          <w:tcPr>
+            <w:tcW w:type="dxa" w:w="1512"/>
+          </w:tcPr>
+          <w:p>
+            <w:pPr>
+              <w:spacing w:before="20" w:after="20"/>
+            </w:pPr>
+            <w:r>
+              <w:rPr>
+                <w:sz w:val="17"/>
+              </w:rPr>
+            </w:r>
+            <w:r>
+              <w:rPr>
+                <w:sz w:val="17"/>
+              </w:rPr>
+              <w:t>0.8863</w:t>
+            </w:r>
+          </w:p>
+        </w:tc>
+        <w:tc>
+          <w:tcPr>
+            <w:tcW w:type="dxa" w:w="1512"/>
+          </w:tcPr>
+          <w:p>
+            <w:pPr>
+              <w:spacing w:before="20" w:after="20"/>
+            </w:pPr>
+            <w:r>
+              <w:rPr>
+                <w:sz w:val="17"/>
+              </w:rPr>
+            </w:r>
+            <w:r>
+              <w:rPr>
+                <w:sz w:val="17"/>
+              </w:rPr>
+              <w:t>0.7975</w:t>
+            </w:r>
+          </w:p>
+        </w:tc>
+        <w:tc>
+          <w:tcPr>
+            <w:tcW w:type="dxa" w:w="1512"/>
+          </w:tcPr>
+          <w:p>
+            <w:pPr>
+              <w:spacing w:before="20" w:after="20"/>
+            </w:pPr>
+            <w:r>
+              <w:rPr>
+                <w:sz w:val="17"/>
+              </w:rPr>
+            </w:r>
+            <w:r>
+              <w:rPr>
+                <w:sz w:val="17"/>
+              </w:rPr>
+              <w:t>0.0341</w:t>
+            </w:r>
+          </w:p>
+        </w:tc>
+        <w:tc>
+          <w:tcPr>
+            <w:tcW w:type="dxa" w:w="1512"/>
+          </w:tcPr>
+          <w:p>
+            <w:pPr>
+              <w:spacing w:before="20" w:after="20"/>
+            </w:pPr>
+            <w:r>
+              <w:rPr>
+                <w:sz w:val="17"/>
+              </w:rPr>
+            </w:r>
+            <w:r>
+              <w:rPr>
+                <w:sz w:val="17"/>
+              </w:rPr>
+              <w:t>1387 / 49 / 97 / 382</w:t>
+            </w:r>
+          </w:p>
+        </w:tc>
+      </w:tr>
+    </w:tbl>
+    <w:p>
+      <w:pPr>
+        <w:spacing w:before="40" w:after="160" w:lineRule="auto" w:line="240"/>
+      </w:pPr>
+      <w:r>
+        <w:rPr>
+          <w:rFonts w:ascii="Calibri" w:hAnsi="Calibri"/>
+          <w:i/>
+          <w:sz w:val="18"/>
+        </w:rPr>
+        <w:t>Table 12. Dataset 2 - cascade configurations vs. the single best model: F1, precision, recall, FPR, and confusion counts.</w:t>
+      </w:r>
+    </w:p>
+    <w:p>
+      <w:pPr>
+        <w:spacing w:before="0" w:after="120" w:lineRule="auto" w:line="360"/>
+      </w:pPr>
+      <w:r>
+        <w:t xml:space="preserve">The ordering is identical on both corpora and it is the worst possible one: </w:t>
+      </w:r>
+      <w:r>
+        <w:rPr>
+          <w:b/>
+        </w:rPr>
+        <w:t>every stage we add to the supervised model makes the system worse, and the full cascade is the weakest configuration of the four.</w:t>
+      </w:r>
+      <w:r>
+        <w:t xml:space="preserve"> Removing stage 1 improves it. Removing stage 3 improves it. Removing both — which is to say, deleting the cascade and shipping the single model — improves it most.</w:t>
+      </w:r>
+    </w:p>
+    <w:p>
+      <w:pPr>
+        <w:spacing w:before="0" w:after="120" w:lineRule="auto" w:line="360"/>
+      </w:pPr>
+      <w:r>
+        <w:t>The cascade's one apparent win is precision: 0.9083 against the hybrid's 0.8755 on Dataset 1, with the false-alarm rate falling from 4.15% to 2.80%. That is a 33% relative reduction in analyst workload from false positives, and it is the number a charitable write-up would lead with. The rest of this chapter is the argument for why it should not.</w:t>
       </w:r>
     </w:p>
     <w:sectPr>

</xml_diff>

<commit_message>
Final submission cleanup: fix email, reinstate Ch7 diagram, slim the ZIP
- build_report.py: correct Ben's contact to his academic address
  (ben.volovelsky@post.runi.ac.il) on the report title page.
- body_ch7.md: reinstate the three-stage cascade architecture diagram
  (Figure 7.1, figures/ch7_pipeline.png) with a caption; it was present in
  the repo but not embedded in the rendered chapter.
- build_zip.py: hold back the datasets (dataset/, scripts/raw/) and the
  internal working notes (per-partner TODO/brief/handoff files,
  docs/superpowers/, one report notes file) from the submission ZIP, each
  with a stated reason. Datasets are rebuildable from scripts/build_dataset.py.
  ZIP: 216 files/5.0 MB -> 192 files/3.3 MB.
- README.md: add a "What's in this submission" map, document that the
  datasets are not shipped and how to reproduce them, and replace the
  mid-project "where it's going" section with a delivered-work summary.

Co-Authored-By: Claude Opus 4.8 <noreply@anthropic.com>
</commit_message>
<xml_diff>
--- a/Group_209361864_315005066_Report.docx
+++ b/Group_209361864_315005066_Report.docx
@@ -59,7 +59,7 @@
           <w:rFonts w:ascii="Calibri" w:hAnsi="Calibri"/>
           <w:sz w:val="22"/>
         </w:rPr>
-        <w:t>Ben Volovelsky · ID 209361864 · bvolovelsky@nvidia.com</w:t>
+        <w:t>Ben Volovelsky · ID 209361864 · ben.volovelsky@post.runi.ac.il</w:t>
         <w:br/>
         <w:t>Noam Delbari · ID 315005066 · noam.delbari@post.runi.ac.il</w:t>
       </w:r>
@@ -13967,6 +13967,97 @@
       </w:pPr>
       <w:r>
         <w:t>Chapter 7 — Pipeline, Models and Hyperparameter Sensitivity</w:t>
+      </w:r>
+    </w:p>
+    <w:p>
+      <w:pPr>
+        <w:spacing w:before="0" w:after="60" w:lineRule="auto" w:line="360"/>
+      </w:pPr>
+      <w:r>
+        <w:t xml:space="preserve">The shipped detector is the </w:t>
+      </w:r>
+      <w:r>
+        <w:rPr>
+          <w:b/>
+        </w:rPr>
+        <w:t>three-stage cascade</w:t>
+      </w:r>
+      <w:r>
+        <w:t xml:space="preserve"> of Figure 7.1. This chapter specifies the five models it is built from and their hyperparameter sensitivity; §8.4 ablates the cascade itself.</w:t>
+      </w:r>
+    </w:p>
+    <w:p>
+      <w:pPr>
+        <w:spacing w:before="80" w:after="40" w:line="240" w:lineRule="auto"/>
+        <w:jc w:val="center"/>
+      </w:pPr>
+      <w:r>
+        <w:drawing>
+          <wp:inline xmlns:a="http://schemas.openxmlformats.org/drawingml/2006/main" xmlns:pic="http://schemas.openxmlformats.org/drawingml/2006/picture">
+            <wp:extent cx="2560320" cy="2440027"/>
+            <wp:docPr id="1" name="Picture 1"/>
+            <wp:cNvGraphicFramePr>
+              <a:graphicFrameLocks noChangeAspect="1"/>
+            </wp:cNvGraphicFramePr>
+            <a:graphic>
+              <a:graphicData uri="http://schemas.openxmlformats.org/drawingml/2006/picture">
+                <pic:pic>
+                  <pic:nvPicPr>
+                    <pic:cNvPr id="0" name="ch7_pipeline.png"/>
+                    <pic:cNvPicPr/>
+                  </pic:nvPicPr>
+                  <pic:blipFill>
+                    <a:blip r:embed="rId9"/>
+                    <a:stretch>
+                      <a:fillRect/>
+                    </a:stretch>
+                  </pic:blipFill>
+                  <pic:spPr>
+                    <a:xfrm>
+                      <a:off x="0" y="0"/>
+                      <a:ext cx="2560320" cy="2440027"/>
+                    </a:xfrm>
+                    <a:prstGeom prst="rect"/>
+                  </pic:spPr>
+                </pic:pic>
+              </a:graphicData>
+            </a:graphic>
+          </wp:inline>
+        </w:drawing>
+      </w:r>
+    </w:p>
+    <w:p>
+      <w:pPr>
+        <w:spacing w:before="0" w:after="60" w:lineRule="auto" w:line="360"/>
+      </w:pPr>
+      <w:r>
+        <w:rPr>
+          <w:b/>
+        </w:rPr>
+        <w:t>Figure 7.1 — Three-stage cascade detector.</w:t>
+      </w:r>
+      <w:r>
+        <w:t xml:space="preserve"> Raw command → Isolation Forest bulk-benign filter (stage 1) → XGBoost-hybrid (stage 2: P(attack) &gt; 0.65 → attack, &lt; 0.35 → benign) → LLM arbitration on the 0.35–0.65 edge band. Bands are the shipped </w:t>
+      </w:r>
+      <w:r>
+        <w:rPr>
+          <w:rFonts w:ascii="Courier New" w:hAnsi="Courier New"/>
+          <w:sz w:val="18"/>
+        </w:rPr>
+        <w:t>CascadeDetector</w:t>
+      </w:r>
+      <w:r>
+        <w:t xml:space="preserve"> defaults (</w:t>
+      </w:r>
+      <w:r>
+        <w:rPr>
+          <w:rFonts w:ascii="Courier New" w:hAnsi="Courier New"/>
+          <w:sz w:val="18"/>
+        </w:rPr>
+        <w:t>src/ensemble.py</w:t>
+      </w:r>
+      <w:r>
+        <w:t>).</w:t>
       </w:r>
     </w:p>
     <w:p>
@@ -36354,7 +36445,7 @@
         <w:drawing>
           <wp:inline xmlns:a="http://schemas.openxmlformats.org/drawingml/2006/main" xmlns:pic="http://schemas.openxmlformats.org/drawingml/2006/picture">
             <wp:extent cx="2926080" cy="1828800"/>
-            <wp:docPr id="1" name="Picture 1"/>
+            <wp:docPr id="2" name="Picture 2"/>
             <wp:cNvGraphicFramePr>
               <a:graphicFrameLocks noChangeAspect="1"/>
             </wp:cNvGraphicFramePr>
@@ -36363,46 +36454,6 @@
                 <pic:pic>
                   <pic:nvPicPr>
                     <pic:cNvPr id="0" name="ch3_length_hist_dataset1.png"/>
-                    <pic:cNvPicPr/>
-                  </pic:nvPicPr>
-                  <pic:blipFill>
-                    <a:blip r:embed="rId9"/>
-                    <a:stretch>
-                      <a:fillRect/>
-                    </a:stretch>
-                  </pic:blipFill>
-                  <pic:spPr>
-                    <a:xfrm>
-                      <a:off x="0" y="0"/>
-                      <a:ext cx="2926080" cy="1828800"/>
-                    </a:xfrm>
-                    <a:prstGeom prst="rect"/>
-                  </pic:spPr>
-                </pic:pic>
-              </a:graphicData>
-            </a:graphic>
-          </wp:inline>
-        </w:drawing>
-      </w:r>
-    </w:p>
-    <w:p>
-      <w:pPr>
-        <w:spacing w:before="80" w:after="40" w:line="240" w:lineRule="auto"/>
-        <w:jc w:val="center"/>
-      </w:pPr>
-      <w:r>
-        <w:drawing>
-          <wp:inline xmlns:a="http://schemas.openxmlformats.org/drawingml/2006/main" xmlns:pic="http://schemas.openxmlformats.org/drawingml/2006/picture">
-            <wp:extent cx="2926080" cy="1828800"/>
-            <wp:docPr id="2" name="Picture 2"/>
-            <wp:cNvGraphicFramePr>
-              <a:graphicFrameLocks noChangeAspect="1"/>
-            </wp:cNvGraphicFramePr>
-            <a:graphic>
-              <a:graphicData uri="http://schemas.openxmlformats.org/drawingml/2006/picture">
-                <pic:pic>
-                  <pic:nvPicPr>
-                    <pic:cNvPr id="0" name="ch3_length_hist_dataset2.png"/>
                     <pic:cNvPicPr/>
                   </pic:nvPicPr>
                   <pic:blipFill>
@@ -36427,6 +36478,46 @@
     </w:p>
     <w:p>
       <w:pPr>
+        <w:spacing w:before="80" w:after="40" w:line="240" w:lineRule="auto"/>
+        <w:jc w:val="center"/>
+      </w:pPr>
+      <w:r>
+        <w:drawing>
+          <wp:inline xmlns:a="http://schemas.openxmlformats.org/drawingml/2006/main" xmlns:pic="http://schemas.openxmlformats.org/drawingml/2006/picture">
+            <wp:extent cx="2926080" cy="1828800"/>
+            <wp:docPr id="3" name="Picture 3"/>
+            <wp:cNvGraphicFramePr>
+              <a:graphicFrameLocks noChangeAspect="1"/>
+            </wp:cNvGraphicFramePr>
+            <a:graphic>
+              <a:graphicData uri="http://schemas.openxmlformats.org/drawingml/2006/picture">
+                <pic:pic>
+                  <pic:nvPicPr>
+                    <pic:cNvPr id="0" name="ch3_length_hist_dataset2.png"/>
+                    <pic:cNvPicPr/>
+                  </pic:nvPicPr>
+                  <pic:blipFill>
+                    <a:blip r:embed="rId11"/>
+                    <a:stretch>
+                      <a:fillRect/>
+                    </a:stretch>
+                  </pic:blipFill>
+                  <pic:spPr>
+                    <a:xfrm>
+                      <a:off x="0" y="0"/>
+                      <a:ext cx="2926080" cy="1828800"/>
+                    </a:xfrm>
+                    <a:prstGeom prst="rect"/>
+                  </pic:spPr>
+                </pic:pic>
+              </a:graphicData>
+            </a:graphic>
+          </wp:inline>
+        </w:drawing>
+      </w:r>
+    </w:p>
+    <w:p>
+      <w:pPr>
         <w:spacing w:before="0" w:after="60" w:lineRule="auto" w:line="360"/>
       </w:pPr>
       <w:r>
@@ -36488,7 +36579,7 @@
         <w:drawing>
           <wp:inline xmlns:a="http://schemas.openxmlformats.org/drawingml/2006/main" xmlns:pic="http://schemas.openxmlformats.org/drawingml/2006/picture">
             <wp:extent cx="3566160" cy="2917767"/>
-            <wp:docPr id="3" name="Picture 3"/>
+            <wp:docPr id="4" name="Picture 4"/>
             <wp:cNvGraphicFramePr>
               <a:graphicFrameLocks noChangeAspect="1"/>
             </wp:cNvGraphicFramePr>
@@ -36500,7 +36591,7 @@
                     <pic:cNvPicPr/>
                   </pic:nvPicPr>
                   <pic:blipFill>
-                    <a:blip r:embed="rId11"/>
+                    <a:blip r:embed="rId12"/>
                     <a:stretch>
                       <a:fillRect/>
                     </a:stretch>

</xml_diff>